<commit_message>
Adiciona conteúdo á tradução manual
</commit_message>
<xml_diff>
--- a/documentation/Glossario.docx
+++ b/documentation/Glossario.docx
@@ -12,7 +12,6 @@
         <w:ind/>
         <w:rPr/>
       </w:pPr>
-      <w:r/>
       <w:r/>
       <w:bookmarkStart w:id="0" w:name="_GoBack"/>
       <w:r/>
@@ -32,7 +31,6 @@
           <w:highlight w:val="none"/>
         </w:rPr>
       </w:pPr>
-      <w:r/>
       <w:r>
         <w:rPr>
           <w:b/>
@@ -43,7 +41,11 @@
       <w:r>
         <w:t xml:space="preserve">- Rede</w:t>
       </w:r>
-      <w:r/>
+      <w:r>
+        <w:rPr>
+          <w:highlight w:val="none"/>
+        </w:rPr>
+      </w:r>
     </w:p>
     <w:p>
       <w:pPr>
@@ -71,7 +73,11 @@
         </w:rPr>
         <w:t xml:space="preserve"> – Inaugurar</w:t>
       </w:r>
-      <w:r/>
+      <w:r>
+        <w:rPr>
+          <w:highlight w:val="none"/>
+        </w:rPr>
+      </w:r>
     </w:p>
     <w:p>
       <w:pPr>
@@ -111,7 +117,11 @@
         </w:rPr>
         <w:t xml:space="preserve">- Destacar</w:t>
       </w:r>
-      <w:r/>
+      <w:r>
+        <w:rPr>
+          <w:highlight w:val="none"/>
+        </w:rPr>
+      </w:r>
     </w:p>
     <w:p>
       <w:pPr>
@@ -154,7 +164,9 @@
         <w:rPr>
           <w:b w:val="0"/>
           <w:bCs w:val="0"/>
+          <w:highlight w:val="none"/>
         </w:rPr>
+        <w:t xml:space="preserve"> </w:t>
       </w:r>
       <w:r>
         <w:rPr>
@@ -162,14 +174,6 @@
           <w:bCs w:val="0"/>
           <w:highlight w:val="none"/>
         </w:rPr>
-      </w:r>
-      <w:r>
-        <w:rPr>
-          <w:b w:val="0"/>
-          <w:bCs w:val="0"/>
-          <w:highlight w:val="none"/>
-        </w:rPr>
-        <w:t xml:space="preserve"> </w:t>
       </w:r>
       <w:r>
         <w:rPr>
@@ -225,6 +229,134 @@
         </w:rPr>
       </w:r>
     </w:p>
+    <w:p>
+      <w:pPr>
+        <w:pBdr/>
+        <w:tabs>
+          <w:tab w:val="left" w:leader="none" w:pos="1395"/>
+        </w:tabs>
+        <w:spacing/>
+        <w:ind/>
+        <w:jc w:val="both"/>
+        <w:rPr>
+          <w:b w:val="0"/>
+          <w:bCs w:val="0"/>
+          <w:highlight w:val="none"/>
+        </w:rPr>
+      </w:pPr>
+      <w:r>
+        <w:rPr>
+          <w:b/>
+          <w:bCs/>
+          <w:highlight w:val="none"/>
+        </w:rPr>
+        <w:t xml:space="preserve">Remarkable </w:t>
+      </w:r>
+      <w:r>
+        <w:rPr>
+          <w:b w:val="0"/>
+          <w:bCs w:val="0"/>
+          <w:highlight w:val="none"/>
+        </w:rPr>
+        <w:t xml:space="preserve">– Notável, observavel.</w:t>
+      </w:r>
+      <w:r>
+        <w:rPr>
+          <w:b w:val="0"/>
+          <w:bCs w:val="0"/>
+          <w:highlight w:val="none"/>
+        </w:rPr>
+      </w:r>
+      <w:r>
+        <w:rPr>
+          <w:b w:val="0"/>
+          <w:bCs w:val="0"/>
+          <w:highlight w:val="none"/>
+        </w:rPr>
+      </w:r>
+    </w:p>
+    <w:p>
+      <w:pPr>
+        <w:pBdr/>
+        <w:tabs>
+          <w:tab w:val="left" w:leader="none" w:pos="1395"/>
+        </w:tabs>
+        <w:spacing/>
+        <w:ind/>
+        <w:jc w:val="both"/>
+        <w:rPr>
+          <w:b w:val="0"/>
+          <w:bCs w:val="0"/>
+          <w:highlight w:val="none"/>
+        </w:rPr>
+      </w:pPr>
+      <w:r>
+        <w:rPr>
+          <w:b w:val="0"/>
+          <w:bCs w:val="0"/>
+          <w:highlight w:val="none"/>
+        </w:rPr>
+      </w:r>
+      <w:r>
+        <w:rPr>
+          <w:b/>
+          <w:bCs/>
+        </w:rPr>
+        <w:t xml:space="preserve">Consciousness </w:t>
+      </w:r>
+      <w:r>
+        <w:rPr>
+          <w:b w:val="0"/>
+          <w:bCs w:val="0"/>
+          <w:highlight w:val="none"/>
+        </w:rPr>
+        <w:t xml:space="preserve">– Consciência.</w:t>
+      </w:r>
+      <w:r>
+        <w:rPr>
+          <w:b w:val="0"/>
+          <w:bCs w:val="0"/>
+          <w:highlight w:val="none"/>
+        </w:rPr>
+      </w:r>
+    </w:p>
+    <w:p>
+      <w:pPr>
+        <w:pBdr/>
+        <w:tabs>
+          <w:tab w:val="left" w:leader="none" w:pos="1395"/>
+        </w:tabs>
+        <w:spacing/>
+        <w:ind/>
+        <w:jc w:val="both"/>
+        <w:rPr>
+          <w:b w:val="0"/>
+          <w:bCs w:val="0"/>
+          <w:highlight w:val="none"/>
+        </w:rPr>
+      </w:pPr>
+      <w:r>
+        <w:rPr>
+          <w:b w:val="0"/>
+          <w:bCs w:val="0"/>
+          <w:highlight w:val="none"/>
+        </w:rPr>
+      </w:r>
+      <w:r>
+        <w:rPr>
+          <w:b w:val="0"/>
+          <w:bCs w:val="0"/>
+          <w:highlight w:val="none"/>
+        </w:rPr>
+      </w:r>
+      <w:r>
+        <w:rPr>
+          <w:b w:val="0"/>
+          <w:bCs w:val="0"/>
+          <w:highlight w:val="none"/>
+        </w:rPr>
+      </w:r>
+    </w:p>
     <w:sectPr>
       <w:headerReference w:type="default" r:id="rId8"/>
       <w:headerReference w:type="first" r:id="rId9"/>
@@ -251,7 +383,6 @@
         <w:ind/>
         <w:rPr/>
       </w:pPr>
-      <w:r/>
       <w:r>
         <w:separator/>
       </w:r>
@@ -266,7 +397,6 @@
         <w:ind/>
         <w:rPr/>
       </w:pPr>
-      <w:r/>
       <w:r>
         <w:continuationSeparator/>
       </w:r>
@@ -280,7 +410,7 @@
 <w:ftr xmlns:wpc="http://schemas.microsoft.com/office/word/2010/wordprocessingCanvas" xmlns:mc="http://schemas.openxmlformats.org/markup-compatibility/2006" xmlns:o="urn:schemas-microsoft-com:office:office" xmlns:r="http://schemas.openxmlformats.org/officeDocument/2006/relationships" xmlns:m="http://schemas.openxmlformats.org/officeDocument/2006/math" xmlns:v="urn:schemas-microsoft-com:vml" xmlns:wp14="http://schemas.microsoft.com/office/word/2010/wordprocessingDrawing" xmlns:wp="http://schemas.openxmlformats.org/drawingml/2006/wordprocessingDrawing" xmlns:w10="urn:schemas-microsoft-com:office:word" xmlns:w="http://schemas.openxmlformats.org/wordprocessingml/2006/main" xmlns:w14="http://schemas.microsoft.com/office/word/2010/wordml" xmlns:w15="http://schemas.microsoft.com/office/word/2012/wordml" xmlns:wpg="http://schemas.microsoft.com/office/word/2010/wordprocessingGroup" xmlns:wpi="http://schemas.microsoft.com/office/word/2010/wordprocessingInk" xmlns:wne="http://schemas.microsoft.com/office/word/2006/wordml" xmlns:a="http://schemas.openxmlformats.org/drawingml/2006/main" xmlns:wps="http://schemas.microsoft.com/office/word/2010/wordprocessingShape" mc:Ignorable="w14 w15 wp14">
   <w:p>
     <w:pPr>
-      <w:pStyle w:val="178"/>
+      <w:pStyle w:val="897"/>
       <w:pBdr/>
       <w:spacing/>
       <w:ind/>
@@ -302,7 +432,6 @@
         <w:ind/>
         <w:rPr/>
       </w:pPr>
-      <w:r/>
       <w:r>
         <w:separator/>
       </w:r>
@@ -317,7 +446,6 @@
         <w:ind/>
         <w:rPr/>
       </w:pPr>
-      <w:r/>
       <w:r>
         <w:continuationSeparator/>
       </w:r>
@@ -331,7 +459,7 @@
 <w:hdr xmlns:wpc="http://schemas.microsoft.com/office/word/2010/wordprocessingCanvas" xmlns:mc="http://schemas.openxmlformats.org/markup-compatibility/2006" xmlns:o="urn:schemas-microsoft-com:office:office" xmlns:r="http://schemas.openxmlformats.org/officeDocument/2006/relationships" xmlns:m="http://schemas.openxmlformats.org/officeDocument/2006/math" xmlns:v="urn:schemas-microsoft-com:vml" xmlns:wp14="http://schemas.microsoft.com/office/word/2010/wordprocessingDrawing" xmlns:wp="http://schemas.openxmlformats.org/drawingml/2006/wordprocessingDrawing" xmlns:w10="urn:schemas-microsoft-com:office:word" xmlns:w="http://schemas.openxmlformats.org/wordprocessingml/2006/main" xmlns:w14="http://schemas.microsoft.com/office/word/2010/wordml" xmlns:w15="http://schemas.microsoft.com/office/word/2012/wordml" xmlns:wpg="http://schemas.microsoft.com/office/word/2010/wordprocessingGroup" xmlns:wpi="http://schemas.microsoft.com/office/word/2010/wordprocessingInk" xmlns:wne="http://schemas.microsoft.com/office/word/2006/wordml" xmlns:a="http://schemas.openxmlformats.org/drawingml/2006/main" xmlns:wps="http://schemas.microsoft.com/office/word/2010/wordprocessingShape" mc:Ignorable="w14 w15 wp14">
   <w:p>
     <w:pPr>
-      <w:pStyle w:val="176"/>
+      <w:pStyle w:val="895"/>
       <w:pBdr/>
       <w:spacing/>
       <w:ind/>
@@ -341,11 +469,10 @@
       <w:t xml:space="preserve">Glossario</w:t>
     </w:r>
     <w:r/>
-    <w:r/>
   </w:p>
   <w:p>
     <w:pPr>
-      <w:pStyle w:val="176"/>
+      <w:pStyle w:val="895"/>
       <w:pBdr/>
       <w:spacing/>
       <w:ind/>
@@ -361,7 +488,7 @@
 <w:hdr xmlns:wpc="http://schemas.microsoft.com/office/word/2010/wordprocessingCanvas" xmlns:mc="http://schemas.openxmlformats.org/markup-compatibility/2006" xmlns:o="urn:schemas-microsoft-com:office:office" xmlns:r="http://schemas.openxmlformats.org/officeDocument/2006/relationships" xmlns:m="http://schemas.openxmlformats.org/officeDocument/2006/math" xmlns:v="urn:schemas-microsoft-com:vml" xmlns:wp14="http://schemas.microsoft.com/office/word/2010/wordprocessingDrawing" xmlns:wp="http://schemas.openxmlformats.org/drawingml/2006/wordprocessingDrawing" xmlns:w10="urn:schemas-microsoft-com:office:word" xmlns:w="http://schemas.openxmlformats.org/wordprocessingml/2006/main" xmlns:w14="http://schemas.microsoft.com/office/word/2010/wordml" xmlns:w15="http://schemas.microsoft.com/office/word/2012/wordml" xmlns:wpg="http://schemas.microsoft.com/office/word/2010/wordprocessingGroup" xmlns:wpi="http://schemas.microsoft.com/office/word/2010/wordprocessingInk" xmlns:wne="http://schemas.microsoft.com/office/word/2006/wordml" xmlns:a="http://schemas.openxmlformats.org/drawingml/2006/main" xmlns:wps="http://schemas.microsoft.com/office/word/2010/wordprocessingShape" mc:Ignorable="w14 w15 wp14">
   <w:p>
     <w:pPr>
-      <w:pStyle w:val="176"/>
+      <w:pStyle w:val="895"/>
       <w:pBdr/>
       <w:spacing/>
       <w:ind/>
@@ -370,10 +497,6 @@
     <w:r>
       <w:t xml:space="preserve">Glossário</w:t>
     </w:r>
-    <w:r/>
-    <w:r/>
-    <w:r/>
-    <w:r/>
     <w:r/>
   </w:p>
 </w:hdr>
@@ -537,9 +660,9 @@
     <w:lsdException w:name="Bibliography" w:uiPriority="37"/>
     <w:lsdException w:name="TOC Heading" w:uiPriority="39" w:qFormat="1"/>
   </w:latentStyles>
-  <w:style w:type="table" w:styleId="12">
+  <w:style w:type="table" w:styleId="735">
     <w:name w:val="Table Grid"/>
-    <w:basedOn w:val="665"/>
+    <w:basedOn w:val="921"/>
     <w:uiPriority w:val="59"/>
     <w:pPr>
       <w:pBdr/>
@@ -736,9 +859,9 @@
       </w:tcPr>
     </w:tblStylePr>
   </w:style>
-  <w:style w:type="table" w:styleId="13">
+  <w:style w:type="table" w:styleId="736">
     <w:name w:val="Table Grid Light"/>
-    <w:basedOn w:val="665"/>
+    <w:basedOn w:val="921"/>
     <w:uiPriority w:val="59"/>
     <w:pPr>
       <w:pBdr/>
@@ -935,9 +1058,9 @@
       </w:tcPr>
     </w:tblStylePr>
   </w:style>
-  <w:style w:type="table" w:styleId="14">
+  <w:style w:type="table" w:styleId="737">
     <w:name w:val="Plain Table 1"/>
-    <w:basedOn w:val="665"/>
+    <w:basedOn w:val="921"/>
     <w:uiPriority w:val="59"/>
     <w:pPr>
       <w:pBdr/>
@@ -1160,9 +1283,9 @@
       </w:tcPr>
     </w:tblStylePr>
   </w:style>
-  <w:style w:type="table" w:styleId="15">
+  <w:style w:type="table" w:styleId="738">
     <w:name w:val="Plain Table 2"/>
-    <w:basedOn w:val="665"/>
+    <w:basedOn w:val="921"/>
     <w:uiPriority w:val="59"/>
     <w:pPr>
       <w:pBdr/>
@@ -1393,9 +1516,9 @@
       </w:tcPr>
     </w:tblStylePr>
   </w:style>
-  <w:style w:type="table" w:styleId="16">
+  <w:style w:type="table" w:styleId="739">
     <w:name w:val="Plain Table 3"/>
-    <w:basedOn w:val="665"/>
+    <w:basedOn w:val="921"/>
     <w:uiPriority w:val="99"/>
     <w:pPr>
       <w:pBdr/>
@@ -1623,9 +1746,9 @@
       </w:tcPr>
     </w:tblStylePr>
   </w:style>
-  <w:style w:type="table" w:styleId="17">
+  <w:style w:type="table" w:styleId="740">
     <w:name w:val="Plain Table 4"/>
-    <w:basedOn w:val="665"/>
+    <w:basedOn w:val="921"/>
     <w:uiPriority w:val="99"/>
     <w:pPr>
       <w:pBdr/>
@@ -1839,9 +1962,9 @@
       </w:tcPr>
     </w:tblStylePr>
   </w:style>
-  <w:style w:type="table" w:styleId="18">
+  <w:style w:type="table" w:styleId="741">
     <w:name w:val="Plain Table 5"/>
-    <w:basedOn w:val="665"/>
+    <w:basedOn w:val="921"/>
     <w:uiPriority w:val="99"/>
     <w:pPr>
       <w:pBdr/>
@@ -2072,9 +2195,9 @@
       </w:tcPr>
     </w:tblStylePr>
   </w:style>
-  <w:style w:type="table" w:styleId="19">
+  <w:style w:type="table" w:styleId="742">
     <w:name w:val="Grid Table 1 Light"/>
-    <w:basedOn w:val="665"/>
+    <w:basedOn w:val="921"/>
     <w:uiPriority w:val="99"/>
     <w:pPr>
       <w:pBdr/>
@@ -2295,9 +2418,9 @@
       </w:tcPr>
     </w:tblStylePr>
   </w:style>
-  <w:style w:type="table" w:styleId="20">
+  <w:style w:type="table" w:styleId="743">
     <w:name w:val="Grid Table 1 Light - Accent 1"/>
-    <w:basedOn w:val="665"/>
+    <w:basedOn w:val="921"/>
     <w:uiPriority w:val="99"/>
     <w:pPr>
       <w:pBdr/>
@@ -2518,9 +2641,9 @@
       </w:tcPr>
     </w:tblStylePr>
   </w:style>
-  <w:style w:type="table" w:styleId="21">
+  <w:style w:type="table" w:styleId="744">
     <w:name w:val="Grid Table 1 Light - Accent 2"/>
-    <w:basedOn w:val="665"/>
+    <w:basedOn w:val="921"/>
     <w:uiPriority w:val="99"/>
     <w:pPr>
       <w:pBdr/>
@@ -2741,9 +2864,9 @@
       </w:tcPr>
     </w:tblStylePr>
   </w:style>
-  <w:style w:type="table" w:styleId="22">
+  <w:style w:type="table" w:styleId="745">
     <w:name w:val="Grid Table 1 Light - Accent 3"/>
-    <w:basedOn w:val="665"/>
+    <w:basedOn w:val="921"/>
     <w:uiPriority w:val="99"/>
     <w:pPr>
       <w:pBdr/>
@@ -2964,9 +3087,9 @@
       </w:tcPr>
     </w:tblStylePr>
   </w:style>
-  <w:style w:type="table" w:styleId="23">
+  <w:style w:type="table" w:styleId="746">
     <w:name w:val="Grid Table 1 Light - Accent 4"/>
-    <w:basedOn w:val="665"/>
+    <w:basedOn w:val="921"/>
     <w:uiPriority w:val="99"/>
     <w:pPr>
       <w:pBdr/>
@@ -3187,9 +3310,9 @@
       </w:tcPr>
     </w:tblStylePr>
   </w:style>
-  <w:style w:type="table" w:styleId="24">
+  <w:style w:type="table" w:styleId="747">
     <w:name w:val="Grid Table 1 Light - Accent 5"/>
-    <w:basedOn w:val="665"/>
+    <w:basedOn w:val="921"/>
     <w:uiPriority w:val="99"/>
     <w:pPr>
       <w:pBdr/>
@@ -3410,9 +3533,9 @@
       </w:tcPr>
     </w:tblStylePr>
   </w:style>
-  <w:style w:type="table" w:styleId="25">
+  <w:style w:type="table" w:styleId="748">
     <w:name w:val="Grid Table 1 Light - Accent 6"/>
-    <w:basedOn w:val="665"/>
+    <w:basedOn w:val="921"/>
     <w:uiPriority w:val="99"/>
     <w:pPr>
       <w:pBdr/>
@@ -3633,9 +3756,9 @@
       </w:tcPr>
     </w:tblStylePr>
   </w:style>
-  <w:style w:type="table" w:styleId="26">
+  <w:style w:type="table" w:styleId="749">
     <w:name w:val="Grid Table 2"/>
-    <w:basedOn w:val="665"/>
+    <w:basedOn w:val="921"/>
     <w:uiPriority w:val="99"/>
     <w:pPr>
       <w:pBdr/>
@@ -3865,9 +3988,9 @@
       </w:tcPr>
     </w:tblStylePr>
   </w:style>
-  <w:style w:type="table" w:styleId="27">
+  <w:style w:type="table" w:styleId="750">
     <w:name w:val="Grid Table 2 - Accent 1"/>
-    <w:basedOn w:val="665"/>
+    <w:basedOn w:val="921"/>
     <w:uiPriority w:val="99"/>
     <w:pPr>
       <w:pBdr/>
@@ -4097,9 +4220,9 @@
       </w:tcPr>
     </w:tblStylePr>
   </w:style>
-  <w:style w:type="table" w:styleId="28">
+  <w:style w:type="table" w:styleId="751">
     <w:name w:val="Grid Table 2 - Accent 2"/>
-    <w:basedOn w:val="665"/>
+    <w:basedOn w:val="921"/>
     <w:uiPriority w:val="99"/>
     <w:pPr>
       <w:pBdr/>
@@ -4329,9 +4452,9 @@
       </w:tcPr>
     </w:tblStylePr>
   </w:style>
-  <w:style w:type="table" w:styleId="29">
+  <w:style w:type="table" w:styleId="752">
     <w:name w:val="Grid Table 2 - Accent 3"/>
-    <w:basedOn w:val="665"/>
+    <w:basedOn w:val="921"/>
     <w:uiPriority w:val="99"/>
     <w:pPr>
       <w:pBdr/>
@@ -4561,9 +4684,9 @@
       </w:tcPr>
     </w:tblStylePr>
   </w:style>
-  <w:style w:type="table" w:styleId="30">
+  <w:style w:type="table" w:styleId="753">
     <w:name w:val="Grid Table 2 - Accent 4"/>
-    <w:basedOn w:val="665"/>
+    <w:basedOn w:val="921"/>
     <w:uiPriority w:val="99"/>
     <w:pPr>
       <w:pBdr/>
@@ -4793,9 +4916,9 @@
       </w:tcPr>
     </w:tblStylePr>
   </w:style>
-  <w:style w:type="table" w:styleId="31">
+  <w:style w:type="table" w:styleId="754">
     <w:name w:val="Grid Table 2 - Accent 5"/>
-    <w:basedOn w:val="665"/>
+    <w:basedOn w:val="921"/>
     <w:uiPriority w:val="99"/>
     <w:pPr>
       <w:pBdr/>
@@ -5025,9 +5148,9 @@
       </w:tcPr>
     </w:tblStylePr>
   </w:style>
-  <w:style w:type="table" w:styleId="32">
+  <w:style w:type="table" w:styleId="755">
     <w:name w:val="Grid Table 2 - Accent 6"/>
-    <w:basedOn w:val="665"/>
+    <w:basedOn w:val="921"/>
     <w:uiPriority w:val="99"/>
     <w:pPr>
       <w:pBdr/>
@@ -5257,9 +5380,9 @@
       </w:tcPr>
     </w:tblStylePr>
   </w:style>
-  <w:style w:type="table" w:styleId="33">
+  <w:style w:type="table" w:styleId="756">
     <w:name w:val="Grid Table 3"/>
-    <w:basedOn w:val="665"/>
+    <w:basedOn w:val="921"/>
     <w:uiPriority w:val="99"/>
     <w:pPr>
       <w:pBdr/>
@@ -5358,29 +5481,6 @@
         <w:tblBorders/>
       </w:tblPr>
       <w:tcPr>
-        <w:shd w:color="ffffff"/>
-        <w:tcBorders>
-          <w:top w:val="none" w:color="000000" w:sz="4" w:space="0"/>
-          <w:left w:val="none" w:color="000000" w:sz="4" w:space="0"/>
-          <w:bottom w:val="none" w:color="000000" w:sz="4" w:space="0"/>
-          <w:right w:val="none" w:color="000000" w:sz="4" w:space="0"/>
-        </w:tcBorders>
-      </w:tcPr>
-    </w:tblStylePr>
-    <w:tblStylePr w:type="firstRow">
-      <w:rPr>
-        <w:b/>
-        <w:color w:val="404040"/>
-      </w:rPr>
-      <w:pPr>
-        <w:pBdr/>
-        <w:spacing/>
-        <w:ind/>
-      </w:pPr>
-      <w:tblPr>
-        <w:tblBorders/>
-      </w:tblPr>
-      <w:tcPr>
         <w:shd w:val="clear" w:color="ffffff"/>
         <w:tcBorders>
           <w:top w:val="none" w:color="000000" w:sz="4" w:space="0"/>
@@ -5390,30 +5490,7 @@
         </w:tcBorders>
       </w:tcPr>
     </w:tblStylePr>
-    <w:tblStylePr w:type="lastCol">
-      <w:rPr>
-        <w:i/>
-        <w:color w:val="404040"/>
-      </w:rPr>
-      <w:pPr>
-        <w:pBdr/>
-        <w:spacing/>
-        <w:ind/>
-      </w:pPr>
-      <w:tblPr>
-        <w:tblBorders/>
-      </w:tblPr>
-      <w:tcPr>
-        <w:shd w:color="ffffff"/>
-        <w:tcBorders>
-          <w:top w:val="none" w:color="000000" w:sz="4" w:space="0"/>
-          <w:left w:val="none" w:color="000000" w:sz="4" w:space="0"/>
-          <w:bottom w:val="none" w:color="000000" w:sz="4" w:space="0"/>
-          <w:right w:val="none" w:color="000000" w:sz="4" w:space="0"/>
-        </w:tcBorders>
-      </w:tcPr>
-    </w:tblStylePr>
-    <w:tblStylePr w:type="lastRow">
+    <w:tblStylePr w:type="firstRow">
       <w:rPr>
         <w:b/>
         <w:color w:val="404040"/>
@@ -5436,6 +5513,52 @@
         </w:tcBorders>
       </w:tcPr>
     </w:tblStylePr>
+    <w:tblStylePr w:type="lastCol">
+      <w:rPr>
+        <w:i/>
+        <w:color w:val="404040"/>
+      </w:rPr>
+      <w:pPr>
+        <w:pBdr/>
+        <w:spacing/>
+        <w:ind/>
+      </w:pPr>
+      <w:tblPr>
+        <w:tblBorders/>
+      </w:tblPr>
+      <w:tcPr>
+        <w:shd w:val="clear" w:color="ffffff"/>
+        <w:tcBorders>
+          <w:top w:val="none" w:color="000000" w:sz="4" w:space="0"/>
+          <w:left w:val="none" w:color="000000" w:sz="4" w:space="0"/>
+          <w:bottom w:val="none" w:color="000000" w:sz="4" w:space="0"/>
+          <w:right w:val="none" w:color="000000" w:sz="4" w:space="0"/>
+        </w:tcBorders>
+      </w:tcPr>
+    </w:tblStylePr>
+    <w:tblStylePr w:type="lastRow">
+      <w:rPr>
+        <w:b/>
+        <w:color w:val="404040"/>
+      </w:rPr>
+      <w:pPr>
+        <w:pBdr/>
+        <w:spacing/>
+        <w:ind/>
+      </w:pPr>
+      <w:tblPr>
+        <w:tblBorders/>
+      </w:tblPr>
+      <w:tcPr>
+        <w:shd w:val="clear" w:color="ffffff"/>
+        <w:tcBorders>
+          <w:top w:val="none" w:color="000000" w:sz="4" w:space="0"/>
+          <w:left w:val="none" w:color="000000" w:sz="4" w:space="0"/>
+          <w:bottom w:val="none" w:color="000000" w:sz="4" w:space="0"/>
+          <w:right w:val="none" w:color="000000" w:sz="4" w:space="0"/>
+        </w:tcBorders>
+      </w:tcPr>
+    </w:tblStylePr>
     <w:tblStylePr w:type="nwCell">
       <w:pPr>
         <w:pBdr/>
@@ -5502,9 +5625,9 @@
       </w:tcPr>
     </w:tblStylePr>
   </w:style>
-  <w:style w:type="table" w:styleId="34">
+  <w:style w:type="table" w:styleId="757">
     <w:name w:val="Grid Table 3 - Accent 1"/>
-    <w:basedOn w:val="665"/>
+    <w:basedOn w:val="921"/>
     <w:uiPriority w:val="99"/>
     <w:pPr>
       <w:pBdr/>
@@ -5603,29 +5726,6 @@
         <w:tblBorders/>
       </w:tblPr>
       <w:tcPr>
-        <w:shd w:color="ffffff"/>
-        <w:tcBorders>
-          <w:top w:val="none" w:color="000000" w:sz="4" w:space="0"/>
-          <w:left w:val="none" w:color="000000" w:sz="4" w:space="0"/>
-          <w:bottom w:val="none" w:color="000000" w:sz="4" w:space="0"/>
-          <w:right w:val="none" w:color="000000" w:sz="4" w:space="0"/>
-        </w:tcBorders>
-      </w:tcPr>
-    </w:tblStylePr>
-    <w:tblStylePr w:type="firstRow">
-      <w:rPr>
-        <w:b/>
-        <w:color w:val="404040"/>
-      </w:rPr>
-      <w:pPr>
-        <w:pBdr/>
-        <w:spacing/>
-        <w:ind/>
-      </w:pPr>
-      <w:tblPr>
-        <w:tblBorders/>
-      </w:tblPr>
-      <w:tcPr>
         <w:shd w:val="clear" w:color="ffffff"/>
         <w:tcBorders>
           <w:top w:val="none" w:color="000000" w:sz="4" w:space="0"/>
@@ -5635,30 +5735,7 @@
         </w:tcBorders>
       </w:tcPr>
     </w:tblStylePr>
-    <w:tblStylePr w:type="lastCol">
-      <w:rPr>
-        <w:i/>
-        <w:color w:val="404040"/>
-      </w:rPr>
-      <w:pPr>
-        <w:pBdr/>
-        <w:spacing/>
-        <w:ind/>
-      </w:pPr>
-      <w:tblPr>
-        <w:tblBorders/>
-      </w:tblPr>
-      <w:tcPr>
-        <w:shd w:color="ffffff"/>
-        <w:tcBorders>
-          <w:top w:val="none" w:color="000000" w:sz="4" w:space="0"/>
-          <w:left w:val="none" w:color="000000" w:sz="4" w:space="0"/>
-          <w:bottom w:val="none" w:color="000000" w:sz="4" w:space="0"/>
-          <w:right w:val="none" w:color="000000" w:sz="4" w:space="0"/>
-        </w:tcBorders>
-      </w:tcPr>
-    </w:tblStylePr>
-    <w:tblStylePr w:type="lastRow">
+    <w:tblStylePr w:type="firstRow">
       <w:rPr>
         <w:b/>
         <w:color w:val="404040"/>
@@ -5681,6 +5758,52 @@
         </w:tcBorders>
       </w:tcPr>
     </w:tblStylePr>
+    <w:tblStylePr w:type="lastCol">
+      <w:rPr>
+        <w:i/>
+        <w:color w:val="404040"/>
+      </w:rPr>
+      <w:pPr>
+        <w:pBdr/>
+        <w:spacing/>
+        <w:ind/>
+      </w:pPr>
+      <w:tblPr>
+        <w:tblBorders/>
+      </w:tblPr>
+      <w:tcPr>
+        <w:shd w:val="clear" w:color="ffffff"/>
+        <w:tcBorders>
+          <w:top w:val="none" w:color="000000" w:sz="4" w:space="0"/>
+          <w:left w:val="none" w:color="000000" w:sz="4" w:space="0"/>
+          <w:bottom w:val="none" w:color="000000" w:sz="4" w:space="0"/>
+          <w:right w:val="none" w:color="000000" w:sz="4" w:space="0"/>
+        </w:tcBorders>
+      </w:tcPr>
+    </w:tblStylePr>
+    <w:tblStylePr w:type="lastRow">
+      <w:rPr>
+        <w:b/>
+        <w:color w:val="404040"/>
+      </w:rPr>
+      <w:pPr>
+        <w:pBdr/>
+        <w:spacing/>
+        <w:ind/>
+      </w:pPr>
+      <w:tblPr>
+        <w:tblBorders/>
+      </w:tblPr>
+      <w:tcPr>
+        <w:shd w:val="clear" w:color="ffffff"/>
+        <w:tcBorders>
+          <w:top w:val="none" w:color="000000" w:sz="4" w:space="0"/>
+          <w:left w:val="none" w:color="000000" w:sz="4" w:space="0"/>
+          <w:bottom w:val="none" w:color="000000" w:sz="4" w:space="0"/>
+          <w:right w:val="none" w:color="000000" w:sz="4" w:space="0"/>
+        </w:tcBorders>
+      </w:tcPr>
+    </w:tblStylePr>
     <w:tblStylePr w:type="nwCell">
       <w:pPr>
         <w:pBdr/>
@@ -5747,9 +5870,9 @@
       </w:tcPr>
     </w:tblStylePr>
   </w:style>
-  <w:style w:type="table" w:styleId="35">
+  <w:style w:type="table" w:styleId="758">
     <w:name w:val="Grid Table 3 - Accent 2"/>
-    <w:basedOn w:val="665"/>
+    <w:basedOn w:val="921"/>
     <w:uiPriority w:val="99"/>
     <w:pPr>
       <w:pBdr/>
@@ -5848,29 +5971,6 @@
         <w:tblBorders/>
       </w:tblPr>
       <w:tcPr>
-        <w:shd w:color="ffffff"/>
-        <w:tcBorders>
-          <w:top w:val="none" w:color="000000" w:sz="4" w:space="0"/>
-          <w:left w:val="none" w:color="000000" w:sz="4" w:space="0"/>
-          <w:bottom w:val="none" w:color="000000" w:sz="4" w:space="0"/>
-          <w:right w:val="none" w:color="000000" w:sz="4" w:space="0"/>
-        </w:tcBorders>
-      </w:tcPr>
-    </w:tblStylePr>
-    <w:tblStylePr w:type="firstRow">
-      <w:rPr>
-        <w:b/>
-        <w:color w:val="404040"/>
-      </w:rPr>
-      <w:pPr>
-        <w:pBdr/>
-        <w:spacing/>
-        <w:ind/>
-      </w:pPr>
-      <w:tblPr>
-        <w:tblBorders/>
-      </w:tblPr>
-      <w:tcPr>
         <w:shd w:val="clear" w:color="ffffff"/>
         <w:tcBorders>
           <w:top w:val="none" w:color="000000" w:sz="4" w:space="0"/>
@@ -5880,30 +5980,7 @@
         </w:tcBorders>
       </w:tcPr>
     </w:tblStylePr>
-    <w:tblStylePr w:type="lastCol">
-      <w:rPr>
-        <w:i/>
-        <w:color w:val="404040"/>
-      </w:rPr>
-      <w:pPr>
-        <w:pBdr/>
-        <w:spacing/>
-        <w:ind/>
-      </w:pPr>
-      <w:tblPr>
-        <w:tblBorders/>
-      </w:tblPr>
-      <w:tcPr>
-        <w:shd w:color="ffffff"/>
-        <w:tcBorders>
-          <w:top w:val="none" w:color="000000" w:sz="4" w:space="0"/>
-          <w:left w:val="none" w:color="000000" w:sz="4" w:space="0"/>
-          <w:bottom w:val="none" w:color="000000" w:sz="4" w:space="0"/>
-          <w:right w:val="none" w:color="000000" w:sz="4" w:space="0"/>
-        </w:tcBorders>
-      </w:tcPr>
-    </w:tblStylePr>
-    <w:tblStylePr w:type="lastRow">
+    <w:tblStylePr w:type="firstRow">
       <w:rPr>
         <w:b/>
         <w:color w:val="404040"/>
@@ -5926,6 +6003,52 @@
         </w:tcBorders>
       </w:tcPr>
     </w:tblStylePr>
+    <w:tblStylePr w:type="lastCol">
+      <w:rPr>
+        <w:i/>
+        <w:color w:val="404040"/>
+      </w:rPr>
+      <w:pPr>
+        <w:pBdr/>
+        <w:spacing/>
+        <w:ind/>
+      </w:pPr>
+      <w:tblPr>
+        <w:tblBorders/>
+      </w:tblPr>
+      <w:tcPr>
+        <w:shd w:val="clear" w:color="ffffff"/>
+        <w:tcBorders>
+          <w:top w:val="none" w:color="000000" w:sz="4" w:space="0"/>
+          <w:left w:val="none" w:color="000000" w:sz="4" w:space="0"/>
+          <w:bottom w:val="none" w:color="000000" w:sz="4" w:space="0"/>
+          <w:right w:val="none" w:color="000000" w:sz="4" w:space="0"/>
+        </w:tcBorders>
+      </w:tcPr>
+    </w:tblStylePr>
+    <w:tblStylePr w:type="lastRow">
+      <w:rPr>
+        <w:b/>
+        <w:color w:val="404040"/>
+      </w:rPr>
+      <w:pPr>
+        <w:pBdr/>
+        <w:spacing/>
+        <w:ind/>
+      </w:pPr>
+      <w:tblPr>
+        <w:tblBorders/>
+      </w:tblPr>
+      <w:tcPr>
+        <w:shd w:val="clear" w:color="ffffff"/>
+        <w:tcBorders>
+          <w:top w:val="none" w:color="000000" w:sz="4" w:space="0"/>
+          <w:left w:val="none" w:color="000000" w:sz="4" w:space="0"/>
+          <w:bottom w:val="none" w:color="000000" w:sz="4" w:space="0"/>
+          <w:right w:val="none" w:color="000000" w:sz="4" w:space="0"/>
+        </w:tcBorders>
+      </w:tcPr>
+    </w:tblStylePr>
     <w:tblStylePr w:type="nwCell">
       <w:pPr>
         <w:pBdr/>
@@ -5992,9 +6115,9 @@
       </w:tcPr>
     </w:tblStylePr>
   </w:style>
-  <w:style w:type="table" w:styleId="36">
+  <w:style w:type="table" w:styleId="759">
     <w:name w:val="Grid Table 3 - Accent 3"/>
-    <w:basedOn w:val="665"/>
+    <w:basedOn w:val="921"/>
     <w:uiPriority w:val="99"/>
     <w:pPr>
       <w:pBdr/>
@@ -6093,29 +6216,6 @@
         <w:tblBorders/>
       </w:tblPr>
       <w:tcPr>
-        <w:shd w:color="ffffff"/>
-        <w:tcBorders>
-          <w:top w:val="none" w:color="000000" w:sz="4" w:space="0"/>
-          <w:left w:val="none" w:color="000000" w:sz="4" w:space="0"/>
-          <w:bottom w:val="none" w:color="000000" w:sz="4" w:space="0"/>
-          <w:right w:val="none" w:color="000000" w:sz="4" w:space="0"/>
-        </w:tcBorders>
-      </w:tcPr>
-    </w:tblStylePr>
-    <w:tblStylePr w:type="firstRow">
-      <w:rPr>
-        <w:b/>
-        <w:color w:val="404040"/>
-      </w:rPr>
-      <w:pPr>
-        <w:pBdr/>
-        <w:spacing/>
-        <w:ind/>
-      </w:pPr>
-      <w:tblPr>
-        <w:tblBorders/>
-      </w:tblPr>
-      <w:tcPr>
         <w:shd w:val="clear" w:color="ffffff"/>
         <w:tcBorders>
           <w:top w:val="none" w:color="000000" w:sz="4" w:space="0"/>
@@ -6125,30 +6225,7 @@
         </w:tcBorders>
       </w:tcPr>
     </w:tblStylePr>
-    <w:tblStylePr w:type="lastCol">
-      <w:rPr>
-        <w:i/>
-        <w:color w:val="404040"/>
-      </w:rPr>
-      <w:pPr>
-        <w:pBdr/>
-        <w:spacing/>
-        <w:ind/>
-      </w:pPr>
-      <w:tblPr>
-        <w:tblBorders/>
-      </w:tblPr>
-      <w:tcPr>
-        <w:shd w:color="ffffff"/>
-        <w:tcBorders>
-          <w:top w:val="none" w:color="000000" w:sz="4" w:space="0"/>
-          <w:left w:val="none" w:color="000000" w:sz="4" w:space="0"/>
-          <w:bottom w:val="none" w:color="000000" w:sz="4" w:space="0"/>
-          <w:right w:val="none" w:color="000000" w:sz="4" w:space="0"/>
-        </w:tcBorders>
-      </w:tcPr>
-    </w:tblStylePr>
-    <w:tblStylePr w:type="lastRow">
+    <w:tblStylePr w:type="firstRow">
       <w:rPr>
         <w:b/>
         <w:color w:val="404040"/>
@@ -6171,6 +6248,52 @@
         </w:tcBorders>
       </w:tcPr>
     </w:tblStylePr>
+    <w:tblStylePr w:type="lastCol">
+      <w:rPr>
+        <w:i/>
+        <w:color w:val="404040"/>
+      </w:rPr>
+      <w:pPr>
+        <w:pBdr/>
+        <w:spacing/>
+        <w:ind/>
+      </w:pPr>
+      <w:tblPr>
+        <w:tblBorders/>
+      </w:tblPr>
+      <w:tcPr>
+        <w:shd w:val="clear" w:color="ffffff"/>
+        <w:tcBorders>
+          <w:top w:val="none" w:color="000000" w:sz="4" w:space="0"/>
+          <w:left w:val="none" w:color="000000" w:sz="4" w:space="0"/>
+          <w:bottom w:val="none" w:color="000000" w:sz="4" w:space="0"/>
+          <w:right w:val="none" w:color="000000" w:sz="4" w:space="0"/>
+        </w:tcBorders>
+      </w:tcPr>
+    </w:tblStylePr>
+    <w:tblStylePr w:type="lastRow">
+      <w:rPr>
+        <w:b/>
+        <w:color w:val="404040"/>
+      </w:rPr>
+      <w:pPr>
+        <w:pBdr/>
+        <w:spacing/>
+        <w:ind/>
+      </w:pPr>
+      <w:tblPr>
+        <w:tblBorders/>
+      </w:tblPr>
+      <w:tcPr>
+        <w:shd w:val="clear" w:color="ffffff"/>
+        <w:tcBorders>
+          <w:top w:val="none" w:color="000000" w:sz="4" w:space="0"/>
+          <w:left w:val="none" w:color="000000" w:sz="4" w:space="0"/>
+          <w:bottom w:val="none" w:color="000000" w:sz="4" w:space="0"/>
+          <w:right w:val="none" w:color="000000" w:sz="4" w:space="0"/>
+        </w:tcBorders>
+      </w:tcPr>
+    </w:tblStylePr>
     <w:tblStylePr w:type="nwCell">
       <w:pPr>
         <w:pBdr/>
@@ -6237,9 +6360,9 @@
       </w:tcPr>
     </w:tblStylePr>
   </w:style>
-  <w:style w:type="table" w:styleId="37">
+  <w:style w:type="table" w:styleId="760">
     <w:name w:val="Grid Table 3 - Accent 4"/>
-    <w:basedOn w:val="665"/>
+    <w:basedOn w:val="921"/>
     <w:uiPriority w:val="99"/>
     <w:pPr>
       <w:pBdr/>
@@ -6338,29 +6461,6 @@
         <w:tblBorders/>
       </w:tblPr>
       <w:tcPr>
-        <w:shd w:color="ffffff"/>
-        <w:tcBorders>
-          <w:top w:val="none" w:color="000000" w:sz="4" w:space="0"/>
-          <w:left w:val="none" w:color="000000" w:sz="4" w:space="0"/>
-          <w:bottom w:val="none" w:color="000000" w:sz="4" w:space="0"/>
-          <w:right w:val="none" w:color="000000" w:sz="4" w:space="0"/>
-        </w:tcBorders>
-      </w:tcPr>
-    </w:tblStylePr>
-    <w:tblStylePr w:type="firstRow">
-      <w:rPr>
-        <w:b/>
-        <w:color w:val="404040"/>
-      </w:rPr>
-      <w:pPr>
-        <w:pBdr/>
-        <w:spacing/>
-        <w:ind/>
-      </w:pPr>
-      <w:tblPr>
-        <w:tblBorders/>
-      </w:tblPr>
-      <w:tcPr>
         <w:shd w:val="clear" w:color="ffffff"/>
         <w:tcBorders>
           <w:top w:val="none" w:color="000000" w:sz="4" w:space="0"/>
@@ -6370,30 +6470,7 @@
         </w:tcBorders>
       </w:tcPr>
     </w:tblStylePr>
-    <w:tblStylePr w:type="lastCol">
-      <w:rPr>
-        <w:i/>
-        <w:color w:val="404040"/>
-      </w:rPr>
-      <w:pPr>
-        <w:pBdr/>
-        <w:spacing/>
-        <w:ind/>
-      </w:pPr>
-      <w:tblPr>
-        <w:tblBorders/>
-      </w:tblPr>
-      <w:tcPr>
-        <w:shd w:color="ffffff"/>
-        <w:tcBorders>
-          <w:top w:val="none" w:color="000000" w:sz="4" w:space="0"/>
-          <w:left w:val="none" w:color="000000" w:sz="4" w:space="0"/>
-          <w:bottom w:val="none" w:color="000000" w:sz="4" w:space="0"/>
-          <w:right w:val="none" w:color="000000" w:sz="4" w:space="0"/>
-        </w:tcBorders>
-      </w:tcPr>
-    </w:tblStylePr>
-    <w:tblStylePr w:type="lastRow">
+    <w:tblStylePr w:type="firstRow">
       <w:rPr>
         <w:b/>
         <w:color w:val="404040"/>
@@ -6416,6 +6493,52 @@
         </w:tcBorders>
       </w:tcPr>
     </w:tblStylePr>
+    <w:tblStylePr w:type="lastCol">
+      <w:rPr>
+        <w:i/>
+        <w:color w:val="404040"/>
+      </w:rPr>
+      <w:pPr>
+        <w:pBdr/>
+        <w:spacing/>
+        <w:ind/>
+      </w:pPr>
+      <w:tblPr>
+        <w:tblBorders/>
+      </w:tblPr>
+      <w:tcPr>
+        <w:shd w:val="clear" w:color="ffffff"/>
+        <w:tcBorders>
+          <w:top w:val="none" w:color="000000" w:sz="4" w:space="0"/>
+          <w:left w:val="none" w:color="000000" w:sz="4" w:space="0"/>
+          <w:bottom w:val="none" w:color="000000" w:sz="4" w:space="0"/>
+          <w:right w:val="none" w:color="000000" w:sz="4" w:space="0"/>
+        </w:tcBorders>
+      </w:tcPr>
+    </w:tblStylePr>
+    <w:tblStylePr w:type="lastRow">
+      <w:rPr>
+        <w:b/>
+        <w:color w:val="404040"/>
+      </w:rPr>
+      <w:pPr>
+        <w:pBdr/>
+        <w:spacing/>
+        <w:ind/>
+      </w:pPr>
+      <w:tblPr>
+        <w:tblBorders/>
+      </w:tblPr>
+      <w:tcPr>
+        <w:shd w:val="clear" w:color="ffffff"/>
+        <w:tcBorders>
+          <w:top w:val="none" w:color="000000" w:sz="4" w:space="0"/>
+          <w:left w:val="none" w:color="000000" w:sz="4" w:space="0"/>
+          <w:bottom w:val="none" w:color="000000" w:sz="4" w:space="0"/>
+          <w:right w:val="none" w:color="000000" w:sz="4" w:space="0"/>
+        </w:tcBorders>
+      </w:tcPr>
+    </w:tblStylePr>
     <w:tblStylePr w:type="nwCell">
       <w:pPr>
         <w:pBdr/>
@@ -6482,9 +6605,9 @@
       </w:tcPr>
     </w:tblStylePr>
   </w:style>
-  <w:style w:type="table" w:styleId="38">
+  <w:style w:type="table" w:styleId="761">
     <w:name w:val="Grid Table 3 - Accent 5"/>
-    <w:basedOn w:val="665"/>
+    <w:basedOn w:val="921"/>
     <w:uiPriority w:val="99"/>
     <w:pPr>
       <w:pBdr/>
@@ -6583,29 +6706,6 @@
         <w:tblBorders/>
       </w:tblPr>
       <w:tcPr>
-        <w:shd w:color="ffffff"/>
-        <w:tcBorders>
-          <w:top w:val="none" w:color="000000" w:sz="4" w:space="0"/>
-          <w:left w:val="none" w:color="000000" w:sz="4" w:space="0"/>
-          <w:bottom w:val="none" w:color="000000" w:sz="4" w:space="0"/>
-          <w:right w:val="none" w:color="000000" w:sz="4" w:space="0"/>
-        </w:tcBorders>
-      </w:tcPr>
-    </w:tblStylePr>
-    <w:tblStylePr w:type="firstRow">
-      <w:rPr>
-        <w:b/>
-        <w:color w:val="404040"/>
-      </w:rPr>
-      <w:pPr>
-        <w:pBdr/>
-        <w:spacing/>
-        <w:ind/>
-      </w:pPr>
-      <w:tblPr>
-        <w:tblBorders/>
-      </w:tblPr>
-      <w:tcPr>
         <w:shd w:val="clear" w:color="ffffff"/>
         <w:tcBorders>
           <w:top w:val="none" w:color="000000" w:sz="4" w:space="0"/>
@@ -6615,30 +6715,7 @@
         </w:tcBorders>
       </w:tcPr>
     </w:tblStylePr>
-    <w:tblStylePr w:type="lastCol">
-      <w:rPr>
-        <w:i/>
-        <w:color w:val="404040"/>
-      </w:rPr>
-      <w:pPr>
-        <w:pBdr/>
-        <w:spacing/>
-        <w:ind/>
-      </w:pPr>
-      <w:tblPr>
-        <w:tblBorders/>
-      </w:tblPr>
-      <w:tcPr>
-        <w:shd w:color="ffffff"/>
-        <w:tcBorders>
-          <w:top w:val="none" w:color="000000" w:sz="4" w:space="0"/>
-          <w:left w:val="none" w:color="000000" w:sz="4" w:space="0"/>
-          <w:bottom w:val="none" w:color="000000" w:sz="4" w:space="0"/>
-          <w:right w:val="none" w:color="000000" w:sz="4" w:space="0"/>
-        </w:tcBorders>
-      </w:tcPr>
-    </w:tblStylePr>
-    <w:tblStylePr w:type="lastRow">
+    <w:tblStylePr w:type="firstRow">
       <w:rPr>
         <w:b/>
         <w:color w:val="404040"/>
@@ -6661,6 +6738,52 @@
         </w:tcBorders>
       </w:tcPr>
     </w:tblStylePr>
+    <w:tblStylePr w:type="lastCol">
+      <w:rPr>
+        <w:i/>
+        <w:color w:val="404040"/>
+      </w:rPr>
+      <w:pPr>
+        <w:pBdr/>
+        <w:spacing/>
+        <w:ind/>
+      </w:pPr>
+      <w:tblPr>
+        <w:tblBorders/>
+      </w:tblPr>
+      <w:tcPr>
+        <w:shd w:val="clear" w:color="ffffff"/>
+        <w:tcBorders>
+          <w:top w:val="none" w:color="000000" w:sz="4" w:space="0"/>
+          <w:left w:val="none" w:color="000000" w:sz="4" w:space="0"/>
+          <w:bottom w:val="none" w:color="000000" w:sz="4" w:space="0"/>
+          <w:right w:val="none" w:color="000000" w:sz="4" w:space="0"/>
+        </w:tcBorders>
+      </w:tcPr>
+    </w:tblStylePr>
+    <w:tblStylePr w:type="lastRow">
+      <w:rPr>
+        <w:b/>
+        <w:color w:val="404040"/>
+      </w:rPr>
+      <w:pPr>
+        <w:pBdr/>
+        <w:spacing/>
+        <w:ind/>
+      </w:pPr>
+      <w:tblPr>
+        <w:tblBorders/>
+      </w:tblPr>
+      <w:tcPr>
+        <w:shd w:val="clear" w:color="ffffff"/>
+        <w:tcBorders>
+          <w:top w:val="none" w:color="000000" w:sz="4" w:space="0"/>
+          <w:left w:val="none" w:color="000000" w:sz="4" w:space="0"/>
+          <w:bottom w:val="none" w:color="000000" w:sz="4" w:space="0"/>
+          <w:right w:val="none" w:color="000000" w:sz="4" w:space="0"/>
+        </w:tcBorders>
+      </w:tcPr>
+    </w:tblStylePr>
     <w:tblStylePr w:type="nwCell">
       <w:pPr>
         <w:pBdr/>
@@ -6727,9 +6850,9 @@
       </w:tcPr>
     </w:tblStylePr>
   </w:style>
-  <w:style w:type="table" w:styleId="39">
+  <w:style w:type="table" w:styleId="762">
     <w:name w:val="Grid Table 3 - Accent 6"/>
-    <w:basedOn w:val="665"/>
+    <w:basedOn w:val="921"/>
     <w:uiPriority w:val="99"/>
     <w:pPr>
       <w:pBdr/>
@@ -6828,29 +6951,6 @@
         <w:tblBorders/>
       </w:tblPr>
       <w:tcPr>
-        <w:shd w:color="ffffff"/>
-        <w:tcBorders>
-          <w:top w:val="none" w:color="000000" w:sz="4" w:space="0"/>
-          <w:left w:val="none" w:color="000000" w:sz="4" w:space="0"/>
-          <w:bottom w:val="none" w:color="000000" w:sz="4" w:space="0"/>
-          <w:right w:val="none" w:color="000000" w:sz="4" w:space="0"/>
-        </w:tcBorders>
-      </w:tcPr>
-    </w:tblStylePr>
-    <w:tblStylePr w:type="firstRow">
-      <w:rPr>
-        <w:b/>
-        <w:color w:val="404040"/>
-      </w:rPr>
-      <w:pPr>
-        <w:pBdr/>
-        <w:spacing/>
-        <w:ind/>
-      </w:pPr>
-      <w:tblPr>
-        <w:tblBorders/>
-      </w:tblPr>
-      <w:tcPr>
         <w:shd w:val="clear" w:color="ffffff"/>
         <w:tcBorders>
           <w:top w:val="none" w:color="000000" w:sz="4" w:space="0"/>
@@ -6860,30 +6960,7 @@
         </w:tcBorders>
       </w:tcPr>
     </w:tblStylePr>
-    <w:tblStylePr w:type="lastCol">
-      <w:rPr>
-        <w:i/>
-        <w:color w:val="404040"/>
-      </w:rPr>
-      <w:pPr>
-        <w:pBdr/>
-        <w:spacing/>
-        <w:ind/>
-      </w:pPr>
-      <w:tblPr>
-        <w:tblBorders/>
-      </w:tblPr>
-      <w:tcPr>
-        <w:shd w:color="ffffff"/>
-        <w:tcBorders>
-          <w:top w:val="none" w:color="000000" w:sz="4" w:space="0"/>
-          <w:left w:val="none" w:color="000000" w:sz="4" w:space="0"/>
-          <w:bottom w:val="none" w:color="000000" w:sz="4" w:space="0"/>
-          <w:right w:val="none" w:color="000000" w:sz="4" w:space="0"/>
-        </w:tcBorders>
-      </w:tcPr>
-    </w:tblStylePr>
-    <w:tblStylePr w:type="lastRow">
+    <w:tblStylePr w:type="firstRow">
       <w:rPr>
         <w:b/>
         <w:color w:val="404040"/>
@@ -6906,6 +6983,52 @@
         </w:tcBorders>
       </w:tcPr>
     </w:tblStylePr>
+    <w:tblStylePr w:type="lastCol">
+      <w:rPr>
+        <w:i/>
+        <w:color w:val="404040"/>
+      </w:rPr>
+      <w:pPr>
+        <w:pBdr/>
+        <w:spacing/>
+        <w:ind/>
+      </w:pPr>
+      <w:tblPr>
+        <w:tblBorders/>
+      </w:tblPr>
+      <w:tcPr>
+        <w:shd w:val="clear" w:color="ffffff"/>
+        <w:tcBorders>
+          <w:top w:val="none" w:color="000000" w:sz="4" w:space="0"/>
+          <w:left w:val="none" w:color="000000" w:sz="4" w:space="0"/>
+          <w:bottom w:val="none" w:color="000000" w:sz="4" w:space="0"/>
+          <w:right w:val="none" w:color="000000" w:sz="4" w:space="0"/>
+        </w:tcBorders>
+      </w:tcPr>
+    </w:tblStylePr>
+    <w:tblStylePr w:type="lastRow">
+      <w:rPr>
+        <w:b/>
+        <w:color w:val="404040"/>
+      </w:rPr>
+      <w:pPr>
+        <w:pBdr/>
+        <w:spacing/>
+        <w:ind/>
+      </w:pPr>
+      <w:tblPr>
+        <w:tblBorders/>
+      </w:tblPr>
+      <w:tcPr>
+        <w:shd w:val="clear" w:color="ffffff"/>
+        <w:tcBorders>
+          <w:top w:val="none" w:color="000000" w:sz="4" w:space="0"/>
+          <w:left w:val="none" w:color="000000" w:sz="4" w:space="0"/>
+          <w:bottom w:val="none" w:color="000000" w:sz="4" w:space="0"/>
+          <w:right w:val="none" w:color="000000" w:sz="4" w:space="0"/>
+        </w:tcBorders>
+      </w:tcPr>
+    </w:tblStylePr>
     <w:tblStylePr w:type="nwCell">
       <w:pPr>
         <w:pBdr/>
@@ -6972,9 +7095,9 @@
       </w:tcPr>
     </w:tblStylePr>
   </w:style>
-  <w:style w:type="table" w:styleId="40">
+  <w:style w:type="table" w:styleId="763">
     <w:name w:val="Grid Table 4"/>
-    <w:basedOn w:val="665"/>
+    <w:basedOn w:val="921"/>
     <w:uiPriority w:val="59"/>
     <w:pPr>
       <w:pBdr/>
@@ -7205,9 +7328,9 @@
       </w:tcPr>
     </w:tblStylePr>
   </w:style>
-  <w:style w:type="table" w:styleId="41">
+  <w:style w:type="table" w:styleId="764">
     <w:name w:val="Grid Table 4 - Accent 1"/>
-    <w:basedOn w:val="665"/>
+    <w:basedOn w:val="921"/>
     <w:uiPriority w:val="59"/>
     <w:pPr>
       <w:pBdr/>
@@ -7438,9 +7561,9 @@
       </w:tcPr>
     </w:tblStylePr>
   </w:style>
-  <w:style w:type="table" w:styleId="42">
+  <w:style w:type="table" w:styleId="765">
     <w:name w:val="Grid Table 4 - Accent 2"/>
-    <w:basedOn w:val="665"/>
+    <w:basedOn w:val="921"/>
     <w:uiPriority w:val="59"/>
     <w:pPr>
       <w:pBdr/>
@@ -7671,9 +7794,9 @@
       </w:tcPr>
     </w:tblStylePr>
   </w:style>
-  <w:style w:type="table" w:styleId="43">
+  <w:style w:type="table" w:styleId="766">
     <w:name w:val="Grid Table 4 - Accent 3"/>
-    <w:basedOn w:val="665"/>
+    <w:basedOn w:val="921"/>
     <w:uiPriority w:val="59"/>
     <w:pPr>
       <w:pBdr/>
@@ -7904,9 +8027,9 @@
       </w:tcPr>
     </w:tblStylePr>
   </w:style>
-  <w:style w:type="table" w:styleId="44">
+  <w:style w:type="table" w:styleId="767">
     <w:name w:val="Grid Table 4 - Accent 4"/>
-    <w:basedOn w:val="665"/>
+    <w:basedOn w:val="921"/>
     <w:uiPriority w:val="59"/>
     <w:pPr>
       <w:pBdr/>
@@ -8137,9 +8260,9 @@
       </w:tcPr>
     </w:tblStylePr>
   </w:style>
-  <w:style w:type="table" w:styleId="45">
+  <w:style w:type="table" w:styleId="768">
     <w:name w:val="Grid Table 4 - Accent 5"/>
-    <w:basedOn w:val="665"/>
+    <w:basedOn w:val="921"/>
     <w:uiPriority w:val="59"/>
     <w:pPr>
       <w:pBdr/>
@@ -8370,9 +8493,9 @@
       </w:tcPr>
     </w:tblStylePr>
   </w:style>
-  <w:style w:type="table" w:styleId="46">
+  <w:style w:type="table" w:styleId="769">
     <w:name w:val="Grid Table 4 - Accent 6"/>
-    <w:basedOn w:val="665"/>
+    <w:basedOn w:val="921"/>
     <w:uiPriority w:val="59"/>
     <w:pPr>
       <w:pBdr/>
@@ -8603,9 +8726,9 @@
       </w:tcPr>
     </w:tblStylePr>
   </w:style>
-  <w:style w:type="table" w:styleId="47">
+  <w:style w:type="table" w:styleId="770">
     <w:name w:val="Grid Table 5 Dark"/>
-    <w:basedOn w:val="665"/>
+    <w:basedOn w:val="921"/>
     <w:uiPriority w:val="99"/>
     <w:pPr>
       <w:pBdr/>
@@ -8831,9 +8954,9 @@
       </w:tcPr>
     </w:tblStylePr>
   </w:style>
-  <w:style w:type="table" w:styleId="48">
+  <w:style w:type="table" w:styleId="771">
     <w:name w:val="Grid Table 5 Dark- Accent 1"/>
-    <w:basedOn w:val="665"/>
+    <w:basedOn w:val="921"/>
     <w:uiPriority w:val="99"/>
     <w:pPr>
       <w:pBdr/>
@@ -9059,9 +9182,9 @@
       </w:tcPr>
     </w:tblStylePr>
   </w:style>
-  <w:style w:type="table" w:styleId="49">
+  <w:style w:type="table" w:styleId="772">
     <w:name w:val="Grid Table 5 Dark - Accent 2"/>
-    <w:basedOn w:val="665"/>
+    <w:basedOn w:val="921"/>
     <w:uiPriority w:val="99"/>
     <w:pPr>
       <w:pBdr/>
@@ -9287,9 +9410,9 @@
       </w:tcPr>
     </w:tblStylePr>
   </w:style>
-  <w:style w:type="table" w:styleId="50">
+  <w:style w:type="table" w:styleId="773">
     <w:name w:val="Grid Table 5 Dark - Accent 3"/>
-    <w:basedOn w:val="665"/>
+    <w:basedOn w:val="921"/>
     <w:uiPriority w:val="99"/>
     <w:pPr>
       <w:pBdr/>
@@ -9515,9 +9638,9 @@
       </w:tcPr>
     </w:tblStylePr>
   </w:style>
-  <w:style w:type="table" w:styleId="51">
+  <w:style w:type="table" w:styleId="774">
     <w:name w:val="Grid Table 5 Dark- Accent 4"/>
-    <w:basedOn w:val="665"/>
+    <w:basedOn w:val="921"/>
     <w:uiPriority w:val="99"/>
     <w:pPr>
       <w:pBdr/>
@@ -9743,9 +9866,9 @@
       </w:tcPr>
     </w:tblStylePr>
   </w:style>
-  <w:style w:type="table" w:styleId="52">
+  <w:style w:type="table" w:styleId="775">
     <w:name w:val="Grid Table 5 Dark - Accent 5"/>
-    <w:basedOn w:val="665"/>
+    <w:basedOn w:val="921"/>
     <w:uiPriority w:val="99"/>
     <w:pPr>
       <w:pBdr/>
@@ -9971,9 +10094,9 @@
       </w:tcPr>
     </w:tblStylePr>
   </w:style>
-  <w:style w:type="table" w:styleId="53">
+  <w:style w:type="table" w:styleId="776">
     <w:name w:val="Grid Table 5 Dark - Accent 6"/>
-    <w:basedOn w:val="665"/>
+    <w:basedOn w:val="921"/>
     <w:uiPriority w:val="99"/>
     <w:pPr>
       <w:pBdr/>
@@ -10199,9 +10322,9 @@
       </w:tcPr>
     </w:tblStylePr>
   </w:style>
-  <w:style w:type="table" w:styleId="54">
+  <w:style w:type="table" w:styleId="777">
     <w:name w:val="Grid Table 6 Colorful"/>
-    <w:basedOn w:val="665"/>
+    <w:basedOn w:val="921"/>
     <w:uiPriority w:val="99"/>
     <w:pPr>
       <w:pBdr/>
@@ -10429,9 +10552,9 @@
       </w:tcPr>
     </w:tblStylePr>
   </w:style>
-  <w:style w:type="table" w:styleId="55">
+  <w:style w:type="table" w:styleId="778">
     <w:name w:val="Grid Table 6 Colorful - Accent 1"/>
-    <w:basedOn w:val="665"/>
+    <w:basedOn w:val="921"/>
     <w:uiPriority w:val="99"/>
     <w:pPr>
       <w:pBdr/>
@@ -10659,9 +10782,9 @@
       </w:tcPr>
     </w:tblStylePr>
   </w:style>
-  <w:style w:type="table" w:styleId="56">
+  <w:style w:type="table" w:styleId="779">
     <w:name w:val="Grid Table 6 Colorful - Accent 2"/>
-    <w:basedOn w:val="665"/>
+    <w:basedOn w:val="921"/>
     <w:uiPriority w:val="99"/>
     <w:pPr>
       <w:pBdr/>
@@ -10889,9 +11012,9 @@
       </w:tcPr>
     </w:tblStylePr>
   </w:style>
-  <w:style w:type="table" w:styleId="57">
+  <w:style w:type="table" w:styleId="780">
     <w:name w:val="Grid Table 6 Colorful - Accent 3"/>
-    <w:basedOn w:val="665"/>
+    <w:basedOn w:val="921"/>
     <w:uiPriority w:val="99"/>
     <w:pPr>
       <w:pBdr/>
@@ -11119,9 +11242,9 @@
       </w:tcPr>
     </w:tblStylePr>
   </w:style>
-  <w:style w:type="table" w:styleId="58">
+  <w:style w:type="table" w:styleId="781">
     <w:name w:val="Grid Table 6 Colorful - Accent 4"/>
-    <w:basedOn w:val="665"/>
+    <w:basedOn w:val="921"/>
     <w:uiPriority w:val="99"/>
     <w:pPr>
       <w:pBdr/>
@@ -11349,9 +11472,9 @@
       </w:tcPr>
     </w:tblStylePr>
   </w:style>
-  <w:style w:type="table" w:styleId="59">
+  <w:style w:type="table" w:styleId="782">
     <w:name w:val="Grid Table 6 Colorful - Accent 5"/>
-    <w:basedOn w:val="665"/>
+    <w:basedOn w:val="921"/>
     <w:uiPriority w:val="99"/>
     <w:pPr>
       <w:pBdr/>
@@ -11579,9 +11702,9 @@
       </w:tcPr>
     </w:tblStylePr>
   </w:style>
-  <w:style w:type="table" w:styleId="60">
+  <w:style w:type="table" w:styleId="783">
     <w:name w:val="Grid Table 6 Colorful - Accent 6"/>
-    <w:basedOn w:val="665"/>
+    <w:basedOn w:val="921"/>
     <w:uiPriority w:val="99"/>
     <w:pPr>
       <w:pBdr/>
@@ -11809,9 +11932,9 @@
       </w:tcPr>
     </w:tblStylePr>
   </w:style>
-  <w:style w:type="table" w:styleId="61">
+  <w:style w:type="table" w:styleId="784">
     <w:name w:val="Grid Table 7 Colorful"/>
-    <w:basedOn w:val="665"/>
+    <w:basedOn w:val="921"/>
     <w:uiPriority w:val="99"/>
     <w:pPr>
       <w:pBdr/>
@@ -11913,11 +12036,11 @@
         <w:tblBorders/>
       </w:tblPr>
       <w:tcPr>
-        <w:shd w:color="ffffff"/>
+        <w:shd w:val="clear" w:color="ffffff"/>
         <w:tcBorders>
-          <w:top w:val="none"/>
-          <w:left w:val="none"/>
-          <w:bottom w:val="none"/>
+          <w:top w:val="none" w:color="000000" w:sz="4" w:space="0"/>
+          <w:left w:val="none" w:color="000000" w:sz="4" w:space="0"/>
+          <w:bottom w:val="none" w:color="000000" w:sz="4" w:space="0"/>
           <w:right w:val="single" w:color="000000" w:themeColor="text1" w:themeTint="80" w:sz="4" w:space="0"/>
         </w:tcBorders>
       </w:tcPr>
@@ -11940,10 +12063,10 @@
       <w:tcPr>
         <w:shd w:val="clear" w:color="ffffff" w:themeColor="light1" w:fill="ffffff" w:themeFill="light1"/>
         <w:tcBorders>
-          <w:top w:val="none"/>
-          <w:left w:val="none"/>
+          <w:top w:val="none" w:color="000000" w:sz="4" w:space="0"/>
+          <w:left w:val="none" w:color="000000" w:sz="4" w:space="0"/>
           <w:bottom w:val="single" w:color="000000" w:themeColor="text1" w:themeTint="80" w:sz="4" w:space="0"/>
-          <w:right w:val="none"/>
+          <w:right w:val="none" w:color="000000" w:sz="4" w:space="0"/>
         </w:tcBorders>
       </w:tcPr>
     </w:tblStylePr>
@@ -11963,12 +12086,12 @@
         <w:tblBorders/>
       </w:tblPr>
       <w:tcPr>
-        <w:shd w:color="ffffff"/>
+        <w:shd w:val="clear" w:color="ffffff"/>
         <w:tcBorders>
-          <w:top w:val="none"/>
+          <w:top w:val="none" w:color="000000" w:sz="4" w:space="0"/>
           <w:left w:val="single" w:color="000000" w:themeColor="text1" w:themeTint="80" w:sz="4" w:space="0"/>
-          <w:bottom w:val="none"/>
-          <w:right w:val="none"/>
+          <w:bottom w:val="none" w:color="000000" w:sz="4" w:space="0"/>
+          <w:right w:val="none" w:color="000000" w:sz="4" w:space="0"/>
         </w:tcBorders>
       </w:tcPr>
     </w:tblStylePr>
@@ -11991,9 +12114,9 @@
         <w:shd w:val="clear" w:color="ffffff" w:themeColor="light1" w:fill="ffffff" w:themeFill="light1"/>
         <w:tcBorders>
           <w:top w:val="single" w:color="000000" w:themeColor="text1" w:themeTint="80" w:sz="4" w:space="0"/>
-          <w:left w:val="none"/>
-          <w:bottom w:val="none"/>
-          <w:right w:val="none"/>
+          <w:left w:val="none" w:color="000000" w:sz="4" w:space="0"/>
+          <w:bottom w:val="none" w:color="000000" w:sz="4" w:space="0"/>
+          <w:right w:val="none" w:color="000000" w:sz="4" w:space="0"/>
         </w:tcBorders>
       </w:tcPr>
     </w:tblStylePr>
@@ -12063,9 +12186,9 @@
       </w:tcPr>
     </w:tblStylePr>
   </w:style>
-  <w:style w:type="table" w:styleId="62">
+  <w:style w:type="table" w:styleId="785">
     <w:name w:val="Grid Table 7 Colorful - Accent 1"/>
-    <w:basedOn w:val="665"/>
+    <w:basedOn w:val="921"/>
     <w:uiPriority w:val="99"/>
     <w:pPr>
       <w:pBdr/>
@@ -12167,11 +12290,11 @@
         <w:tblBorders/>
       </w:tblPr>
       <w:tcPr>
-        <w:shd w:color="ffffff"/>
+        <w:shd w:val="clear" w:color="ffffff"/>
         <w:tcBorders>
-          <w:top w:val="none"/>
-          <w:left w:val="none"/>
-          <w:bottom w:val="none"/>
+          <w:top w:val="none" w:color="000000" w:sz="4" w:space="0"/>
+          <w:left w:val="none" w:color="000000" w:sz="4" w:space="0"/>
+          <w:bottom w:val="none" w:color="000000" w:sz="4" w:space="0"/>
           <w:right w:val="single" w:color="000000" w:themeColor="accent1" w:themeTint="80" w:sz="4" w:space="0"/>
         </w:tcBorders>
       </w:tcPr>
@@ -12194,10 +12317,10 @@
       <w:tcPr>
         <w:shd w:val="clear" w:color="ffffff" w:themeColor="light1" w:fill="ffffff" w:themeFill="light1"/>
         <w:tcBorders>
-          <w:top w:val="none"/>
-          <w:left w:val="none"/>
+          <w:top w:val="none" w:color="000000" w:sz="4" w:space="0"/>
+          <w:left w:val="none" w:color="000000" w:sz="4" w:space="0"/>
           <w:bottom w:val="single" w:color="000000" w:themeColor="accent1" w:themeTint="80" w:sz="4" w:space="0"/>
-          <w:right w:val="none"/>
+          <w:right w:val="none" w:color="000000" w:sz="4" w:space="0"/>
         </w:tcBorders>
       </w:tcPr>
     </w:tblStylePr>
@@ -12217,12 +12340,12 @@
         <w:tblBorders/>
       </w:tblPr>
       <w:tcPr>
-        <w:shd w:color="ffffff"/>
+        <w:shd w:val="clear" w:color="ffffff"/>
         <w:tcBorders>
-          <w:top w:val="none"/>
+          <w:top w:val="none" w:color="000000" w:sz="4" w:space="0"/>
           <w:left w:val="single" w:color="000000" w:themeColor="accent1" w:themeTint="80" w:sz="4" w:space="0"/>
-          <w:bottom w:val="none"/>
-          <w:right w:val="none"/>
+          <w:bottom w:val="none" w:color="000000" w:sz="4" w:space="0"/>
+          <w:right w:val="none" w:color="000000" w:sz="4" w:space="0"/>
         </w:tcBorders>
       </w:tcPr>
     </w:tblStylePr>
@@ -12245,9 +12368,9 @@
         <w:shd w:val="clear" w:color="ffffff" w:themeColor="light1" w:fill="ffffff" w:themeFill="light1"/>
         <w:tcBorders>
           <w:top w:val="single" w:color="000000" w:themeColor="accent1" w:themeTint="80" w:sz="4" w:space="0"/>
-          <w:left w:val="none"/>
-          <w:bottom w:val="none"/>
-          <w:right w:val="none"/>
+          <w:left w:val="none" w:color="000000" w:sz="4" w:space="0"/>
+          <w:bottom w:val="none" w:color="000000" w:sz="4" w:space="0"/>
+          <w:right w:val="none" w:color="000000" w:sz="4" w:space="0"/>
         </w:tcBorders>
       </w:tcPr>
     </w:tblStylePr>
@@ -12317,9 +12440,9 @@
       </w:tcPr>
     </w:tblStylePr>
   </w:style>
-  <w:style w:type="table" w:styleId="63">
+  <w:style w:type="table" w:styleId="786">
     <w:name w:val="Grid Table 7 Colorful - Accent 2"/>
-    <w:basedOn w:val="665"/>
+    <w:basedOn w:val="921"/>
     <w:uiPriority w:val="99"/>
     <w:pPr>
       <w:pBdr/>
@@ -12421,11 +12544,11 @@
         <w:tblBorders/>
       </w:tblPr>
       <w:tcPr>
-        <w:shd w:color="ffffff"/>
+        <w:shd w:val="clear" w:color="ffffff"/>
         <w:tcBorders>
-          <w:top w:val="none"/>
-          <w:left w:val="none"/>
-          <w:bottom w:val="none"/>
+          <w:top w:val="none" w:color="000000" w:sz="4" w:space="0"/>
+          <w:left w:val="none" w:color="000000" w:sz="4" w:space="0"/>
+          <w:bottom w:val="none" w:color="000000" w:sz="4" w:space="0"/>
           <w:right w:val="single" w:color="000000" w:themeColor="accent2" w:themeTint="97" w:sz="4" w:space="0"/>
         </w:tcBorders>
       </w:tcPr>
@@ -12448,10 +12571,10 @@
       <w:tcPr>
         <w:shd w:val="clear" w:color="ffffff" w:themeColor="light1" w:fill="ffffff" w:themeFill="light1"/>
         <w:tcBorders>
-          <w:top w:val="none"/>
-          <w:left w:val="none"/>
+          <w:top w:val="none" w:color="000000" w:sz="4" w:space="0"/>
+          <w:left w:val="none" w:color="000000" w:sz="4" w:space="0"/>
           <w:bottom w:val="single" w:color="000000" w:themeColor="accent2" w:themeTint="97" w:sz="4" w:space="0"/>
-          <w:right w:val="none"/>
+          <w:right w:val="none" w:color="000000" w:sz="4" w:space="0"/>
         </w:tcBorders>
       </w:tcPr>
     </w:tblStylePr>
@@ -12471,12 +12594,12 @@
         <w:tblBorders/>
       </w:tblPr>
       <w:tcPr>
-        <w:shd w:color="ffffff"/>
+        <w:shd w:val="clear" w:color="ffffff"/>
         <w:tcBorders>
-          <w:top w:val="none"/>
+          <w:top w:val="none" w:color="000000" w:sz="4" w:space="0"/>
           <w:left w:val="single" w:color="000000" w:themeColor="accent2" w:themeTint="97" w:sz="4" w:space="0"/>
-          <w:bottom w:val="none"/>
-          <w:right w:val="none"/>
+          <w:bottom w:val="none" w:color="000000" w:sz="4" w:space="0"/>
+          <w:right w:val="none" w:color="000000" w:sz="4" w:space="0"/>
         </w:tcBorders>
       </w:tcPr>
     </w:tblStylePr>
@@ -12499,9 +12622,9 @@
         <w:shd w:val="clear" w:color="ffffff" w:themeColor="light1" w:fill="ffffff" w:themeFill="light1"/>
         <w:tcBorders>
           <w:top w:val="single" w:color="000000" w:themeColor="accent2" w:themeTint="97" w:sz="4" w:space="0"/>
-          <w:left w:val="none"/>
-          <w:bottom w:val="none"/>
-          <w:right w:val="none"/>
+          <w:left w:val="none" w:color="000000" w:sz="4" w:space="0"/>
+          <w:bottom w:val="none" w:color="000000" w:sz="4" w:space="0"/>
+          <w:right w:val="none" w:color="000000" w:sz="4" w:space="0"/>
         </w:tcBorders>
       </w:tcPr>
     </w:tblStylePr>
@@ -12571,9 +12694,9 @@
       </w:tcPr>
     </w:tblStylePr>
   </w:style>
-  <w:style w:type="table" w:styleId="64">
+  <w:style w:type="table" w:styleId="787">
     <w:name w:val="Grid Table 7 Colorful - Accent 3"/>
-    <w:basedOn w:val="665"/>
+    <w:basedOn w:val="921"/>
     <w:uiPriority w:val="99"/>
     <w:pPr>
       <w:pBdr/>
@@ -12675,11 +12798,11 @@
         <w:tblBorders/>
       </w:tblPr>
       <w:tcPr>
-        <w:shd w:color="ffffff"/>
+        <w:shd w:val="clear" w:color="ffffff"/>
         <w:tcBorders>
-          <w:top w:val="none"/>
-          <w:left w:val="none"/>
-          <w:bottom w:val="none"/>
+          <w:top w:val="none" w:color="000000" w:sz="4" w:space="0"/>
+          <w:left w:val="none" w:color="000000" w:sz="4" w:space="0"/>
+          <w:bottom w:val="none" w:color="000000" w:sz="4" w:space="0"/>
           <w:right w:val="single" w:color="000000" w:themeColor="accent3" w:themeTint="FE" w:sz="4" w:space="0"/>
         </w:tcBorders>
       </w:tcPr>
@@ -12702,10 +12825,10 @@
       <w:tcPr>
         <w:shd w:val="clear" w:color="ffffff" w:themeColor="light1" w:fill="ffffff" w:themeFill="light1"/>
         <w:tcBorders>
-          <w:top w:val="none"/>
-          <w:left w:val="none"/>
+          <w:top w:val="none" w:color="000000" w:sz="4" w:space="0"/>
+          <w:left w:val="none" w:color="000000" w:sz="4" w:space="0"/>
           <w:bottom w:val="single" w:color="000000" w:themeColor="accent3" w:themeTint="FE" w:sz="4" w:space="0"/>
-          <w:right w:val="none"/>
+          <w:right w:val="none" w:color="000000" w:sz="4" w:space="0"/>
         </w:tcBorders>
       </w:tcPr>
     </w:tblStylePr>
@@ -12725,12 +12848,12 @@
         <w:tblBorders/>
       </w:tblPr>
       <w:tcPr>
-        <w:shd w:color="ffffff"/>
+        <w:shd w:val="clear" w:color="ffffff"/>
         <w:tcBorders>
-          <w:top w:val="none"/>
+          <w:top w:val="none" w:color="000000" w:sz="4" w:space="0"/>
           <w:left w:val="single" w:color="000000" w:themeColor="accent3" w:themeTint="FE" w:sz="4" w:space="0"/>
-          <w:bottom w:val="none"/>
-          <w:right w:val="none"/>
+          <w:bottom w:val="none" w:color="000000" w:sz="4" w:space="0"/>
+          <w:right w:val="none" w:color="000000" w:sz="4" w:space="0"/>
         </w:tcBorders>
       </w:tcPr>
     </w:tblStylePr>
@@ -12753,9 +12876,9 @@
         <w:shd w:val="clear" w:color="ffffff" w:themeColor="light1" w:fill="ffffff" w:themeFill="light1"/>
         <w:tcBorders>
           <w:top w:val="single" w:color="000000" w:themeColor="accent3" w:themeTint="FE" w:sz="4" w:space="0"/>
-          <w:left w:val="none"/>
-          <w:bottom w:val="none"/>
-          <w:right w:val="none"/>
+          <w:left w:val="none" w:color="000000" w:sz="4" w:space="0"/>
+          <w:bottom w:val="none" w:color="000000" w:sz="4" w:space="0"/>
+          <w:right w:val="none" w:color="000000" w:sz="4" w:space="0"/>
         </w:tcBorders>
       </w:tcPr>
     </w:tblStylePr>
@@ -12825,9 +12948,9 @@
       </w:tcPr>
     </w:tblStylePr>
   </w:style>
-  <w:style w:type="table" w:styleId="65">
+  <w:style w:type="table" w:styleId="788">
     <w:name w:val="Grid Table 7 Colorful - Accent 4"/>
-    <w:basedOn w:val="665"/>
+    <w:basedOn w:val="921"/>
     <w:uiPriority w:val="99"/>
     <w:pPr>
       <w:pBdr/>
@@ -12929,11 +13052,11 @@
         <w:tblBorders/>
       </w:tblPr>
       <w:tcPr>
-        <w:shd w:color="ffffff"/>
+        <w:shd w:val="clear" w:color="ffffff"/>
         <w:tcBorders>
-          <w:top w:val="none"/>
-          <w:left w:val="none"/>
-          <w:bottom w:val="none"/>
+          <w:top w:val="none" w:color="000000" w:sz="4" w:space="0"/>
+          <w:left w:val="none" w:color="000000" w:sz="4" w:space="0"/>
+          <w:bottom w:val="none" w:color="000000" w:sz="4" w:space="0"/>
           <w:right w:val="single" w:color="000000" w:themeColor="accent4" w:themeTint="9A" w:sz="4" w:space="0"/>
         </w:tcBorders>
       </w:tcPr>
@@ -12956,10 +13079,10 @@
       <w:tcPr>
         <w:shd w:val="clear" w:color="ffffff" w:themeColor="light1" w:fill="ffffff" w:themeFill="light1"/>
         <w:tcBorders>
-          <w:top w:val="none"/>
-          <w:left w:val="none"/>
+          <w:top w:val="none" w:color="000000" w:sz="4" w:space="0"/>
+          <w:left w:val="none" w:color="000000" w:sz="4" w:space="0"/>
           <w:bottom w:val="single" w:color="000000" w:themeColor="accent4" w:themeTint="9A" w:sz="4" w:space="0"/>
-          <w:right w:val="none"/>
+          <w:right w:val="none" w:color="000000" w:sz="4" w:space="0"/>
         </w:tcBorders>
       </w:tcPr>
     </w:tblStylePr>
@@ -12979,12 +13102,12 @@
         <w:tblBorders/>
       </w:tblPr>
       <w:tcPr>
-        <w:shd w:color="ffffff"/>
+        <w:shd w:val="clear" w:color="ffffff"/>
         <w:tcBorders>
-          <w:top w:val="none"/>
+          <w:top w:val="none" w:color="000000" w:sz="4" w:space="0"/>
           <w:left w:val="single" w:color="000000" w:themeColor="accent4" w:themeTint="9A" w:sz="4" w:space="0"/>
-          <w:bottom w:val="none"/>
-          <w:right w:val="none"/>
+          <w:bottom w:val="none" w:color="000000" w:sz="4" w:space="0"/>
+          <w:right w:val="none" w:color="000000" w:sz="4" w:space="0"/>
         </w:tcBorders>
       </w:tcPr>
     </w:tblStylePr>
@@ -13007,9 +13130,9 @@
         <w:shd w:val="clear" w:color="ffffff" w:themeColor="light1" w:fill="ffffff" w:themeFill="light1"/>
         <w:tcBorders>
           <w:top w:val="single" w:color="000000" w:themeColor="accent4" w:themeTint="9A" w:sz="4" w:space="0"/>
-          <w:left w:val="none"/>
-          <w:bottom w:val="none"/>
-          <w:right w:val="none"/>
+          <w:left w:val="none" w:color="000000" w:sz="4" w:space="0"/>
+          <w:bottom w:val="none" w:color="000000" w:sz="4" w:space="0"/>
+          <w:right w:val="none" w:color="000000" w:sz="4" w:space="0"/>
         </w:tcBorders>
       </w:tcPr>
     </w:tblStylePr>
@@ -13079,9 +13202,9 @@
       </w:tcPr>
     </w:tblStylePr>
   </w:style>
-  <w:style w:type="table" w:styleId="66">
+  <w:style w:type="table" w:styleId="789">
     <w:name w:val="Grid Table 7 Colorful - Accent 5"/>
-    <w:basedOn w:val="665"/>
+    <w:basedOn w:val="921"/>
     <w:uiPriority w:val="99"/>
     <w:pPr>
       <w:pBdr/>
@@ -13183,11 +13306,11 @@
         <w:tblBorders/>
       </w:tblPr>
       <w:tcPr>
-        <w:shd w:color="ffffff"/>
+        <w:shd w:val="clear" w:color="ffffff"/>
         <w:tcBorders>
-          <w:top w:val="none"/>
-          <w:left w:val="none"/>
-          <w:bottom w:val="none"/>
+          <w:top w:val="none" w:color="000000" w:sz="4" w:space="0"/>
+          <w:left w:val="none" w:color="000000" w:sz="4" w:space="0"/>
+          <w:bottom w:val="none" w:color="000000" w:sz="4" w:space="0"/>
           <w:right w:val="single" w:color="000000" w:themeColor="accent5" w:themeTint="90" w:sz="4" w:space="0"/>
         </w:tcBorders>
       </w:tcPr>
@@ -13210,10 +13333,10 @@
       <w:tcPr>
         <w:shd w:val="clear" w:color="ffffff" w:themeColor="light1" w:fill="ffffff" w:themeFill="light1"/>
         <w:tcBorders>
-          <w:top w:val="none"/>
-          <w:left w:val="none"/>
+          <w:top w:val="none" w:color="000000" w:sz="4" w:space="0"/>
+          <w:left w:val="none" w:color="000000" w:sz="4" w:space="0"/>
           <w:bottom w:val="single" w:color="000000" w:themeColor="accent5" w:themeTint="90" w:sz="4" w:space="0"/>
-          <w:right w:val="none"/>
+          <w:right w:val="none" w:color="000000" w:sz="4" w:space="0"/>
         </w:tcBorders>
       </w:tcPr>
     </w:tblStylePr>
@@ -13233,12 +13356,12 @@
         <w:tblBorders/>
       </w:tblPr>
       <w:tcPr>
-        <w:shd w:color="ffffff"/>
+        <w:shd w:val="clear" w:color="ffffff"/>
         <w:tcBorders>
-          <w:top w:val="none"/>
+          <w:top w:val="none" w:color="000000" w:sz="4" w:space="0"/>
           <w:left w:val="single" w:color="000000" w:themeColor="accent5" w:themeTint="90" w:sz="4" w:space="0"/>
-          <w:bottom w:val="none"/>
-          <w:right w:val="none"/>
+          <w:bottom w:val="none" w:color="000000" w:sz="4" w:space="0"/>
+          <w:right w:val="none" w:color="000000" w:sz="4" w:space="0"/>
         </w:tcBorders>
       </w:tcPr>
     </w:tblStylePr>
@@ -13261,9 +13384,9 @@
         <w:shd w:val="clear" w:color="ffffff" w:themeColor="light1" w:fill="ffffff" w:themeFill="light1"/>
         <w:tcBorders>
           <w:top w:val="single" w:color="000000" w:themeColor="accent5" w:themeTint="90" w:sz="4" w:space="0"/>
-          <w:left w:val="none"/>
-          <w:bottom w:val="none"/>
-          <w:right w:val="none"/>
+          <w:left w:val="none" w:color="000000" w:sz="4" w:space="0"/>
+          <w:bottom w:val="none" w:color="000000" w:sz="4" w:space="0"/>
+          <w:right w:val="none" w:color="000000" w:sz="4" w:space="0"/>
         </w:tcBorders>
       </w:tcPr>
     </w:tblStylePr>
@@ -13333,9 +13456,9 @@
       </w:tcPr>
     </w:tblStylePr>
   </w:style>
-  <w:style w:type="table" w:styleId="67">
+  <w:style w:type="table" w:styleId="790">
     <w:name w:val="Grid Table 7 Colorful - Accent 6"/>
-    <w:basedOn w:val="665"/>
+    <w:basedOn w:val="921"/>
     <w:uiPriority w:val="99"/>
     <w:pPr>
       <w:pBdr/>
@@ -13437,11 +13560,11 @@
         <w:tblBorders/>
       </w:tblPr>
       <w:tcPr>
-        <w:shd w:color="ffffff"/>
+        <w:shd w:val="clear" w:color="ffffff"/>
         <w:tcBorders>
-          <w:top w:val="none"/>
-          <w:left w:val="none"/>
-          <w:bottom w:val="none"/>
+          <w:top w:val="none" w:color="000000" w:sz="4" w:space="0"/>
+          <w:left w:val="none" w:color="000000" w:sz="4" w:space="0"/>
+          <w:bottom w:val="none" w:color="000000" w:sz="4" w:space="0"/>
           <w:right w:val="single" w:color="000000" w:themeColor="accent6" w:themeTint="90" w:sz="4" w:space="0"/>
         </w:tcBorders>
       </w:tcPr>
@@ -13464,10 +13587,10 @@
       <w:tcPr>
         <w:shd w:val="clear" w:color="ffffff" w:themeColor="light1" w:fill="ffffff" w:themeFill="light1"/>
         <w:tcBorders>
-          <w:top w:val="none"/>
-          <w:left w:val="none"/>
+          <w:top w:val="none" w:color="000000" w:sz="4" w:space="0"/>
+          <w:left w:val="none" w:color="000000" w:sz="4" w:space="0"/>
           <w:bottom w:val="single" w:color="000000" w:themeColor="accent6" w:themeTint="90" w:sz="4" w:space="0"/>
-          <w:right w:val="none"/>
+          <w:right w:val="none" w:color="000000" w:sz="4" w:space="0"/>
         </w:tcBorders>
       </w:tcPr>
     </w:tblStylePr>
@@ -13487,12 +13610,12 @@
         <w:tblBorders/>
       </w:tblPr>
       <w:tcPr>
-        <w:shd w:color="ffffff"/>
+        <w:shd w:val="clear" w:color="ffffff"/>
         <w:tcBorders>
-          <w:top w:val="none"/>
+          <w:top w:val="none" w:color="000000" w:sz="4" w:space="0"/>
           <w:left w:val="single" w:color="000000" w:themeColor="accent6" w:themeTint="90" w:sz="4" w:space="0"/>
-          <w:bottom w:val="none"/>
-          <w:right w:val="none"/>
+          <w:bottom w:val="none" w:color="000000" w:sz="4" w:space="0"/>
+          <w:right w:val="none" w:color="000000" w:sz="4" w:space="0"/>
         </w:tcBorders>
       </w:tcPr>
     </w:tblStylePr>
@@ -13515,9 +13638,9 @@
         <w:shd w:val="clear" w:color="ffffff" w:themeColor="light1" w:fill="ffffff" w:themeFill="light1"/>
         <w:tcBorders>
           <w:top w:val="single" w:color="000000" w:themeColor="accent6" w:themeTint="90" w:sz="4" w:space="0"/>
-          <w:left w:val="none"/>
-          <w:bottom w:val="none"/>
-          <w:right w:val="none"/>
+          <w:left w:val="none" w:color="000000" w:sz="4" w:space="0"/>
+          <w:bottom w:val="none" w:color="000000" w:sz="4" w:space="0"/>
+          <w:right w:val="none" w:color="000000" w:sz="4" w:space="0"/>
         </w:tcBorders>
       </w:tcPr>
     </w:tblStylePr>
@@ -13587,9 +13710,9 @@
       </w:tcPr>
     </w:tblStylePr>
   </w:style>
-  <w:style w:type="table" w:styleId="68">
+  <w:style w:type="table" w:styleId="791">
     <w:name w:val="List Table 1 Light"/>
-    <w:basedOn w:val="665"/>
+    <w:basedOn w:val="921"/>
     <w:uiPriority w:val="99"/>
     <w:pPr>
       <w:pBdr/>
@@ -13803,9 +13926,9 @@
       </w:tcPr>
     </w:tblStylePr>
   </w:style>
-  <w:style w:type="table" w:styleId="69">
+  <w:style w:type="table" w:styleId="792">
     <w:name w:val="List Table 1 Light - Accent 1"/>
-    <w:basedOn w:val="665"/>
+    <w:basedOn w:val="921"/>
     <w:uiPriority w:val="99"/>
     <w:pPr>
       <w:pBdr/>
@@ -14019,9 +14142,9 @@
       </w:tcPr>
     </w:tblStylePr>
   </w:style>
-  <w:style w:type="table" w:styleId="70">
+  <w:style w:type="table" w:styleId="793">
     <w:name w:val="List Table 1 Light - Accent 2"/>
-    <w:basedOn w:val="665"/>
+    <w:basedOn w:val="921"/>
     <w:uiPriority w:val="99"/>
     <w:pPr>
       <w:pBdr/>
@@ -14235,9 +14358,9 @@
       </w:tcPr>
     </w:tblStylePr>
   </w:style>
-  <w:style w:type="table" w:styleId="71">
+  <w:style w:type="table" w:styleId="794">
     <w:name w:val="List Table 1 Light - Accent 3"/>
-    <w:basedOn w:val="665"/>
+    <w:basedOn w:val="921"/>
     <w:uiPriority w:val="99"/>
     <w:pPr>
       <w:pBdr/>
@@ -14451,9 +14574,9 @@
       </w:tcPr>
     </w:tblStylePr>
   </w:style>
-  <w:style w:type="table" w:styleId="72">
+  <w:style w:type="table" w:styleId="795">
     <w:name w:val="List Table 1 Light - Accent 4"/>
-    <w:basedOn w:val="665"/>
+    <w:basedOn w:val="921"/>
     <w:uiPriority w:val="99"/>
     <w:pPr>
       <w:pBdr/>
@@ -14667,9 +14790,9 @@
       </w:tcPr>
     </w:tblStylePr>
   </w:style>
-  <w:style w:type="table" w:styleId="73">
+  <w:style w:type="table" w:styleId="796">
     <w:name w:val="List Table 1 Light - Accent 5"/>
-    <w:basedOn w:val="665"/>
+    <w:basedOn w:val="921"/>
     <w:uiPriority w:val="99"/>
     <w:pPr>
       <w:pBdr/>
@@ -14883,9 +15006,9 @@
       </w:tcPr>
     </w:tblStylePr>
   </w:style>
-  <w:style w:type="table" w:styleId="74">
+  <w:style w:type="table" w:styleId="797">
     <w:name w:val="List Table 1 Light - Accent 6"/>
-    <w:basedOn w:val="665"/>
+    <w:basedOn w:val="921"/>
     <w:uiPriority w:val="99"/>
     <w:pPr>
       <w:pBdr/>
@@ -15099,9 +15222,9 @@
       </w:tcPr>
     </w:tblStylePr>
   </w:style>
-  <w:style w:type="table" w:styleId="75">
+  <w:style w:type="table" w:styleId="798">
     <w:name w:val="List Table 2"/>
-    <w:basedOn w:val="665"/>
+    <w:basedOn w:val="921"/>
     <w:uiPriority w:val="99"/>
     <w:pPr>
       <w:pBdr/>
@@ -15337,9 +15460,9 @@
       </w:tcPr>
     </w:tblStylePr>
   </w:style>
-  <w:style w:type="table" w:styleId="76">
+  <w:style w:type="table" w:styleId="799">
     <w:name w:val="List Table 2 - Accent 1"/>
-    <w:basedOn w:val="665"/>
+    <w:basedOn w:val="921"/>
     <w:uiPriority w:val="99"/>
     <w:pPr>
       <w:pBdr/>
@@ -15575,9 +15698,9 @@
       </w:tcPr>
     </w:tblStylePr>
   </w:style>
-  <w:style w:type="table" w:styleId="77">
+  <w:style w:type="table" w:styleId="800">
     <w:name w:val="List Table 2 - Accent 2"/>
-    <w:basedOn w:val="665"/>
+    <w:basedOn w:val="921"/>
     <w:uiPriority w:val="99"/>
     <w:pPr>
       <w:pBdr/>
@@ -15813,9 +15936,9 @@
       </w:tcPr>
     </w:tblStylePr>
   </w:style>
-  <w:style w:type="table" w:styleId="78">
+  <w:style w:type="table" w:styleId="801">
     <w:name w:val="List Table 2 - Accent 3"/>
-    <w:basedOn w:val="665"/>
+    <w:basedOn w:val="921"/>
     <w:uiPriority w:val="99"/>
     <w:pPr>
       <w:pBdr/>
@@ -16051,9 +16174,9 @@
       </w:tcPr>
     </w:tblStylePr>
   </w:style>
-  <w:style w:type="table" w:styleId="79">
+  <w:style w:type="table" w:styleId="802">
     <w:name w:val="List Table 2 - Accent 4"/>
-    <w:basedOn w:val="665"/>
+    <w:basedOn w:val="921"/>
     <w:uiPriority w:val="99"/>
     <w:pPr>
       <w:pBdr/>
@@ -16289,9 +16412,9 @@
       </w:tcPr>
     </w:tblStylePr>
   </w:style>
-  <w:style w:type="table" w:styleId="80">
+  <w:style w:type="table" w:styleId="803">
     <w:name w:val="List Table 2 - Accent 5"/>
-    <w:basedOn w:val="665"/>
+    <w:basedOn w:val="921"/>
     <w:uiPriority w:val="99"/>
     <w:pPr>
       <w:pBdr/>
@@ -16527,9 +16650,9 @@
       </w:tcPr>
     </w:tblStylePr>
   </w:style>
-  <w:style w:type="table" w:styleId="81">
+  <w:style w:type="table" w:styleId="804">
     <w:name w:val="List Table 2 - Accent 6"/>
-    <w:basedOn w:val="665"/>
+    <w:basedOn w:val="921"/>
     <w:uiPriority w:val="99"/>
     <w:pPr>
       <w:pBdr/>
@@ -16765,9 +16888,9 @@
       </w:tcPr>
     </w:tblStylePr>
   </w:style>
-  <w:style w:type="table" w:styleId="82">
+  <w:style w:type="table" w:styleId="805">
     <w:name w:val="List Table 3"/>
-    <w:basedOn w:val="665"/>
+    <w:basedOn w:val="921"/>
     <w:uiPriority w:val="99"/>
     <w:pPr>
       <w:pBdr/>
@@ -16993,9 +17116,9 @@
       </w:tcPr>
     </w:tblStylePr>
   </w:style>
-  <w:style w:type="table" w:styleId="83">
+  <w:style w:type="table" w:styleId="806">
     <w:name w:val="List Table 3 - Accent 1"/>
-    <w:basedOn w:val="665"/>
+    <w:basedOn w:val="921"/>
     <w:uiPriority w:val="99"/>
     <w:pPr>
       <w:pBdr/>
@@ -17221,9 +17344,9 @@
       </w:tcPr>
     </w:tblStylePr>
   </w:style>
-  <w:style w:type="table" w:styleId="84">
+  <w:style w:type="table" w:styleId="807">
     <w:name w:val="List Table 3 - Accent 2"/>
-    <w:basedOn w:val="665"/>
+    <w:basedOn w:val="921"/>
     <w:uiPriority w:val="99"/>
     <w:pPr>
       <w:pBdr/>
@@ -17449,9 +17572,9 @@
       </w:tcPr>
     </w:tblStylePr>
   </w:style>
-  <w:style w:type="table" w:styleId="85">
+  <w:style w:type="table" w:styleId="808">
     <w:name w:val="List Table 3 - Accent 3"/>
-    <w:basedOn w:val="665"/>
+    <w:basedOn w:val="921"/>
     <w:uiPriority w:val="99"/>
     <w:pPr>
       <w:pBdr/>
@@ -17677,9 +17800,9 @@
       </w:tcPr>
     </w:tblStylePr>
   </w:style>
-  <w:style w:type="table" w:styleId="86">
+  <w:style w:type="table" w:styleId="809">
     <w:name w:val="List Table 3 - Accent 4"/>
-    <w:basedOn w:val="665"/>
+    <w:basedOn w:val="921"/>
     <w:uiPriority w:val="99"/>
     <w:pPr>
       <w:pBdr/>
@@ -17905,9 +18028,9 @@
       </w:tcPr>
     </w:tblStylePr>
   </w:style>
-  <w:style w:type="table" w:styleId="87">
+  <w:style w:type="table" w:styleId="810">
     <w:name w:val="List Table 3 - Accent 5"/>
-    <w:basedOn w:val="665"/>
+    <w:basedOn w:val="921"/>
     <w:uiPriority w:val="99"/>
     <w:pPr>
       <w:pBdr/>
@@ -18133,9 +18256,9 @@
       </w:tcPr>
     </w:tblStylePr>
   </w:style>
-  <w:style w:type="table" w:styleId="88">
+  <w:style w:type="table" w:styleId="811">
     <w:name w:val="List Table 3 - Accent 6"/>
-    <w:basedOn w:val="665"/>
+    <w:basedOn w:val="921"/>
     <w:uiPriority w:val="99"/>
     <w:pPr>
       <w:pBdr/>
@@ -18361,9 +18484,9 @@
       </w:tcPr>
     </w:tblStylePr>
   </w:style>
-  <w:style w:type="table" w:styleId="89">
+  <w:style w:type="table" w:styleId="812">
     <w:name w:val="List Table 4"/>
-    <w:basedOn w:val="665"/>
+    <w:basedOn w:val="921"/>
     <w:uiPriority w:val="99"/>
     <w:pPr>
       <w:pBdr/>
@@ -18586,9 +18709,9 @@
       </w:tcPr>
     </w:tblStylePr>
   </w:style>
-  <w:style w:type="table" w:styleId="90">
+  <w:style w:type="table" w:styleId="813">
     <w:name w:val="List Table 4 - Accent 1"/>
-    <w:basedOn w:val="665"/>
+    <w:basedOn w:val="921"/>
     <w:uiPriority w:val="99"/>
     <w:pPr>
       <w:pBdr/>
@@ -18811,9 +18934,9 @@
       </w:tcPr>
     </w:tblStylePr>
   </w:style>
-  <w:style w:type="table" w:styleId="91">
+  <w:style w:type="table" w:styleId="814">
     <w:name w:val="List Table 4 - Accent 2"/>
-    <w:basedOn w:val="665"/>
+    <w:basedOn w:val="921"/>
     <w:uiPriority w:val="99"/>
     <w:pPr>
       <w:pBdr/>
@@ -19036,9 +19159,9 @@
       </w:tcPr>
     </w:tblStylePr>
   </w:style>
-  <w:style w:type="table" w:styleId="92">
+  <w:style w:type="table" w:styleId="815">
     <w:name w:val="List Table 4 - Accent 3"/>
-    <w:basedOn w:val="665"/>
+    <w:basedOn w:val="921"/>
     <w:uiPriority w:val="99"/>
     <w:pPr>
       <w:pBdr/>
@@ -19261,9 +19384,9 @@
       </w:tcPr>
     </w:tblStylePr>
   </w:style>
-  <w:style w:type="table" w:styleId="93">
+  <w:style w:type="table" w:styleId="816">
     <w:name w:val="List Table 4 - Accent 4"/>
-    <w:basedOn w:val="665"/>
+    <w:basedOn w:val="921"/>
     <w:uiPriority w:val="99"/>
     <w:pPr>
       <w:pBdr/>
@@ -19486,9 +19609,9 @@
       </w:tcPr>
     </w:tblStylePr>
   </w:style>
-  <w:style w:type="table" w:styleId="94">
+  <w:style w:type="table" w:styleId="817">
     <w:name w:val="List Table 4 - Accent 5"/>
-    <w:basedOn w:val="665"/>
+    <w:basedOn w:val="921"/>
     <w:uiPriority w:val="99"/>
     <w:pPr>
       <w:pBdr/>
@@ -19711,9 +19834,9 @@
       </w:tcPr>
     </w:tblStylePr>
   </w:style>
-  <w:style w:type="table" w:styleId="95">
+  <w:style w:type="table" w:styleId="818">
     <w:name w:val="List Table 4 - Accent 6"/>
-    <w:basedOn w:val="665"/>
+    <w:basedOn w:val="921"/>
     <w:uiPriority w:val="99"/>
     <w:pPr>
       <w:pBdr/>
@@ -19936,9 +20059,9 @@
       </w:tcPr>
     </w:tblStylePr>
   </w:style>
-  <w:style w:type="table" w:styleId="96">
+  <w:style w:type="table" w:styleId="819">
     <w:name w:val="List Table 5 Dark"/>
-    <w:basedOn w:val="665"/>
+    <w:basedOn w:val="921"/>
     <w:uiPriority w:val="99"/>
     <w:pPr>
       <w:pBdr/>
@@ -20178,9 +20301,9 @@
       </w:tcPr>
     </w:tblStylePr>
   </w:style>
-  <w:style w:type="table" w:styleId="97">
+  <w:style w:type="table" w:styleId="820">
     <w:name w:val="List Table 5 Dark - Accent 1"/>
-    <w:basedOn w:val="665"/>
+    <w:basedOn w:val="921"/>
     <w:uiPriority w:val="99"/>
     <w:pPr>
       <w:pBdr/>
@@ -20420,9 +20543,9 @@
       </w:tcPr>
     </w:tblStylePr>
   </w:style>
-  <w:style w:type="table" w:styleId="98">
+  <w:style w:type="table" w:styleId="821">
     <w:name w:val="List Table 5 Dark - Accent 2"/>
-    <w:basedOn w:val="665"/>
+    <w:basedOn w:val="921"/>
     <w:uiPriority w:val="99"/>
     <w:pPr>
       <w:pBdr/>
@@ -20662,9 +20785,9 @@
       </w:tcPr>
     </w:tblStylePr>
   </w:style>
-  <w:style w:type="table" w:styleId="99">
+  <w:style w:type="table" w:styleId="822">
     <w:name w:val="List Table 5 Dark - Accent 3"/>
-    <w:basedOn w:val="665"/>
+    <w:basedOn w:val="921"/>
     <w:uiPriority w:val="99"/>
     <w:pPr>
       <w:pBdr/>
@@ -20904,9 +21027,9 @@
       </w:tcPr>
     </w:tblStylePr>
   </w:style>
-  <w:style w:type="table" w:styleId="100">
+  <w:style w:type="table" w:styleId="823">
     <w:name w:val="List Table 5 Dark - Accent 4"/>
-    <w:basedOn w:val="665"/>
+    <w:basedOn w:val="921"/>
     <w:uiPriority w:val="99"/>
     <w:pPr>
       <w:pBdr/>
@@ -21146,9 +21269,9 @@
       </w:tcPr>
     </w:tblStylePr>
   </w:style>
-  <w:style w:type="table" w:styleId="101">
+  <w:style w:type="table" w:styleId="824">
     <w:name w:val="List Table 5 Dark - Accent 5"/>
-    <w:basedOn w:val="665"/>
+    <w:basedOn w:val="921"/>
     <w:uiPriority w:val="99"/>
     <w:pPr>
       <w:pBdr/>
@@ -21388,9 +21511,9 @@
       </w:tcPr>
     </w:tblStylePr>
   </w:style>
-  <w:style w:type="table" w:styleId="102">
+  <w:style w:type="table" w:styleId="825">
     <w:name w:val="List Table 5 Dark - Accent 6"/>
-    <w:basedOn w:val="665"/>
+    <w:basedOn w:val="921"/>
     <w:uiPriority w:val="99"/>
     <w:pPr>
       <w:pBdr/>
@@ -21630,9 +21753,9 @@
       </w:tcPr>
     </w:tblStylePr>
   </w:style>
-  <w:style w:type="table" w:styleId="103">
+  <w:style w:type="table" w:styleId="826">
     <w:name w:val="List Table 6 Colorful"/>
-    <w:basedOn w:val="665"/>
+    <w:basedOn w:val="921"/>
     <w:uiPriority w:val="99"/>
     <w:pPr>
       <w:pBdr/>
@@ -21853,9 +21976,9 @@
       </w:tcPr>
     </w:tblStylePr>
   </w:style>
-  <w:style w:type="table" w:styleId="104">
+  <w:style w:type="table" w:styleId="827">
     <w:name w:val="List Table 6 Colorful - Accent 1"/>
-    <w:basedOn w:val="665"/>
+    <w:basedOn w:val="921"/>
     <w:uiPriority w:val="99"/>
     <w:pPr>
       <w:pBdr/>
@@ -22076,9 +22199,9 @@
       </w:tcPr>
     </w:tblStylePr>
   </w:style>
-  <w:style w:type="table" w:styleId="105">
+  <w:style w:type="table" w:styleId="828">
     <w:name w:val="List Table 6 Colorful - Accent 2"/>
-    <w:basedOn w:val="665"/>
+    <w:basedOn w:val="921"/>
     <w:uiPriority w:val="99"/>
     <w:pPr>
       <w:pBdr/>
@@ -22299,9 +22422,9 @@
       </w:tcPr>
     </w:tblStylePr>
   </w:style>
-  <w:style w:type="table" w:styleId="106">
+  <w:style w:type="table" w:styleId="829">
     <w:name w:val="List Table 6 Colorful - Accent 3"/>
-    <w:basedOn w:val="665"/>
+    <w:basedOn w:val="921"/>
     <w:uiPriority w:val="99"/>
     <w:pPr>
       <w:pBdr/>
@@ -22522,9 +22645,9 @@
       </w:tcPr>
     </w:tblStylePr>
   </w:style>
-  <w:style w:type="table" w:styleId="107">
+  <w:style w:type="table" w:styleId="830">
     <w:name w:val="List Table 6 Colorful - Accent 4"/>
-    <w:basedOn w:val="665"/>
+    <w:basedOn w:val="921"/>
     <w:uiPriority w:val="99"/>
     <w:pPr>
       <w:pBdr/>
@@ -22745,9 +22868,9 @@
       </w:tcPr>
     </w:tblStylePr>
   </w:style>
-  <w:style w:type="table" w:styleId="108">
+  <w:style w:type="table" w:styleId="831">
     <w:name w:val="List Table 6 Colorful - Accent 5"/>
-    <w:basedOn w:val="665"/>
+    <w:basedOn w:val="921"/>
     <w:uiPriority w:val="99"/>
     <w:pPr>
       <w:pBdr/>
@@ -22968,9 +23091,9 @@
       </w:tcPr>
     </w:tblStylePr>
   </w:style>
-  <w:style w:type="table" w:styleId="109">
+  <w:style w:type="table" w:styleId="832">
     <w:name w:val="List Table 6 Colorful - Accent 6"/>
-    <w:basedOn w:val="665"/>
+    <w:basedOn w:val="921"/>
     <w:uiPriority w:val="99"/>
     <w:pPr>
       <w:pBdr/>
@@ -23191,9 +23314,9 @@
       </w:tcPr>
     </w:tblStylePr>
   </w:style>
-  <w:style w:type="table" w:styleId="110">
+  <w:style w:type="table" w:styleId="833">
     <w:name w:val="List Table 7 Colorful"/>
-    <w:basedOn w:val="665"/>
+    <w:basedOn w:val="921"/>
     <w:uiPriority w:val="99"/>
     <w:pPr>
       <w:pBdr/>
@@ -23292,11 +23415,11 @@
         <w:tblBorders/>
       </w:tblPr>
       <w:tcPr>
-        <w:shd w:color="ffffff"/>
+        <w:shd w:val="clear" w:color="ffffff"/>
         <w:tcBorders>
-          <w:top w:val="none"/>
-          <w:left w:val="none"/>
-          <w:bottom w:val="none"/>
+          <w:top w:val="none" w:color="000000" w:sz="4" w:space="0"/>
+          <w:left w:val="none" w:color="000000" w:sz="4" w:space="0"/>
+          <w:bottom w:val="none" w:color="000000" w:sz="4" w:space="0"/>
           <w:right w:val="single" w:color="000000" w:themeColor="text1" w:themeTint="80" w:sz="4" w:space="0"/>
         </w:tcBorders>
       </w:tcPr>
@@ -23319,10 +23442,10 @@
       <w:tcPr>
         <w:shd w:val="clear" w:color="ffffff" w:themeColor="light1" w:fill="ffffff" w:themeFill="light1"/>
         <w:tcBorders>
-          <w:top w:val="none"/>
-          <w:left w:val="none"/>
+          <w:top w:val="none" w:color="000000" w:sz="4" w:space="0"/>
+          <w:left w:val="none" w:color="000000" w:sz="4" w:space="0"/>
           <w:bottom w:val="single" w:color="000000" w:themeColor="text1" w:themeTint="80" w:sz="4" w:space="0"/>
-          <w:right w:val="none"/>
+          <w:right w:val="none" w:color="000000" w:sz="4" w:space="0"/>
         </w:tcBorders>
       </w:tcPr>
     </w:tblStylePr>
@@ -23342,12 +23465,12 @@
         <w:tblBorders/>
       </w:tblPr>
       <w:tcPr>
-        <w:shd w:color="ffffff"/>
+        <w:shd w:val="clear" w:color="ffffff"/>
         <w:tcBorders>
-          <w:top w:val="none"/>
+          <w:top w:val="none" w:color="000000" w:sz="4" w:space="0"/>
           <w:left w:val="single" w:color="000000" w:themeColor="text1" w:themeTint="80" w:sz="4" w:space="0"/>
-          <w:bottom w:val="none"/>
-          <w:right w:val="none"/>
+          <w:bottom w:val="none" w:color="000000" w:sz="4" w:space="0"/>
+          <w:right w:val="none" w:color="000000" w:sz="4" w:space="0"/>
         </w:tcBorders>
       </w:tcPr>
     </w:tblStylePr>
@@ -23370,9 +23493,9 @@
         <w:shd w:val="clear" w:color="ffffff" w:themeColor="light1" w:fill="ffffff" w:themeFill="light1"/>
         <w:tcBorders>
           <w:top w:val="single" w:color="000000" w:themeColor="text1" w:themeTint="80" w:sz="4" w:space="0"/>
-          <w:left w:val="none"/>
-          <w:bottom w:val="none"/>
-          <w:right w:val="none"/>
+          <w:left w:val="none" w:color="000000" w:sz="4" w:space="0"/>
+          <w:bottom w:val="none" w:color="000000" w:sz="4" w:space="0"/>
+          <w:right w:val="none" w:color="000000" w:sz="4" w:space="0"/>
         </w:tcBorders>
       </w:tcPr>
     </w:tblStylePr>
@@ -23447,9 +23570,9 @@
       </w:tcPr>
     </w:tblStylePr>
   </w:style>
-  <w:style w:type="table" w:styleId="111">
+  <w:style w:type="table" w:styleId="834">
     <w:name w:val="List Table 7 Colorful - Accent 1"/>
-    <w:basedOn w:val="665"/>
+    <w:basedOn w:val="921"/>
     <w:uiPriority w:val="99"/>
     <w:pPr>
       <w:pBdr/>
@@ -23548,11 +23671,11 @@
         <w:tblBorders/>
       </w:tblPr>
       <w:tcPr>
-        <w:shd w:color="ffffff"/>
+        <w:shd w:val="clear" w:color="ffffff"/>
         <w:tcBorders>
-          <w:top w:val="none"/>
-          <w:left w:val="none"/>
-          <w:bottom w:val="none"/>
+          <w:top w:val="none" w:color="000000" w:sz="4" w:space="0"/>
+          <w:left w:val="none" w:color="000000" w:sz="4" w:space="0"/>
+          <w:bottom w:val="none" w:color="000000" w:sz="4" w:space="0"/>
           <w:right w:val="single" w:color="000000" w:themeColor="accent1" w:sz="4" w:space="0"/>
         </w:tcBorders>
       </w:tcPr>
@@ -23575,10 +23698,10 @@
       <w:tcPr>
         <w:shd w:val="clear" w:color="ffffff" w:themeColor="light1" w:fill="ffffff" w:themeFill="light1"/>
         <w:tcBorders>
-          <w:top w:val="none"/>
-          <w:left w:val="none"/>
+          <w:top w:val="none" w:color="000000" w:sz="4" w:space="0"/>
+          <w:left w:val="none" w:color="000000" w:sz="4" w:space="0"/>
           <w:bottom w:val="single" w:color="000000" w:themeColor="accent1" w:sz="4" w:space="0"/>
-          <w:right w:val="none"/>
+          <w:right w:val="none" w:color="000000" w:sz="4" w:space="0"/>
         </w:tcBorders>
       </w:tcPr>
     </w:tblStylePr>
@@ -23598,12 +23721,12 @@
         <w:tblBorders/>
       </w:tblPr>
       <w:tcPr>
-        <w:shd w:color="ffffff"/>
+        <w:shd w:val="clear" w:color="ffffff"/>
         <w:tcBorders>
-          <w:top w:val="none"/>
+          <w:top w:val="none" w:color="000000" w:sz="4" w:space="0"/>
           <w:left w:val="single" w:color="000000" w:themeColor="accent1" w:sz="4" w:space="0"/>
-          <w:bottom w:val="none"/>
-          <w:right w:val="none"/>
+          <w:bottom w:val="none" w:color="000000" w:sz="4" w:space="0"/>
+          <w:right w:val="none" w:color="000000" w:sz="4" w:space="0"/>
         </w:tcBorders>
       </w:tcPr>
     </w:tblStylePr>
@@ -23626,9 +23749,9 @@
         <w:shd w:val="clear" w:color="ffffff" w:themeColor="light1" w:fill="ffffff" w:themeFill="light1"/>
         <w:tcBorders>
           <w:top w:val="single" w:color="000000" w:themeColor="accent1" w:sz="4" w:space="0"/>
-          <w:left w:val="none"/>
-          <w:bottom w:val="none"/>
-          <w:right w:val="none"/>
+          <w:left w:val="none" w:color="000000" w:sz="4" w:space="0"/>
+          <w:bottom w:val="none" w:color="000000" w:sz="4" w:space="0"/>
+          <w:right w:val="none" w:color="000000" w:sz="4" w:space="0"/>
         </w:tcBorders>
       </w:tcPr>
     </w:tblStylePr>
@@ -23703,9 +23826,9 @@
       </w:tcPr>
     </w:tblStylePr>
   </w:style>
-  <w:style w:type="table" w:styleId="112">
+  <w:style w:type="table" w:styleId="835">
     <w:name w:val="List Table 7 Colorful - Accent 2"/>
-    <w:basedOn w:val="665"/>
+    <w:basedOn w:val="921"/>
     <w:uiPriority w:val="99"/>
     <w:pPr>
       <w:pBdr/>
@@ -23804,11 +23927,11 @@
         <w:tblBorders/>
       </w:tblPr>
       <w:tcPr>
-        <w:shd w:color="ffffff"/>
+        <w:shd w:val="clear" w:color="ffffff"/>
         <w:tcBorders>
-          <w:top w:val="none"/>
-          <w:left w:val="none"/>
-          <w:bottom w:val="none"/>
+          <w:top w:val="none" w:color="000000" w:sz="4" w:space="0"/>
+          <w:left w:val="none" w:color="000000" w:sz="4" w:space="0"/>
+          <w:bottom w:val="none" w:color="000000" w:sz="4" w:space="0"/>
           <w:right w:val="single" w:color="000000" w:themeColor="accent2" w:themeTint="97" w:sz="4" w:space="0"/>
         </w:tcBorders>
       </w:tcPr>
@@ -23831,10 +23954,10 @@
       <w:tcPr>
         <w:shd w:val="clear" w:color="ffffff" w:themeColor="light1" w:fill="ffffff" w:themeFill="light1"/>
         <w:tcBorders>
-          <w:top w:val="none"/>
-          <w:left w:val="none"/>
+          <w:top w:val="none" w:color="000000" w:sz="4" w:space="0"/>
+          <w:left w:val="none" w:color="000000" w:sz="4" w:space="0"/>
           <w:bottom w:val="single" w:color="000000" w:themeColor="accent2" w:themeTint="97" w:sz="4" w:space="0"/>
-          <w:right w:val="none"/>
+          <w:right w:val="none" w:color="000000" w:sz="4" w:space="0"/>
         </w:tcBorders>
       </w:tcPr>
     </w:tblStylePr>
@@ -23854,12 +23977,12 @@
         <w:tblBorders/>
       </w:tblPr>
       <w:tcPr>
-        <w:shd w:color="ffffff"/>
+        <w:shd w:val="clear" w:color="ffffff"/>
         <w:tcBorders>
-          <w:top w:val="none"/>
+          <w:top w:val="none" w:color="000000" w:sz="4" w:space="0"/>
           <w:left w:val="single" w:color="000000" w:themeColor="accent2" w:themeTint="97" w:sz="4" w:space="0"/>
-          <w:bottom w:val="none"/>
-          <w:right w:val="none"/>
+          <w:bottom w:val="none" w:color="000000" w:sz="4" w:space="0"/>
+          <w:right w:val="none" w:color="000000" w:sz="4" w:space="0"/>
         </w:tcBorders>
       </w:tcPr>
     </w:tblStylePr>
@@ -23882,9 +24005,9 @@
         <w:shd w:val="clear" w:color="ffffff" w:themeColor="light1" w:fill="ffffff" w:themeFill="light1"/>
         <w:tcBorders>
           <w:top w:val="single" w:color="000000" w:themeColor="accent2" w:themeTint="97" w:sz="4" w:space="0"/>
-          <w:left w:val="none"/>
-          <w:bottom w:val="none"/>
-          <w:right w:val="none"/>
+          <w:left w:val="none" w:color="000000" w:sz="4" w:space="0"/>
+          <w:bottom w:val="none" w:color="000000" w:sz="4" w:space="0"/>
+          <w:right w:val="none" w:color="000000" w:sz="4" w:space="0"/>
         </w:tcBorders>
       </w:tcPr>
     </w:tblStylePr>
@@ -23959,9 +24082,9 @@
       </w:tcPr>
     </w:tblStylePr>
   </w:style>
-  <w:style w:type="table" w:styleId="113">
+  <w:style w:type="table" w:styleId="836">
     <w:name w:val="List Table 7 Colorful - Accent 3"/>
-    <w:basedOn w:val="665"/>
+    <w:basedOn w:val="921"/>
     <w:uiPriority w:val="99"/>
     <w:pPr>
       <w:pBdr/>
@@ -24060,11 +24183,11 @@
         <w:tblBorders/>
       </w:tblPr>
       <w:tcPr>
-        <w:shd w:color="ffffff"/>
+        <w:shd w:val="clear" w:color="ffffff"/>
         <w:tcBorders>
-          <w:top w:val="none"/>
-          <w:left w:val="none"/>
-          <w:bottom w:val="none"/>
+          <w:top w:val="none" w:color="000000" w:sz="4" w:space="0"/>
+          <w:left w:val="none" w:color="000000" w:sz="4" w:space="0"/>
+          <w:bottom w:val="none" w:color="000000" w:sz="4" w:space="0"/>
           <w:right w:val="single" w:color="000000" w:themeColor="accent3" w:themeTint="98" w:sz="4" w:space="0"/>
         </w:tcBorders>
       </w:tcPr>
@@ -24087,10 +24210,10 @@
       <w:tcPr>
         <w:shd w:val="clear" w:color="ffffff" w:themeColor="light1" w:fill="ffffff" w:themeFill="light1"/>
         <w:tcBorders>
-          <w:top w:val="none"/>
-          <w:left w:val="none"/>
+          <w:top w:val="none" w:color="000000" w:sz="4" w:space="0"/>
+          <w:left w:val="none" w:color="000000" w:sz="4" w:space="0"/>
           <w:bottom w:val="single" w:color="000000" w:themeColor="accent3" w:themeTint="98" w:sz="4" w:space="0"/>
-          <w:right w:val="none"/>
+          <w:right w:val="none" w:color="000000" w:sz="4" w:space="0"/>
         </w:tcBorders>
       </w:tcPr>
     </w:tblStylePr>
@@ -24110,12 +24233,12 @@
         <w:tblBorders/>
       </w:tblPr>
       <w:tcPr>
-        <w:shd w:color="ffffff"/>
+        <w:shd w:val="clear" w:color="ffffff"/>
         <w:tcBorders>
-          <w:top w:val="none"/>
+          <w:top w:val="none" w:color="000000" w:sz="4" w:space="0"/>
           <w:left w:val="single" w:color="000000" w:themeColor="accent3" w:themeTint="98" w:sz="4" w:space="0"/>
-          <w:bottom w:val="none"/>
-          <w:right w:val="none"/>
+          <w:bottom w:val="none" w:color="000000" w:sz="4" w:space="0"/>
+          <w:right w:val="none" w:color="000000" w:sz="4" w:space="0"/>
         </w:tcBorders>
       </w:tcPr>
     </w:tblStylePr>
@@ -24138,9 +24261,9 @@
         <w:shd w:val="clear" w:color="ffffff" w:themeColor="light1" w:fill="ffffff" w:themeFill="light1"/>
         <w:tcBorders>
           <w:top w:val="single" w:color="000000" w:themeColor="accent3" w:themeTint="98" w:sz="4" w:space="0"/>
-          <w:left w:val="none"/>
-          <w:bottom w:val="none"/>
-          <w:right w:val="none"/>
+          <w:left w:val="none" w:color="000000" w:sz="4" w:space="0"/>
+          <w:bottom w:val="none" w:color="000000" w:sz="4" w:space="0"/>
+          <w:right w:val="none" w:color="000000" w:sz="4" w:space="0"/>
         </w:tcBorders>
       </w:tcPr>
     </w:tblStylePr>
@@ -24215,9 +24338,9 @@
       </w:tcPr>
     </w:tblStylePr>
   </w:style>
-  <w:style w:type="table" w:styleId="114">
+  <w:style w:type="table" w:styleId="837">
     <w:name w:val="List Table 7 Colorful - Accent 4"/>
-    <w:basedOn w:val="665"/>
+    <w:basedOn w:val="921"/>
     <w:uiPriority w:val="99"/>
     <w:pPr>
       <w:pBdr/>
@@ -24316,11 +24439,11 @@
         <w:tblBorders/>
       </w:tblPr>
       <w:tcPr>
-        <w:shd w:color="ffffff"/>
+        <w:shd w:val="clear" w:color="ffffff"/>
         <w:tcBorders>
-          <w:top w:val="none"/>
-          <w:left w:val="none"/>
-          <w:bottom w:val="none"/>
+          <w:top w:val="none" w:color="000000" w:sz="4" w:space="0"/>
+          <w:left w:val="none" w:color="000000" w:sz="4" w:space="0"/>
+          <w:bottom w:val="none" w:color="000000" w:sz="4" w:space="0"/>
           <w:right w:val="single" w:color="000000" w:themeColor="accent4" w:themeTint="9A" w:sz="4" w:space="0"/>
         </w:tcBorders>
       </w:tcPr>
@@ -24343,10 +24466,10 @@
       <w:tcPr>
         <w:shd w:val="clear" w:color="ffffff" w:themeColor="light1" w:fill="ffffff" w:themeFill="light1"/>
         <w:tcBorders>
-          <w:top w:val="none"/>
-          <w:left w:val="none"/>
+          <w:top w:val="none" w:color="000000" w:sz="4" w:space="0"/>
+          <w:left w:val="none" w:color="000000" w:sz="4" w:space="0"/>
           <w:bottom w:val="single" w:color="000000" w:themeColor="accent4" w:themeTint="9A" w:sz="4" w:space="0"/>
-          <w:right w:val="none"/>
+          <w:right w:val="none" w:color="000000" w:sz="4" w:space="0"/>
         </w:tcBorders>
       </w:tcPr>
     </w:tblStylePr>
@@ -24366,12 +24489,12 @@
         <w:tblBorders/>
       </w:tblPr>
       <w:tcPr>
-        <w:shd w:color="ffffff"/>
+        <w:shd w:val="clear" w:color="ffffff"/>
         <w:tcBorders>
-          <w:top w:val="none"/>
+          <w:top w:val="none" w:color="000000" w:sz="4" w:space="0"/>
           <w:left w:val="single" w:color="000000" w:themeColor="accent4" w:themeTint="9A" w:sz="4" w:space="0"/>
-          <w:bottom w:val="none"/>
-          <w:right w:val="none"/>
+          <w:bottom w:val="none" w:color="000000" w:sz="4" w:space="0"/>
+          <w:right w:val="none" w:color="000000" w:sz="4" w:space="0"/>
         </w:tcBorders>
       </w:tcPr>
     </w:tblStylePr>
@@ -24394,9 +24517,9 @@
         <w:shd w:val="clear" w:color="ffffff" w:themeColor="light1" w:fill="ffffff" w:themeFill="light1"/>
         <w:tcBorders>
           <w:top w:val="single" w:color="000000" w:themeColor="accent4" w:themeTint="9A" w:sz="4" w:space="0"/>
-          <w:left w:val="none"/>
-          <w:bottom w:val="none"/>
-          <w:right w:val="none"/>
+          <w:left w:val="none" w:color="000000" w:sz="4" w:space="0"/>
+          <w:bottom w:val="none" w:color="000000" w:sz="4" w:space="0"/>
+          <w:right w:val="none" w:color="000000" w:sz="4" w:space="0"/>
         </w:tcBorders>
       </w:tcPr>
     </w:tblStylePr>
@@ -24471,9 +24594,9 @@
       </w:tcPr>
     </w:tblStylePr>
   </w:style>
-  <w:style w:type="table" w:styleId="115">
+  <w:style w:type="table" w:styleId="838">
     <w:name w:val="List Table 7 Colorful - Accent 5"/>
-    <w:basedOn w:val="665"/>
+    <w:basedOn w:val="921"/>
     <w:uiPriority w:val="99"/>
     <w:pPr>
       <w:pBdr/>
@@ -24572,11 +24695,11 @@
         <w:tblBorders/>
       </w:tblPr>
       <w:tcPr>
-        <w:shd w:color="ffffff"/>
+        <w:shd w:val="clear" w:color="ffffff"/>
         <w:tcBorders>
-          <w:top w:val="none"/>
-          <w:left w:val="none"/>
-          <w:bottom w:val="none"/>
+          <w:top w:val="none" w:color="000000" w:sz="4" w:space="0"/>
+          <w:left w:val="none" w:color="000000" w:sz="4" w:space="0"/>
+          <w:bottom w:val="none" w:color="000000" w:sz="4" w:space="0"/>
           <w:right w:val="single" w:color="000000" w:themeColor="accent5" w:themeTint="9A" w:sz="4" w:space="0"/>
         </w:tcBorders>
       </w:tcPr>
@@ -24599,10 +24722,10 @@
       <w:tcPr>
         <w:shd w:val="clear" w:color="ffffff" w:themeColor="light1" w:fill="ffffff" w:themeFill="light1"/>
         <w:tcBorders>
-          <w:top w:val="none"/>
-          <w:left w:val="none"/>
+          <w:top w:val="none" w:color="000000" w:sz="4" w:space="0"/>
+          <w:left w:val="none" w:color="000000" w:sz="4" w:space="0"/>
           <w:bottom w:val="single" w:color="000000" w:themeColor="accent5" w:themeTint="9A" w:sz="4" w:space="0"/>
-          <w:right w:val="none"/>
+          <w:right w:val="none" w:color="000000" w:sz="4" w:space="0"/>
         </w:tcBorders>
       </w:tcPr>
     </w:tblStylePr>
@@ -24622,12 +24745,12 @@
         <w:tblBorders/>
       </w:tblPr>
       <w:tcPr>
-        <w:shd w:color="ffffff"/>
+        <w:shd w:val="clear" w:color="ffffff"/>
         <w:tcBorders>
-          <w:top w:val="none"/>
+          <w:top w:val="none" w:color="000000" w:sz="4" w:space="0"/>
           <w:left w:val="single" w:color="000000" w:themeColor="accent5" w:themeTint="9A" w:sz="4" w:space="0"/>
-          <w:bottom w:val="none"/>
-          <w:right w:val="none"/>
+          <w:bottom w:val="none" w:color="000000" w:sz="4" w:space="0"/>
+          <w:right w:val="none" w:color="000000" w:sz="4" w:space="0"/>
         </w:tcBorders>
       </w:tcPr>
     </w:tblStylePr>
@@ -24650,9 +24773,9 @@
         <w:shd w:val="clear" w:color="ffffff" w:themeColor="light1" w:fill="ffffff" w:themeFill="light1"/>
         <w:tcBorders>
           <w:top w:val="single" w:color="000000" w:themeColor="accent5" w:themeTint="9A" w:sz="4" w:space="0"/>
-          <w:left w:val="none"/>
-          <w:bottom w:val="none"/>
-          <w:right w:val="none"/>
+          <w:left w:val="none" w:color="000000" w:sz="4" w:space="0"/>
+          <w:bottom w:val="none" w:color="000000" w:sz="4" w:space="0"/>
+          <w:right w:val="none" w:color="000000" w:sz="4" w:space="0"/>
         </w:tcBorders>
       </w:tcPr>
     </w:tblStylePr>
@@ -24727,9 +24850,9 @@
       </w:tcPr>
     </w:tblStylePr>
   </w:style>
-  <w:style w:type="table" w:styleId="116">
+  <w:style w:type="table" w:styleId="839">
     <w:name w:val="List Table 7 Colorful - Accent 6"/>
-    <w:basedOn w:val="665"/>
+    <w:basedOn w:val="921"/>
     <w:uiPriority w:val="99"/>
     <w:pPr>
       <w:pBdr/>
@@ -24828,11 +24951,11 @@
         <w:tblBorders/>
       </w:tblPr>
       <w:tcPr>
-        <w:shd w:color="ffffff"/>
+        <w:shd w:val="clear" w:color="ffffff"/>
         <w:tcBorders>
-          <w:top w:val="none"/>
-          <w:left w:val="none"/>
-          <w:bottom w:val="none"/>
+          <w:top w:val="none" w:color="000000" w:sz="4" w:space="0"/>
+          <w:left w:val="none" w:color="000000" w:sz="4" w:space="0"/>
+          <w:bottom w:val="none" w:color="000000" w:sz="4" w:space="0"/>
           <w:right w:val="single" w:color="000000" w:themeColor="accent6" w:themeTint="98" w:sz="4" w:space="0"/>
         </w:tcBorders>
       </w:tcPr>
@@ -24855,10 +24978,10 @@
       <w:tcPr>
         <w:shd w:val="clear" w:color="ffffff" w:themeColor="light1" w:fill="ffffff" w:themeFill="light1"/>
         <w:tcBorders>
-          <w:top w:val="none"/>
-          <w:left w:val="none"/>
+          <w:top w:val="none" w:color="000000" w:sz="4" w:space="0"/>
+          <w:left w:val="none" w:color="000000" w:sz="4" w:space="0"/>
           <w:bottom w:val="single" w:color="000000" w:themeColor="accent6" w:themeTint="98" w:sz="4" w:space="0"/>
-          <w:right w:val="none"/>
+          <w:right w:val="none" w:color="000000" w:sz="4" w:space="0"/>
         </w:tcBorders>
       </w:tcPr>
     </w:tblStylePr>
@@ -24878,12 +25001,12 @@
         <w:tblBorders/>
       </w:tblPr>
       <w:tcPr>
-        <w:shd w:color="ffffff"/>
+        <w:shd w:val="clear" w:color="ffffff"/>
         <w:tcBorders>
-          <w:top w:val="none"/>
+          <w:top w:val="none" w:color="000000" w:sz="4" w:space="0"/>
           <w:left w:val="single" w:color="000000" w:themeColor="accent6" w:themeTint="98" w:sz="4" w:space="0"/>
-          <w:bottom w:val="none"/>
-          <w:right w:val="none"/>
+          <w:bottom w:val="none" w:color="000000" w:sz="4" w:space="0"/>
+          <w:right w:val="none" w:color="000000" w:sz="4" w:space="0"/>
         </w:tcBorders>
       </w:tcPr>
     </w:tblStylePr>
@@ -24906,9 +25029,9 @@
         <w:shd w:val="clear" w:color="ffffff" w:themeColor="light1" w:fill="ffffff" w:themeFill="light1"/>
         <w:tcBorders>
           <w:top w:val="single" w:color="000000" w:themeColor="accent6" w:themeTint="98" w:sz="4" w:space="0"/>
-          <w:left w:val="none"/>
-          <w:bottom w:val="none"/>
-          <w:right w:val="none"/>
+          <w:left w:val="none" w:color="000000" w:sz="4" w:space="0"/>
+          <w:bottom w:val="none" w:color="000000" w:sz="4" w:space="0"/>
+          <w:right w:val="none" w:color="000000" w:sz="4" w:space="0"/>
         </w:tcBorders>
       </w:tcPr>
     </w:tblStylePr>
@@ -24983,9 +25106,9 @@
       </w:tcPr>
     </w:tblStylePr>
   </w:style>
-  <w:style w:type="table" w:styleId="117">
+  <w:style w:type="table" w:styleId="840">
     <w:name w:val="Lined - Accent"/>
-    <w:basedOn w:val="665"/>
+    <w:basedOn w:val="921"/>
     <w:uiPriority w:val="99"/>
     <w:pPr>
       <w:pBdr/>
@@ -25220,9 +25343,9 @@
       </w:tcPr>
     </w:tblStylePr>
   </w:style>
-  <w:style w:type="table" w:styleId="118">
+  <w:style w:type="table" w:styleId="841">
     <w:name w:val="Lined - Accent 1"/>
-    <w:basedOn w:val="665"/>
+    <w:basedOn w:val="921"/>
     <w:uiPriority w:val="99"/>
     <w:pPr>
       <w:pBdr/>
@@ -25457,9 +25580,9 @@
       </w:tcPr>
     </w:tblStylePr>
   </w:style>
-  <w:style w:type="table" w:styleId="119">
+  <w:style w:type="table" w:styleId="842">
     <w:name w:val="Lined - Accent 2"/>
-    <w:basedOn w:val="665"/>
+    <w:basedOn w:val="921"/>
     <w:uiPriority w:val="99"/>
     <w:pPr>
       <w:pBdr/>
@@ -25694,9 +25817,9 @@
       </w:tcPr>
     </w:tblStylePr>
   </w:style>
-  <w:style w:type="table" w:styleId="120">
+  <w:style w:type="table" w:styleId="843">
     <w:name w:val="Lined - Accent 3"/>
-    <w:basedOn w:val="665"/>
+    <w:basedOn w:val="921"/>
     <w:uiPriority w:val="99"/>
     <w:pPr>
       <w:pBdr/>
@@ -25931,9 +26054,9 @@
       </w:tcPr>
     </w:tblStylePr>
   </w:style>
-  <w:style w:type="table" w:styleId="121">
+  <w:style w:type="table" w:styleId="844">
     <w:name w:val="Lined - Accent 4"/>
-    <w:basedOn w:val="665"/>
+    <w:basedOn w:val="921"/>
     <w:uiPriority w:val="99"/>
     <w:pPr>
       <w:pBdr/>
@@ -26168,9 +26291,9 @@
       </w:tcPr>
     </w:tblStylePr>
   </w:style>
-  <w:style w:type="table" w:styleId="122">
+  <w:style w:type="table" w:styleId="845">
     <w:name w:val="Lined - Accent 5"/>
-    <w:basedOn w:val="665"/>
+    <w:basedOn w:val="921"/>
     <w:uiPriority w:val="99"/>
     <w:pPr>
       <w:pBdr/>
@@ -26405,9 +26528,9 @@
       </w:tcPr>
     </w:tblStylePr>
   </w:style>
-  <w:style w:type="table" w:styleId="123">
+  <w:style w:type="table" w:styleId="846">
     <w:name w:val="Lined - Accent 6"/>
-    <w:basedOn w:val="665"/>
+    <w:basedOn w:val="921"/>
     <w:uiPriority w:val="99"/>
     <w:pPr>
       <w:pBdr/>
@@ -26642,9 +26765,9 @@
       </w:tcPr>
     </w:tblStylePr>
   </w:style>
-  <w:style w:type="table" w:styleId="124">
+  <w:style w:type="table" w:styleId="847">
     <w:name w:val="Bordered &amp; Lined - Accent"/>
-    <w:basedOn w:val="665"/>
+    <w:basedOn w:val="921"/>
     <w:uiPriority w:val="99"/>
     <w:pPr>
       <w:pBdr/>
@@ -26886,9 +27009,9 @@
       </w:tcPr>
     </w:tblStylePr>
   </w:style>
-  <w:style w:type="table" w:styleId="125">
+  <w:style w:type="table" w:styleId="848">
     <w:name w:val="Bordered &amp; Lined - Accent 1"/>
-    <w:basedOn w:val="665"/>
+    <w:basedOn w:val="921"/>
     <w:uiPriority w:val="99"/>
     <w:pPr>
       <w:pBdr/>
@@ -27130,9 +27253,9 @@
       </w:tcPr>
     </w:tblStylePr>
   </w:style>
-  <w:style w:type="table" w:styleId="126">
+  <w:style w:type="table" w:styleId="849">
     <w:name w:val="Bordered &amp; Lined - Accent 2"/>
-    <w:basedOn w:val="665"/>
+    <w:basedOn w:val="921"/>
     <w:uiPriority w:val="99"/>
     <w:pPr>
       <w:pBdr/>
@@ -27374,9 +27497,9 @@
       </w:tcPr>
     </w:tblStylePr>
   </w:style>
-  <w:style w:type="table" w:styleId="127">
+  <w:style w:type="table" w:styleId="850">
     <w:name w:val="Bordered &amp; Lined - Accent 3"/>
-    <w:basedOn w:val="665"/>
+    <w:basedOn w:val="921"/>
     <w:uiPriority w:val="99"/>
     <w:pPr>
       <w:pBdr/>
@@ -27618,9 +27741,9 @@
       </w:tcPr>
     </w:tblStylePr>
   </w:style>
-  <w:style w:type="table" w:styleId="128">
+  <w:style w:type="table" w:styleId="851">
     <w:name w:val="Bordered &amp; Lined - Accent 4"/>
-    <w:basedOn w:val="665"/>
+    <w:basedOn w:val="921"/>
     <w:uiPriority w:val="99"/>
     <w:pPr>
       <w:pBdr/>
@@ -27862,9 +27985,9 @@
       </w:tcPr>
     </w:tblStylePr>
   </w:style>
-  <w:style w:type="table" w:styleId="129">
+  <w:style w:type="table" w:styleId="852">
     <w:name w:val="Bordered &amp; Lined - Accent 5"/>
-    <w:basedOn w:val="665"/>
+    <w:basedOn w:val="921"/>
     <w:uiPriority w:val="99"/>
     <w:pPr>
       <w:pBdr/>
@@ -28106,9 +28229,9 @@
       </w:tcPr>
     </w:tblStylePr>
   </w:style>
-  <w:style w:type="table" w:styleId="130">
+  <w:style w:type="table" w:styleId="853">
     <w:name w:val="Bordered &amp; Lined - Accent 6"/>
-    <w:basedOn w:val="665"/>
+    <w:basedOn w:val="921"/>
     <w:uiPriority w:val="99"/>
     <w:pPr>
       <w:pBdr/>
@@ -28350,9 +28473,9 @@
       </w:tcPr>
     </w:tblStylePr>
   </w:style>
-  <w:style w:type="table" w:styleId="131">
+  <w:style w:type="table" w:styleId="854">
     <w:name w:val="Bordered"/>
-    <w:basedOn w:val="665"/>
+    <w:basedOn w:val="921"/>
     <w:uiPriority w:val="99"/>
     <w:pPr>
       <w:pBdr/>
@@ -28581,9 +28704,9 @@
       </w:tcPr>
     </w:tblStylePr>
   </w:style>
-  <w:style w:type="table" w:styleId="132">
+  <w:style w:type="table" w:styleId="855">
     <w:name w:val="Bordered - Accent 1"/>
-    <w:basedOn w:val="665"/>
+    <w:basedOn w:val="921"/>
     <w:uiPriority w:val="99"/>
     <w:pPr>
       <w:pBdr/>
@@ -28812,9 +28935,9 @@
       </w:tcPr>
     </w:tblStylePr>
   </w:style>
-  <w:style w:type="table" w:styleId="133">
+  <w:style w:type="table" w:styleId="856">
     <w:name w:val="Bordered - Accent 2"/>
-    <w:basedOn w:val="665"/>
+    <w:basedOn w:val="921"/>
     <w:uiPriority w:val="99"/>
     <w:pPr>
       <w:pBdr/>
@@ -29043,9 +29166,9 @@
       </w:tcPr>
     </w:tblStylePr>
   </w:style>
-  <w:style w:type="table" w:styleId="134">
+  <w:style w:type="table" w:styleId="857">
     <w:name w:val="Bordered - Accent 3"/>
-    <w:basedOn w:val="665"/>
+    <w:basedOn w:val="921"/>
     <w:uiPriority w:val="99"/>
     <w:pPr>
       <w:pBdr/>
@@ -29274,9 +29397,9 @@
       </w:tcPr>
     </w:tblStylePr>
   </w:style>
-  <w:style w:type="table" w:styleId="135">
+  <w:style w:type="table" w:styleId="858">
     <w:name w:val="Bordered - Accent 4"/>
-    <w:basedOn w:val="665"/>
+    <w:basedOn w:val="921"/>
     <w:uiPriority w:val="99"/>
     <w:pPr>
       <w:pBdr/>
@@ -29505,9 +29628,9 @@
       </w:tcPr>
     </w:tblStylePr>
   </w:style>
-  <w:style w:type="table" w:styleId="136">
+  <w:style w:type="table" w:styleId="859">
     <w:name w:val="Bordered - Accent 5"/>
-    <w:basedOn w:val="665"/>
+    <w:basedOn w:val="921"/>
     <w:uiPriority w:val="99"/>
     <w:pPr>
       <w:pBdr/>
@@ -29736,9 +29859,9 @@
       </w:tcPr>
     </w:tblStylePr>
   </w:style>
-  <w:style w:type="table" w:styleId="137">
+  <w:style w:type="table" w:styleId="860">
     <w:name w:val="Bordered - Accent 6"/>
-    <w:basedOn w:val="665"/>
+    <w:basedOn w:val="921"/>
     <w:uiPriority w:val="99"/>
     <w:pPr>
       <w:pBdr/>
@@ -29967,11 +30090,11 @@
       </w:tcPr>
     </w:tblStylePr>
   </w:style>
-  <w:style w:type="paragraph" w:styleId="139">
+  <w:style w:type="paragraph" w:styleId="861">
     <w:name w:val="Heading 1"/>
-    <w:basedOn w:val="664"/>
-    <w:next w:val="664"/>
-    <w:link w:val="150"/>
+    <w:basedOn w:val="920"/>
+    <w:next w:val="920"/>
+    <w:link w:val="871"/>
     <w:uiPriority w:val="9"/>
     <w:qFormat/>
     <w:pPr>
@@ -29989,11 +30112,11 @@
       <w:szCs w:val="40"/>
     </w:rPr>
   </w:style>
-  <w:style w:type="paragraph" w:styleId="140">
+  <w:style w:type="paragraph" w:styleId="862">
     <w:name w:val="Heading 2"/>
-    <w:basedOn w:val="664"/>
-    <w:next w:val="664"/>
-    <w:link w:val="151"/>
+    <w:basedOn w:val="920"/>
+    <w:next w:val="920"/>
+    <w:link w:val="872"/>
     <w:uiPriority w:val="9"/>
     <w:unhideWhenUsed/>
     <w:qFormat/>
@@ -30012,11 +30135,11 @@
       <w:szCs w:val="32"/>
     </w:rPr>
   </w:style>
-  <w:style w:type="paragraph" w:styleId="141">
+  <w:style w:type="paragraph" w:styleId="863">
     <w:name w:val="Heading 3"/>
-    <w:basedOn w:val="664"/>
-    <w:next w:val="664"/>
-    <w:link w:val="152"/>
+    <w:basedOn w:val="920"/>
+    <w:next w:val="920"/>
+    <w:link w:val="873"/>
     <w:uiPriority w:val="9"/>
     <w:unhideWhenUsed/>
     <w:qFormat/>
@@ -30035,11 +30158,11 @@
       <w:szCs w:val="28"/>
     </w:rPr>
   </w:style>
-  <w:style w:type="paragraph" w:styleId="142">
+  <w:style w:type="paragraph" w:styleId="864">
     <w:name w:val="Heading 4"/>
-    <w:basedOn w:val="664"/>
-    <w:next w:val="664"/>
-    <w:link w:val="153"/>
+    <w:basedOn w:val="920"/>
+    <w:next w:val="920"/>
+    <w:link w:val="874"/>
     <w:uiPriority w:val="9"/>
     <w:unhideWhenUsed/>
     <w:qFormat/>
@@ -30058,11 +30181,11 @@
       <w:color w:val="0f4761" w:themeColor="accent1" w:themeShade="BF"/>
     </w:rPr>
   </w:style>
-  <w:style w:type="paragraph" w:styleId="143">
+  <w:style w:type="paragraph" w:styleId="865">
     <w:name w:val="Heading 5"/>
-    <w:basedOn w:val="664"/>
-    <w:next w:val="664"/>
-    <w:link w:val="154"/>
+    <w:basedOn w:val="920"/>
+    <w:next w:val="920"/>
+    <w:link w:val="875"/>
     <w:uiPriority w:val="9"/>
     <w:unhideWhenUsed/>
     <w:qFormat/>
@@ -30079,11 +30202,11 @@
       <w:color w:val="0f4761" w:themeColor="accent1" w:themeShade="BF"/>
     </w:rPr>
   </w:style>
-  <w:style w:type="paragraph" w:styleId="144">
+  <w:style w:type="paragraph" w:styleId="866">
     <w:name w:val="Heading 6"/>
-    <w:basedOn w:val="664"/>
-    <w:next w:val="664"/>
-    <w:link w:val="155"/>
+    <w:basedOn w:val="920"/>
+    <w:next w:val="920"/>
+    <w:link w:val="876"/>
     <w:uiPriority w:val="9"/>
     <w:unhideWhenUsed/>
     <w:qFormat/>
@@ -30102,11 +30225,11 @@
       <w:color w:val="595959" w:themeColor="text1" w:themeTint="A6"/>
     </w:rPr>
   </w:style>
-  <w:style w:type="paragraph" w:styleId="145">
+  <w:style w:type="paragraph" w:styleId="867">
     <w:name w:val="Heading 7"/>
-    <w:basedOn w:val="664"/>
-    <w:next w:val="664"/>
-    <w:link w:val="156"/>
+    <w:basedOn w:val="920"/>
+    <w:next w:val="920"/>
+    <w:link w:val="877"/>
     <w:uiPriority w:val="9"/>
     <w:unhideWhenUsed/>
     <w:qFormat/>
@@ -30123,11 +30246,11 @@
       <w:color w:val="595959" w:themeColor="text1" w:themeTint="A6"/>
     </w:rPr>
   </w:style>
-  <w:style w:type="paragraph" w:styleId="146">
+  <w:style w:type="paragraph" w:styleId="868">
     <w:name w:val="Heading 8"/>
-    <w:basedOn w:val="664"/>
-    <w:next w:val="664"/>
-    <w:link w:val="157"/>
+    <w:basedOn w:val="920"/>
+    <w:next w:val="920"/>
+    <w:link w:val="878"/>
     <w:uiPriority w:val="9"/>
     <w:unhideWhenUsed/>
     <w:qFormat/>
@@ -30146,11 +30269,11 @@
       <w:color w:val="272727" w:themeColor="text1" w:themeTint="D8"/>
     </w:rPr>
   </w:style>
-  <w:style w:type="paragraph" w:styleId="147">
+  <w:style w:type="paragraph" w:styleId="869">
     <w:name w:val="Heading 9"/>
-    <w:basedOn w:val="664"/>
-    <w:next w:val="664"/>
-    <w:link w:val="158"/>
+    <w:basedOn w:val="920"/>
+    <w:next w:val="920"/>
+    <w:link w:val="879"/>
     <w:uiPriority w:val="9"/>
     <w:unhideWhenUsed/>
     <w:qFormat/>
@@ -30169,7 +30292,7 @@
       <w:color w:val="272727" w:themeColor="text1" w:themeTint="D8"/>
     </w:rPr>
   </w:style>
-  <w:style w:type="character" w:styleId="148" w:default="1">
+  <w:style w:type="character" w:styleId="870" w:default="1">
     <w:name w:val="Default Paragraph Font"/>
     <w:uiPriority w:val="1"/>
     <w:semiHidden/>
@@ -30180,10 +30303,10 @@
       <w:ind/>
     </w:pPr>
   </w:style>
-  <w:style w:type="character" w:styleId="150">
+  <w:style w:type="character" w:styleId="871">
     <w:name w:val="Heading 1 Char"/>
-    <w:basedOn w:val="148"/>
-    <w:link w:val="139"/>
+    <w:basedOn w:val="870"/>
+    <w:link w:val="861"/>
     <w:uiPriority w:val="9"/>
     <w:pPr>
       <w:pBdr/>
@@ -30197,10 +30320,10 @@
       <w:szCs w:val="40"/>
     </w:rPr>
   </w:style>
-  <w:style w:type="character" w:styleId="151">
+  <w:style w:type="character" w:styleId="872">
     <w:name w:val="Heading 2 Char"/>
-    <w:basedOn w:val="148"/>
-    <w:link w:val="140"/>
+    <w:basedOn w:val="870"/>
+    <w:link w:val="862"/>
     <w:uiPriority w:val="9"/>
     <w:pPr>
       <w:pBdr/>
@@ -30214,10 +30337,10 @@
       <w:szCs w:val="32"/>
     </w:rPr>
   </w:style>
-  <w:style w:type="character" w:styleId="152">
+  <w:style w:type="character" w:styleId="873">
     <w:name w:val="Heading 3 Char"/>
-    <w:basedOn w:val="148"/>
-    <w:link w:val="141"/>
+    <w:basedOn w:val="870"/>
+    <w:link w:val="863"/>
     <w:uiPriority w:val="9"/>
     <w:pPr>
       <w:pBdr/>
@@ -30231,10 +30354,10 @@
       <w:szCs w:val="28"/>
     </w:rPr>
   </w:style>
-  <w:style w:type="character" w:styleId="153">
+  <w:style w:type="character" w:styleId="874">
     <w:name w:val="Heading 4 Char"/>
-    <w:basedOn w:val="148"/>
-    <w:link w:val="142"/>
+    <w:basedOn w:val="870"/>
+    <w:link w:val="864"/>
     <w:uiPriority w:val="9"/>
     <w:pPr>
       <w:pBdr/>
@@ -30248,10 +30371,10 @@
       <w:color w:val="0f4761" w:themeColor="accent1" w:themeShade="BF"/>
     </w:rPr>
   </w:style>
-  <w:style w:type="character" w:styleId="154">
+  <w:style w:type="character" w:styleId="875">
     <w:name w:val="Heading 5 Char"/>
-    <w:basedOn w:val="148"/>
-    <w:link w:val="143"/>
+    <w:basedOn w:val="870"/>
+    <w:link w:val="865"/>
     <w:uiPriority w:val="9"/>
     <w:pPr>
       <w:pBdr/>
@@ -30263,10 +30386,10 @@
       <w:color w:val="0f4761" w:themeColor="accent1" w:themeShade="BF"/>
     </w:rPr>
   </w:style>
-  <w:style w:type="character" w:styleId="155">
+  <w:style w:type="character" w:styleId="876">
     <w:name w:val="Heading 6 Char"/>
-    <w:basedOn w:val="148"/>
-    <w:link w:val="144"/>
+    <w:basedOn w:val="870"/>
+    <w:link w:val="866"/>
     <w:uiPriority w:val="9"/>
     <w:pPr>
       <w:pBdr/>
@@ -30280,10 +30403,10 @@
       <w:color w:val="595959" w:themeColor="text1" w:themeTint="A6"/>
     </w:rPr>
   </w:style>
-  <w:style w:type="character" w:styleId="156">
+  <w:style w:type="character" w:styleId="877">
     <w:name w:val="Heading 7 Char"/>
-    <w:basedOn w:val="148"/>
-    <w:link w:val="145"/>
+    <w:basedOn w:val="870"/>
+    <w:link w:val="867"/>
     <w:uiPriority w:val="9"/>
     <w:pPr>
       <w:pBdr/>
@@ -30295,10 +30418,10 @@
       <w:color w:val="595959" w:themeColor="text1" w:themeTint="A6"/>
     </w:rPr>
   </w:style>
-  <w:style w:type="character" w:styleId="157">
+  <w:style w:type="character" w:styleId="878">
     <w:name w:val="Heading 8 Char"/>
-    <w:basedOn w:val="148"/>
-    <w:link w:val="146"/>
+    <w:basedOn w:val="870"/>
+    <w:link w:val="868"/>
     <w:uiPriority w:val="9"/>
     <w:pPr>
       <w:pBdr/>
@@ -30312,10 +30435,10 @@
       <w:color w:val="272727" w:themeColor="text1" w:themeTint="D8"/>
     </w:rPr>
   </w:style>
-  <w:style w:type="character" w:styleId="158">
+  <w:style w:type="character" w:styleId="879">
     <w:name w:val="Heading 9 Char"/>
-    <w:basedOn w:val="148"/>
-    <w:link w:val="147"/>
+    <w:basedOn w:val="870"/>
+    <w:link w:val="869"/>
     <w:uiPriority w:val="9"/>
     <w:pPr>
       <w:pBdr/>
@@ -30329,11 +30452,11 @@
       <w:color w:val="272727" w:themeColor="text1" w:themeTint="D8"/>
     </w:rPr>
   </w:style>
-  <w:style w:type="paragraph" w:styleId="159">
+  <w:style w:type="paragraph" w:styleId="880">
     <w:name w:val="Title"/>
-    <w:basedOn w:val="664"/>
-    <w:next w:val="664"/>
-    <w:link w:val="160"/>
+    <w:basedOn w:val="920"/>
+    <w:next w:val="920"/>
+    <w:link w:val="881"/>
     <w:uiPriority w:val="10"/>
     <w:qFormat/>
     <w:pPr>
@@ -30349,10 +30472,10 @@
       <w:szCs w:val="56"/>
     </w:rPr>
   </w:style>
-  <w:style w:type="character" w:styleId="160">
+  <w:style w:type="character" w:styleId="881">
     <w:name w:val="Title Char"/>
-    <w:basedOn w:val="148"/>
-    <w:link w:val="159"/>
+    <w:basedOn w:val="870"/>
+    <w:link w:val="880"/>
     <w:uiPriority w:val="10"/>
     <w:pPr>
       <w:pBdr/>
@@ -30366,11 +30489,11 @@
       <w:szCs w:val="56"/>
     </w:rPr>
   </w:style>
-  <w:style w:type="paragraph" w:styleId="161">
+  <w:style w:type="paragraph" w:styleId="882">
     <w:name w:val="Subtitle"/>
-    <w:basedOn w:val="664"/>
-    <w:next w:val="664"/>
-    <w:link w:val="162"/>
+    <w:basedOn w:val="920"/>
+    <w:next w:val="920"/>
+    <w:link w:val="883"/>
     <w:uiPriority w:val="11"/>
     <w:qFormat/>
     <w:pPr>
@@ -30388,10 +30511,10 @@
       <w:szCs w:val="28"/>
     </w:rPr>
   </w:style>
-  <w:style w:type="character" w:styleId="162">
+  <w:style w:type="character" w:styleId="883">
     <w:name w:val="Subtitle Char"/>
-    <w:basedOn w:val="148"/>
-    <w:link w:val="161"/>
+    <w:basedOn w:val="870"/>
+    <w:link w:val="882"/>
     <w:uiPriority w:val="11"/>
     <w:pPr>
       <w:pBdr/>
@@ -30405,11 +30528,11 @@
       <w:szCs w:val="28"/>
     </w:rPr>
   </w:style>
-  <w:style w:type="paragraph" w:styleId="163">
+  <w:style w:type="paragraph" w:styleId="884">
     <w:name w:val="Quote"/>
-    <w:basedOn w:val="664"/>
-    <w:next w:val="664"/>
-    <w:link w:val="164"/>
+    <w:basedOn w:val="920"/>
+    <w:next w:val="920"/>
+    <w:link w:val="885"/>
     <w:uiPriority w:val="29"/>
     <w:qFormat/>
     <w:pPr>
@@ -30424,10 +30547,10 @@
       <w:color w:val="404040" w:themeColor="text1" w:themeTint="BF"/>
     </w:rPr>
   </w:style>
-  <w:style w:type="character" w:styleId="164">
+  <w:style w:type="character" w:styleId="885">
     <w:name w:val="Quote Char"/>
-    <w:basedOn w:val="148"/>
-    <w:link w:val="163"/>
+    <w:basedOn w:val="870"/>
+    <w:link w:val="884"/>
     <w:uiPriority w:val="29"/>
     <w:pPr>
       <w:pBdr/>
@@ -30440,9 +30563,9 @@
       <w:color w:val="404040" w:themeColor="text1" w:themeTint="BF"/>
     </w:rPr>
   </w:style>
-  <w:style w:type="character" w:styleId="166">
+  <w:style w:type="character" w:styleId="886">
     <w:name w:val="Intense Emphasis"/>
-    <w:basedOn w:val="148"/>
+    <w:basedOn w:val="870"/>
     <w:uiPriority w:val="21"/>
     <w:qFormat/>
     <w:pPr>
@@ -30456,11 +30579,11 @@
       <w:color w:val="0f4761" w:themeColor="accent1" w:themeShade="BF"/>
     </w:rPr>
   </w:style>
-  <w:style w:type="paragraph" w:styleId="167">
+  <w:style w:type="paragraph" w:styleId="887">
     <w:name w:val="Intense Quote"/>
-    <w:basedOn w:val="664"/>
-    <w:next w:val="664"/>
-    <w:link w:val="168"/>
+    <w:basedOn w:val="920"/>
+    <w:next w:val="920"/>
+    <w:link w:val="888"/>
     <w:uiPriority w:val="30"/>
     <w:qFormat/>
     <w:pPr>
@@ -30478,10 +30601,10 @@
       <w:color w:val="0f4761" w:themeColor="accent1" w:themeShade="BF"/>
     </w:rPr>
   </w:style>
-  <w:style w:type="character" w:styleId="168">
+  <w:style w:type="character" w:styleId="888">
     <w:name w:val="Intense Quote Char"/>
-    <w:basedOn w:val="148"/>
-    <w:link w:val="167"/>
+    <w:basedOn w:val="870"/>
+    <w:link w:val="887"/>
     <w:uiPriority w:val="30"/>
     <w:pPr>
       <w:pBdr/>
@@ -30494,9 +30617,9 @@
       <w:color w:val="0f4761" w:themeColor="accent1" w:themeShade="BF"/>
     </w:rPr>
   </w:style>
-  <w:style w:type="character" w:styleId="169">
+  <w:style w:type="character" w:styleId="889">
     <w:name w:val="Intense Reference"/>
-    <w:basedOn w:val="148"/>
+    <w:basedOn w:val="870"/>
     <w:uiPriority w:val="32"/>
     <w:qFormat/>
     <w:pPr>
@@ -30512,9 +30635,9 @@
       <w:spacing w:val="5"/>
     </w:rPr>
   </w:style>
-  <w:style w:type="character" w:styleId="171">
+  <w:style w:type="character" w:styleId="890">
     <w:name w:val="Subtle Emphasis"/>
-    <w:basedOn w:val="148"/>
+    <w:basedOn w:val="870"/>
     <w:uiPriority w:val="19"/>
     <w:qFormat/>
     <w:pPr>
@@ -30528,9 +30651,9 @@
       <w:color w:val="404040" w:themeColor="text1" w:themeTint="BF"/>
     </w:rPr>
   </w:style>
-  <w:style w:type="character" w:styleId="172">
+  <w:style w:type="character" w:styleId="891">
     <w:name w:val="Emphasis"/>
-    <w:basedOn w:val="148"/>
+    <w:basedOn w:val="870"/>
     <w:uiPriority w:val="20"/>
     <w:qFormat/>
     <w:pPr>
@@ -30543,9 +30666,9 @@
       <w:iCs/>
     </w:rPr>
   </w:style>
-  <w:style w:type="character" w:styleId="173">
+  <w:style w:type="character" w:styleId="892">
     <w:name w:val="Strong"/>
-    <w:basedOn w:val="148"/>
+    <w:basedOn w:val="870"/>
     <w:uiPriority w:val="22"/>
     <w:qFormat/>
     <w:pPr>
@@ -30558,9 +30681,9 @@
       <w:bCs/>
     </w:rPr>
   </w:style>
-  <w:style w:type="character" w:styleId="174">
+  <w:style w:type="character" w:styleId="893">
     <w:name w:val="Subtle Reference"/>
-    <w:basedOn w:val="148"/>
+    <w:basedOn w:val="870"/>
     <w:uiPriority w:val="31"/>
     <w:qFormat/>
     <w:pPr>
@@ -30573,9 +30696,9 @@
       <w:color w:val="5a5a5a" w:themeColor="text1" w:themeTint="A5"/>
     </w:rPr>
   </w:style>
-  <w:style w:type="character" w:styleId="175">
+  <w:style w:type="character" w:styleId="894">
     <w:name w:val="Book Title"/>
-    <w:basedOn w:val="148"/>
+    <w:basedOn w:val="870"/>
     <w:uiPriority w:val="33"/>
     <w:qFormat/>
     <w:pPr>
@@ -30591,10 +30714,10 @@
       <w:spacing w:val="5"/>
     </w:rPr>
   </w:style>
-  <w:style w:type="paragraph" w:styleId="176">
+  <w:style w:type="paragraph" w:styleId="895">
     <w:name w:val="Header"/>
-    <w:basedOn w:val="664"/>
-    <w:link w:val="177"/>
+    <w:basedOn w:val="920"/>
+    <w:link w:val="896"/>
     <w:uiPriority w:val="99"/>
     <w:unhideWhenUsed/>
     <w:pPr>
@@ -30607,10 +30730,10 @@
       <w:ind/>
     </w:pPr>
   </w:style>
-  <w:style w:type="character" w:styleId="177">
+  <w:style w:type="character" w:styleId="896">
     <w:name w:val="Header Char"/>
-    <w:basedOn w:val="148"/>
-    <w:link w:val="176"/>
+    <w:basedOn w:val="870"/>
+    <w:link w:val="895"/>
     <w:uiPriority w:val="99"/>
     <w:pPr>
       <w:pBdr/>
@@ -30618,10 +30741,10 @@
       <w:ind/>
     </w:pPr>
   </w:style>
-  <w:style w:type="paragraph" w:styleId="178">
+  <w:style w:type="paragraph" w:styleId="897">
     <w:name w:val="Footer"/>
-    <w:basedOn w:val="664"/>
-    <w:link w:val="179"/>
+    <w:basedOn w:val="920"/>
+    <w:link w:val="898"/>
     <w:uiPriority w:val="99"/>
     <w:unhideWhenUsed/>
     <w:pPr>
@@ -30634,10 +30757,10 @@
       <w:ind/>
     </w:pPr>
   </w:style>
-  <w:style w:type="character" w:styleId="179">
+  <w:style w:type="character" w:styleId="898">
     <w:name w:val="Footer Char"/>
-    <w:basedOn w:val="148"/>
-    <w:link w:val="178"/>
+    <w:basedOn w:val="870"/>
+    <w:link w:val="897"/>
     <w:uiPriority w:val="99"/>
     <w:pPr>
       <w:pBdr/>
@@ -30645,10 +30768,10 @@
       <w:ind/>
     </w:pPr>
   </w:style>
-  <w:style w:type="paragraph" w:styleId="180">
+  <w:style w:type="paragraph" w:styleId="899">
     <w:name w:val="Caption"/>
-    <w:basedOn w:val="664"/>
-    <w:next w:val="664"/>
+    <w:basedOn w:val="920"/>
+    <w:next w:val="920"/>
     <w:uiPriority w:val="35"/>
     <w:unhideWhenUsed/>
     <w:qFormat/>
@@ -30665,10 +30788,10 @@
       <w:szCs w:val="18"/>
     </w:rPr>
   </w:style>
-  <w:style w:type="paragraph" w:styleId="181">
+  <w:style w:type="paragraph" w:styleId="900">
     <w:name w:val="footnote text"/>
-    <w:basedOn w:val="664"/>
-    <w:link w:val="182"/>
+    <w:basedOn w:val="920"/>
+    <w:link w:val="901"/>
     <w:uiPriority w:val="99"/>
     <w:semiHidden/>
     <w:unhideWhenUsed/>
@@ -30682,10 +30805,10 @@
       <w:szCs w:val="20"/>
     </w:rPr>
   </w:style>
-  <w:style w:type="character" w:styleId="182">
+  <w:style w:type="character" w:styleId="901">
     <w:name w:val="Footnote Text Char"/>
-    <w:basedOn w:val="148"/>
-    <w:link w:val="181"/>
+    <w:basedOn w:val="870"/>
+    <w:link w:val="900"/>
     <w:uiPriority w:val="99"/>
     <w:semiHidden/>
     <w:pPr>
@@ -30698,9 +30821,9 @@
       <w:szCs w:val="20"/>
     </w:rPr>
   </w:style>
-  <w:style w:type="character" w:styleId="183">
+  <w:style w:type="character" w:styleId="902">
     <w:name w:val="footnote reference"/>
-    <w:basedOn w:val="148"/>
+    <w:basedOn w:val="870"/>
     <w:uiPriority w:val="99"/>
     <w:semiHidden/>
     <w:unhideWhenUsed/>
@@ -30713,10 +30836,10 @@
       <w:vertAlign w:val="superscript"/>
     </w:rPr>
   </w:style>
-  <w:style w:type="paragraph" w:styleId="184">
+  <w:style w:type="paragraph" w:styleId="903">
     <w:name w:val="endnote text"/>
-    <w:basedOn w:val="664"/>
-    <w:link w:val="185"/>
+    <w:basedOn w:val="920"/>
+    <w:link w:val="904"/>
     <w:uiPriority w:val="99"/>
     <w:semiHidden/>
     <w:unhideWhenUsed/>
@@ -30730,10 +30853,10 @@
       <w:szCs w:val="20"/>
     </w:rPr>
   </w:style>
-  <w:style w:type="character" w:styleId="185">
+  <w:style w:type="character" w:styleId="904">
     <w:name w:val="Endnote Text Char"/>
-    <w:basedOn w:val="148"/>
-    <w:link w:val="184"/>
+    <w:basedOn w:val="870"/>
+    <w:link w:val="903"/>
     <w:uiPriority w:val="99"/>
     <w:semiHidden/>
     <w:pPr>
@@ -30746,9 +30869,9 @@
       <w:szCs w:val="20"/>
     </w:rPr>
   </w:style>
-  <w:style w:type="character" w:styleId="186">
+  <w:style w:type="character" w:styleId="905">
     <w:name w:val="endnote reference"/>
-    <w:basedOn w:val="148"/>
+    <w:basedOn w:val="870"/>
     <w:uiPriority w:val="99"/>
     <w:semiHidden/>
     <w:unhideWhenUsed/>
@@ -30761,9 +30884,9 @@
       <w:vertAlign w:val="superscript"/>
     </w:rPr>
   </w:style>
-  <w:style w:type="character" w:styleId="187">
+  <w:style w:type="character" w:styleId="906">
     <w:name w:val="Hyperlink"/>
-    <w:basedOn w:val="148"/>
+    <w:basedOn w:val="870"/>
     <w:uiPriority w:val="99"/>
     <w:unhideWhenUsed/>
     <w:pPr>
@@ -30776,9 +30899,9 @@
       <w:u w:val="single"/>
     </w:rPr>
   </w:style>
-  <w:style w:type="character" w:styleId="188">
+  <w:style w:type="character" w:styleId="907">
     <w:name w:val="FollowedHyperlink"/>
-    <w:basedOn w:val="148"/>
+    <w:basedOn w:val="870"/>
     <w:uiPriority w:val="99"/>
     <w:semiHidden/>
     <w:unhideWhenUsed/>
@@ -30792,10 +30915,10 @@
       <w:u w:val="single"/>
     </w:rPr>
   </w:style>
-  <w:style w:type="paragraph" w:styleId="189">
+  <w:style w:type="paragraph" w:styleId="908">
     <w:name w:val="toc 1"/>
-    <w:basedOn w:val="664"/>
-    <w:next w:val="664"/>
+    <w:basedOn w:val="920"/>
+    <w:next w:val="920"/>
     <w:uiPriority w:val="39"/>
     <w:unhideWhenUsed/>
     <w:pPr>
@@ -30804,10 +30927,10 @@
       <w:ind/>
     </w:pPr>
   </w:style>
-  <w:style w:type="paragraph" w:styleId="190">
+  <w:style w:type="paragraph" w:styleId="909">
     <w:name w:val="toc 2"/>
-    <w:basedOn w:val="664"/>
-    <w:next w:val="664"/>
+    <w:basedOn w:val="920"/>
+    <w:next w:val="920"/>
     <w:uiPriority w:val="39"/>
     <w:unhideWhenUsed/>
     <w:pPr>
@@ -30816,10 +30939,10 @@
       <w:ind w:left="220"/>
     </w:pPr>
   </w:style>
-  <w:style w:type="paragraph" w:styleId="191">
+  <w:style w:type="paragraph" w:styleId="910">
     <w:name w:val="toc 3"/>
-    <w:basedOn w:val="664"/>
-    <w:next w:val="664"/>
+    <w:basedOn w:val="920"/>
+    <w:next w:val="920"/>
     <w:uiPriority w:val="39"/>
     <w:unhideWhenUsed/>
     <w:pPr>
@@ -30828,10 +30951,10 @@
       <w:ind w:left="440"/>
     </w:pPr>
   </w:style>
-  <w:style w:type="paragraph" w:styleId="192">
+  <w:style w:type="paragraph" w:styleId="911">
     <w:name w:val="toc 4"/>
-    <w:basedOn w:val="664"/>
-    <w:next w:val="664"/>
+    <w:basedOn w:val="920"/>
+    <w:next w:val="920"/>
     <w:uiPriority w:val="39"/>
     <w:unhideWhenUsed/>
     <w:pPr>
@@ -30840,10 +30963,10 @@
       <w:ind w:left="660"/>
     </w:pPr>
   </w:style>
-  <w:style w:type="paragraph" w:styleId="193">
+  <w:style w:type="paragraph" w:styleId="912">
     <w:name w:val="toc 5"/>
-    <w:basedOn w:val="664"/>
-    <w:next w:val="664"/>
+    <w:basedOn w:val="920"/>
+    <w:next w:val="920"/>
     <w:uiPriority w:val="39"/>
     <w:unhideWhenUsed/>
     <w:pPr>
@@ -30852,10 +30975,10 @@
       <w:ind w:left="880"/>
     </w:pPr>
   </w:style>
-  <w:style w:type="paragraph" w:styleId="194">
+  <w:style w:type="paragraph" w:styleId="913">
     <w:name w:val="toc 6"/>
-    <w:basedOn w:val="664"/>
-    <w:next w:val="664"/>
+    <w:basedOn w:val="920"/>
+    <w:next w:val="920"/>
     <w:uiPriority w:val="39"/>
     <w:unhideWhenUsed/>
     <w:pPr>
@@ -30864,10 +30987,10 @@
       <w:ind w:left="1100"/>
     </w:pPr>
   </w:style>
-  <w:style w:type="paragraph" w:styleId="195">
+  <w:style w:type="paragraph" w:styleId="914">
     <w:name w:val="toc 7"/>
-    <w:basedOn w:val="664"/>
-    <w:next w:val="664"/>
+    <w:basedOn w:val="920"/>
+    <w:next w:val="920"/>
     <w:uiPriority w:val="39"/>
     <w:unhideWhenUsed/>
     <w:pPr>
@@ -30876,10 +30999,10 @@
       <w:ind w:left="1320"/>
     </w:pPr>
   </w:style>
-  <w:style w:type="paragraph" w:styleId="196">
+  <w:style w:type="paragraph" w:styleId="915">
     <w:name w:val="toc 8"/>
-    <w:basedOn w:val="664"/>
-    <w:next w:val="664"/>
+    <w:basedOn w:val="920"/>
+    <w:next w:val="920"/>
     <w:uiPriority w:val="39"/>
     <w:unhideWhenUsed/>
     <w:pPr>
@@ -30888,10 +31011,10 @@
       <w:ind w:left="1540"/>
     </w:pPr>
   </w:style>
-  <w:style w:type="paragraph" w:styleId="197">
+  <w:style w:type="paragraph" w:styleId="916">
     <w:name w:val="toc 9"/>
-    <w:basedOn w:val="664"/>
-    <w:next w:val="664"/>
+    <w:basedOn w:val="920"/>
+    <w:next w:val="920"/>
     <w:uiPriority w:val="39"/>
     <w:unhideWhenUsed/>
     <w:pPr>
@@ -30900,9 +31023,9 @@
       <w:ind w:left="1760"/>
     </w:pPr>
   </w:style>
-  <w:style w:type="character" w:styleId="198">
+  <w:style w:type="character" w:styleId="917">
     <w:name w:val="Placeholder Text"/>
-    <w:basedOn w:val="148"/>
+    <w:basedOn w:val="870"/>
     <w:uiPriority w:val="99"/>
     <w:semiHidden/>
     <w:pPr>
@@ -30914,7 +31037,7 @@
       <w:color w:val="666666"/>
     </w:rPr>
   </w:style>
-  <w:style w:type="paragraph" w:styleId="208">
+  <w:style w:type="paragraph" w:styleId="918">
     <w:name w:val="TOC Heading"/>
     <w:uiPriority w:val="39"/>
     <w:unhideWhenUsed/>
@@ -30924,10 +31047,10 @@
       <w:ind/>
     </w:pPr>
   </w:style>
-  <w:style w:type="paragraph" w:styleId="209">
+  <w:style w:type="paragraph" w:styleId="919">
     <w:name w:val="table of figures"/>
-    <w:basedOn w:val="664"/>
-    <w:next w:val="664"/>
+    <w:basedOn w:val="920"/>
+    <w:next w:val="920"/>
     <w:uiPriority w:val="99"/>
     <w:unhideWhenUsed/>
     <w:pPr>
@@ -30936,7 +31059,7 @@
       <w:ind/>
     </w:pPr>
   </w:style>
-  <w:style w:type="paragraph" w:styleId="664" w:default="1">
+  <w:style w:type="paragraph" w:styleId="920" w:default="1">
     <w:name w:val="Normal"/>
     <w:qFormat/>
     <w:pPr>
@@ -30945,7 +31068,7 @@
       <w:ind/>
     </w:pPr>
   </w:style>
-  <w:style w:type="table" w:styleId="665" w:default="1">
+  <w:style w:type="table" w:styleId="921" w:default="1">
     <w:name w:val="Normal Table"/>
     <w:uiPriority w:val="99"/>
     <w:semiHidden/>
@@ -31138,7 +31261,7 @@
       </w:tcPr>
     </w:tblStylePr>
   </w:style>
-  <w:style w:type="numbering" w:styleId="666" w:default="1">
+  <w:style w:type="numbering" w:styleId="922" w:default="1">
     <w:name w:val="No List"/>
     <w:uiPriority w:val="99"/>
     <w:semiHidden/>
@@ -31149,9 +31272,9 @@
       <w:ind/>
     </w:pPr>
   </w:style>
-  <w:style w:type="paragraph" w:styleId="667">
+  <w:style w:type="paragraph" w:styleId="923">
     <w:name w:val="No Spacing"/>
-    <w:basedOn w:val="664"/>
+    <w:basedOn w:val="920"/>
     <w:uiPriority w:val="1"/>
     <w:qFormat/>
     <w:pPr>
@@ -31160,9 +31283,9 @@
       <w:ind/>
     </w:pPr>
   </w:style>
-  <w:style w:type="paragraph" w:styleId="668">
+  <w:style w:type="paragraph" w:styleId="924">
     <w:name w:val="List Paragraph"/>
-    <w:basedOn w:val="664"/>
+    <w:basedOn w:val="920"/>
     <w:uiPriority w:val="34"/>
     <w:qFormat/>
     <w:pPr>

</xml_diff>

<commit_message>
Adiciona conteúdo à tradução simultânea e ao glossario
</commit_message>
<xml_diff>
--- a/documentation/Glossario.docx
+++ b/documentation/Glossario.docx
@@ -46,6 +46,11 @@
           <w:highlight w:val="none"/>
         </w:rPr>
       </w:r>
+      <w:r>
+        <w:rPr>
+          <w:highlight w:val="none"/>
+        </w:rPr>
+      </w:r>
     </w:p>
     <w:p>
       <w:pPr>
@@ -72,6 +77,11 @@
           <w:highlight w:val="none"/>
         </w:rPr>
         <w:t xml:space="preserve"> – Inaugurar</w:t>
+      </w:r>
+      <w:r>
+        <w:rPr>
+          <w:highlight w:val="none"/>
+        </w:rPr>
       </w:r>
       <w:r>
         <w:rPr>
@@ -116,6 +126,11 @@
           <w:highlight w:val="none"/>
         </w:rPr>
         <w:t xml:space="preserve">- Destacar</w:t>
+      </w:r>
+      <w:r>
+        <w:rPr>
+          <w:highlight w:val="none"/>
+        </w:rPr>
       </w:r>
       <w:r>
         <w:rPr>
@@ -228,6 +243,13 @@
           <w:highlight w:val="none"/>
         </w:rPr>
       </w:r>
+      <w:r>
+        <w:rPr>
+          <w:b w:val="0"/>
+          <w:bCs w:val="0"/>
+          <w:highlight w:val="none"/>
+        </w:rPr>
+      </w:r>
     </w:p>
     <w:p>
       <w:pPr>
@@ -311,6 +333,13 @@
           <w:highlight w:val="none"/>
         </w:rPr>
         <w:t xml:space="preserve">– Consciência.</w:t>
+      </w:r>
+      <w:r>
+        <w:rPr>
+          <w:b w:val="0"/>
+          <w:bCs w:val="0"/>
+          <w:highlight w:val="none"/>
+        </w:rPr>
       </w:r>
       <w:r>
         <w:rPr>
@@ -379,6 +408,13 @@
           <w:highlight w:val="none"/>
         </w:rPr>
       </w:r>
+      <w:r>
+        <w:rPr>
+          <w:b w:val="0"/>
+          <w:bCs w:val="0"/>
+          <w:highlight w:val="none"/>
+        </w:rPr>
+      </w:r>
     </w:p>
     <w:p>
       <w:pPr>
@@ -425,6 +461,13 @@
           <w:highlight w:val="none"/>
         </w:rPr>
       </w:r>
+      <w:r>
+        <w:rPr>
+          <w:b w:val="0"/>
+          <w:bCs w:val="0"/>
+          <w:highlight w:val="none"/>
+        </w:rPr>
+      </w:r>
     </w:p>
     <w:p>
       <w:pPr>
@@ -471,6 +514,13 @@
           <w:highlight w:val="none"/>
         </w:rPr>
       </w:r>
+      <w:r>
+        <w:rPr>
+          <w:b w:val="0"/>
+          <w:bCs w:val="0"/>
+          <w:highlight w:val="none"/>
+        </w:rPr>
+      </w:r>
     </w:p>
     <w:p>
       <w:pPr>
@@ -509,6 +559,13 @@
           <w:highlight w:val="none"/>
         </w:rPr>
         <w:t xml:space="preserve">– Desafiador</w:t>
+      </w:r>
+      <w:r>
+        <w:rPr>
+          <w:b w:val="0"/>
+          <w:bCs w:val="0"/>
+          <w:highlight w:val="none"/>
+        </w:rPr>
       </w:r>
       <w:r>
         <w:rPr>
@@ -570,6 +627,13 @@
           <w:highlight w:val="none"/>
         </w:rPr>
       </w:r>
+      <w:r>
+        <w:rPr>
+          <w:b w:val="0"/>
+          <w:bCs w:val="0"/>
+          <w:highlight w:val="none"/>
+        </w:rPr>
+      </w:r>
     </w:p>
     <w:p>
       <w:pPr>
@@ -623,6 +687,13 @@
           <w:highlight w:val="none"/>
         </w:rPr>
       </w:r>
+      <w:r>
+        <w:rPr>
+          <w:b w:val="0"/>
+          <w:bCs w:val="0"/>
+          <w:highlight w:val="none"/>
+        </w:rPr>
+      </w:r>
     </w:p>
     <w:p>
       <w:pPr>
@@ -668,6 +739,13 @@
           <w:highlight w:val="none"/>
         </w:rPr>
         <w:t xml:space="preserve">– Abrangendo.</w:t>
+      </w:r>
+      <w:r>
+        <w:rPr>
+          <w:b w:val="0"/>
+          <w:bCs w:val="0"/>
+          <w:highlight w:val="none"/>
+        </w:rPr>
       </w:r>
       <w:r>
         <w:rPr>
@@ -730,6 +808,13 @@
           <w:highlight w:val="none"/>
         </w:rPr>
       </w:r>
+      <w:r>
+        <w:rPr>
+          <w:b w:val="0"/>
+          <w:bCs w:val="0"/>
+          <w:highlight w:val="none"/>
+        </w:rPr>
+      </w:r>
     </w:p>
     <w:p>
       <w:pPr>
@@ -755,8 +840,121 @@
       </w:r>
       <w:r>
         <w:rPr>
+          <w:b/>
+          <w:bCs/>
+        </w:rPr>
+        <w:t xml:space="preserve">Encompasses </w:t>
+      </w:r>
+      <w:r>
+        <w:rPr>
           <w:b w:val="0"/>
           <w:bCs w:val="0"/>
+        </w:rPr>
+        <w:t xml:space="preserve">– </w:t>
+      </w:r>
+      <w:r>
+        <w:rPr>
+          <w:b w:val="0"/>
+          <w:bCs w:val="0"/>
+          <w:highlight w:val="none"/>
+        </w:rPr>
+        <w:t xml:space="preserve">abrange</w:t>
+      </w:r>
+      <w:r>
+        <w:rPr>
+          <w:b w:val="0"/>
+          <w:bCs w:val="0"/>
+          <w:highlight w:val="none"/>
+        </w:rPr>
+      </w:r>
+    </w:p>
+    <w:p>
+      <w:pPr>
+        <w:pBdr/>
+        <w:tabs>
+          <w:tab w:val="left" w:leader="none" w:pos="1395"/>
+        </w:tabs>
+        <w:spacing/>
+        <w:ind/>
+        <w:jc w:val="both"/>
+        <w:rPr>
+          <w:b w:val="0"/>
+          <w:bCs w:val="0"/>
+          <w:highlight w:val="none"/>
+        </w:rPr>
+      </w:pPr>
+      <w:r>
+        <w:rPr>
+          <w:b/>
+          <w:bCs/>
+          <w:highlight w:val="none"/>
+        </w:rPr>
+        <w:t xml:space="preserve">Aimed </w:t>
+      </w:r>
+      <w:r>
+        <w:rPr>
+          <w:b w:val="0"/>
+          <w:bCs w:val="0"/>
+          <w:highlight w:val="none"/>
+        </w:rPr>
+        <w:t xml:space="preserve">– v</w:t>
+      </w:r>
+      <w:r>
+        <w:rPr>
+          <w:b w:val="0"/>
+          <w:bCs w:val="0"/>
+          <w:highlight w:val="none"/>
+        </w:rPr>
+        <w:t xml:space="preserve">oltado á</w:t>
+      </w:r>
+      <w:r>
+        <w:rPr>
+          <w:b w:val="0"/>
+          <w:bCs w:val="0"/>
+          <w:highlight w:val="none"/>
+        </w:rPr>
+      </w:r>
+    </w:p>
+    <w:p>
+      <w:pPr>
+        <w:pBdr/>
+        <w:tabs>
+          <w:tab w:val="left" w:leader="none" w:pos="1395"/>
+        </w:tabs>
+        <w:spacing/>
+        <w:ind/>
+        <w:jc w:val="both"/>
+        <w:rPr>
+          <w:b w:val="0"/>
+          <w:bCs w:val="0"/>
+          <w:highlight w:val="none"/>
+        </w:rPr>
+      </w:pPr>
+      <w:r>
+        <w:rPr>
+          <w:b w:val="0"/>
+          <w:bCs w:val="0"/>
+          <w:highlight w:val="none"/>
+        </w:rPr>
+      </w:r>
+      <w:r>
+        <w:rPr>
+          <w:b/>
+          <w:bCs/>
+        </w:rPr>
+        <w:t xml:space="preserve">Instead </w:t>
+      </w:r>
+      <w:r>
+        <w:rPr>
+          <w:b w:val="0"/>
+          <w:bCs w:val="0"/>
+        </w:rPr>
+        <w:t xml:space="preserve">– em vez de</w:t>
+      </w:r>
+      <w:r>
+        <w:rPr>
+          <w:b/>
+          <w:bCs/>
           <w:highlight w:val="none"/>
         </w:rPr>
       </w:r>

</xml_diff>

<commit_message>
Finaliza a leitura do cap 1
</commit_message>
<xml_diff>
--- a/documentation/Glossario.docx
+++ b/documentation/Glossario.docx
@@ -1005,15 +1005,6 @@
       <w:r>
         <w:rPr>
           <w:rFonts w:ascii="Arial" w:hAnsi="Arial" w:eastAsia="Arial" w:cs="Arial"/>
-          <w:color w:val="000000"/>
-          <w:sz w:val="24"/>
-          <w:u w:val="none"/>
-        </w:rPr>
-        <w:t xml:space="preserve"> </w:t>
-      </w:r>
-      <w:r>
-        <w:rPr>
-          <w:rFonts w:ascii="Arial" w:hAnsi="Arial" w:eastAsia="Arial" w:cs="Arial"/>
           <w:b/>
           <w:color w:val="000000"/>
           <w:sz w:val="24"/>
@@ -1034,7 +1025,6 @@
           <w:b w:val="0"/>
           <w:bCs w:val="0"/>
           <w:highlight w:val="none"/>
-          <w:lang w:val="undefined"/>
         </w:rPr>
         <w:t xml:space="preserve">é uma técnica de engenharia de prompt onde você fornece de dois a cinco exemplos práticos de entrada e saída para ensinar a inteligência artificial a seguir um padrão específico</w:t>
       </w:r>
@@ -1043,7 +1033,480 @@
           <w:b w:val="0"/>
           <w:bCs w:val="0"/>
           <w:highlight w:val="none"/>
+        </w:rPr>
+      </w:r>
+      <w:r>
+        <w:rPr>
+          <w:b w:val="0"/>
+          <w:bCs w:val="0"/>
+          <w:highlight w:val="none"/>
+        </w:rPr>
+      </w:r>
+    </w:p>
+    <w:p>
+      <w:pPr>
+        <w:pBdr/>
+        <w:tabs>
+          <w:tab w:val="left" w:leader="none" w:pos="1395"/>
+        </w:tabs>
+        <w:spacing/>
+        <w:ind/>
+        <w:jc w:val="both"/>
+        <w:rPr>
+          <w:b w:val="0"/>
+          <w:bCs w:val="0"/>
+          <w:highlight w:val="none"/>
+        </w:rPr>
+      </w:pPr>
+      <w:r>
+        <w:rPr>
+          <w:b/>
+          <w:bCs/>
+          <w:highlight w:val="none"/>
+        </w:rPr>
+        <w:t xml:space="preserve">BERT – </w:t>
+      </w:r>
+      <w:r>
+        <w:rPr>
+          <w:b w:val="0"/>
+          <w:bCs w:val="0"/>
+          <w:highlight w:val="none"/>
+        </w:rPr>
+        <w:t xml:space="preserve">Bidirecional enconder representation from transformers</w:t>
+      </w:r>
+      <w:r>
+        <w:rPr>
+          <w:b/>
+          <w:bCs/>
+          <w:highlight w:val="none"/>
+        </w:rPr>
+        <w:t xml:space="preserve"> ou </w:t>
+      </w:r>
+      <w:r>
+        <w:rPr>
+          <w:b w:val="0"/>
+          <w:bCs w:val="0"/>
+          <w:highlight w:val="none"/>
+        </w:rPr>
+        <w:t xml:space="preserve">Representação de codificador bidirecional a partir de transformers</w:t>
+      </w:r>
+      <w:r>
+        <w:rPr>
+          <w:b w:val="0"/>
+          <w:bCs w:val="0"/>
+          <w:highlight w:val="none"/>
+        </w:rPr>
+      </w:r>
+    </w:p>
+    <w:p>
+      <w:pPr>
+        <w:pBdr/>
+        <w:tabs>
+          <w:tab w:val="left" w:leader="none" w:pos="1395"/>
+        </w:tabs>
+        <w:spacing/>
+        <w:ind/>
+        <w:jc w:val="both"/>
+        <w:rPr>
+          <w:b w:val="0"/>
+          <w:bCs w:val="0"/>
+          <w:highlight w:val="none"/>
+        </w:rPr>
+      </w:pPr>
+      <w:r>
+        <w:rPr>
+          <w:b/>
+          <w:bCs/>
+          <w:highlight w:val="none"/>
+          <w:lang w:val="undefined"/>
+        </w:rPr>
+        <w:t xml:space="preserve">GPT</w:t>
+      </w:r>
+      <w:r>
+        <w:rPr>
+          <w:b/>
+          <w:bCs/>
+          <w:highlight w:val="none"/>
+        </w:rPr>
+        <w:t xml:space="preserve"> </w:t>
+      </w:r>
+      <w:r>
+        <w:rPr>
+          <w:b w:val="0"/>
+          <w:bCs w:val="0"/>
+          <w:highlight w:val="none"/>
+        </w:rPr>
+        <w:t xml:space="preserve">– </w:t>
+      </w:r>
+      <w:r>
+        <w:rPr>
+          <w:b w:val="0"/>
+          <w:bCs w:val="0"/>
+          <w:highlight w:val="none"/>
+        </w:rPr>
+        <w:t xml:space="preserve">Generative Pretrained Transformer ou Transformador Generativo Pretreinado.</w:t>
+      </w:r>
+      <w:r>
+        <w:rPr>
+          <w:b w:val="0"/>
+          <w:bCs w:val="0"/>
+          <w:highlight w:val="none"/>
+        </w:rPr>
+      </w:r>
+    </w:p>
+    <w:p>
+      <w:pPr>
+        <w:pBdr/>
+        <w:tabs>
+          <w:tab w:val="left" w:leader="none" w:pos="1395"/>
+        </w:tabs>
+        <w:spacing/>
+        <w:ind/>
+        <w:jc w:val="both"/>
+        <w:rPr>
+          <w:b w:val="0"/>
+          <w:bCs w:val="0"/>
+          <w:highlight w:val="none"/>
+        </w:rPr>
+      </w:pPr>
+      <w:r>
+        <w:rPr>
+          <w:b/>
+          <w:bCs/>
+          <w:highlight w:val="none"/>
+        </w:rPr>
+      </w:r>
+      <w:r>
+        <w:rPr>
+          <w:b/>
+          <w:bCs/>
+          <w:highlight w:val="none"/>
+          <w:lang w:val="undefined"/>
+        </w:rPr>
+        <w:t xml:space="preserve">Auto supervisionado</w:t>
+      </w:r>
+      <w:r>
+        <w:rPr>
+          <w:b/>
+          <w:bCs/>
+          <w:highlight w:val="none"/>
+        </w:rPr>
+        <w:t xml:space="preserve"> </w:t>
+      </w:r>
+      <w:r>
+        <w:rPr>
+          <w:b w:val="0"/>
+          <w:bCs w:val="0"/>
+          <w:highlight w:val="none"/>
+        </w:rPr>
+        <w:t xml:space="preserve">- </w:t>
+      </w:r>
+      <w:r>
+        <w:t xml:space="preserve">é uma técnica de inteligência artificial em que o modelo cria seus próprios rótulos a partir de dados brutos e não rotulados</w:t>
+      </w:r>
+      <w:r>
+        <w:rPr>
+          <w:b w:val="0"/>
+          <w:bCs w:val="0"/>
+          <w:highlight w:val="none"/>
+        </w:rPr>
+      </w:r>
+      <w:r>
+        <w:rPr>
+          <w:b w:val="0"/>
+          <w:bCs w:val="0"/>
+          <w:highlight w:val="none"/>
+        </w:rPr>
+      </w:r>
+      <w:r>
+        <w:rPr>
+          <w:b w:val="0"/>
+          <w:bCs w:val="0"/>
+          <w:highlight w:val="none"/>
+        </w:rPr>
+      </w:r>
+    </w:p>
+    <w:p>
+      <w:pPr>
+        <w:pBdr/>
+        <w:tabs>
+          <w:tab w:val="left" w:leader="none" w:pos="1395"/>
+        </w:tabs>
+        <w:spacing/>
+        <w:ind/>
+        <w:jc w:val="both"/>
+        <w:rPr>
+          <w:b w:val="0"/>
+          <w:bCs w:val="0"/>
+          <w:highlight w:val="none"/>
+        </w:rPr>
+      </w:pPr>
+      <w:r>
+        <w:rPr>
+          <w:b w:val="0"/>
+          <w:bCs w:val="0"/>
+          <w:highlight w:val="none"/>
+        </w:rPr>
+      </w:r>
+      <w:r>
+        <w:rPr>
+          <w:b/>
+          <w:bCs/>
+          <w:highlight w:val="none"/>
+          <w:lang w:val="undefined"/>
+        </w:rPr>
+        <w:t xml:space="preserve">Standards</w:t>
+      </w:r>
+      <w:r>
+        <w:rPr>
+          <w:b/>
+          <w:bCs/>
+          <w:highlight w:val="none"/>
+        </w:rPr>
+        <w:t xml:space="preserve"> </w:t>
+      </w:r>
+      <w:r>
+        <w:rPr>
+          <w:b w:val="0"/>
+          <w:bCs w:val="0"/>
+          <w:highlight w:val="none"/>
+        </w:rPr>
+        <w:t xml:space="preserve">- Padrões</w:t>
+      </w:r>
+      <w:r>
+        <w:rPr>
+          <w:b w:val="0"/>
+          <w:bCs w:val="0"/>
+          <w:highlight w:val="none"/>
+        </w:rPr>
+      </w:r>
+      <w:r>
+        <w:rPr>
+          <w:b w:val="0"/>
+          <w:bCs w:val="0"/>
+          <w:highlight w:val="none"/>
+        </w:rPr>
+      </w:r>
+    </w:p>
+    <w:p>
+      <w:pPr>
+        <w:pBdr/>
+        <w:tabs>
+          <w:tab w:val="left" w:leader="none" w:pos="1080"/>
+          <w:tab w:val="left" w:leader="none" w:pos="1395"/>
+        </w:tabs>
+        <w:spacing/>
+        <w:ind/>
+        <w:jc w:val="both"/>
+        <w:rPr>
+          <w:b w:val="0"/>
+          <w:bCs w:val="0"/>
+          <w:highlight w:val="none"/>
+        </w:rPr>
+      </w:pPr>
+      <w:r>
+        <w:rPr>
+          <w:b w:val="0"/>
+          <w:bCs w:val="0"/>
+          <w:highlight w:val="none"/>
+        </w:rPr>
+      </w:r>
+      <w:r>
+        <w:rPr>
+          <w:b/>
+          <w:bCs/>
+        </w:rPr>
+        <w:t xml:space="preserve">Underlying </w:t>
+      </w:r>
+      <w:r>
+        <w:rPr>
+          <w:b w:val="0"/>
+          <w:bCs w:val="0"/>
+          <w:highlight w:val="none"/>
+        </w:rPr>
+        <w:t xml:space="preserve">– Fundamentais</w:t>
+      </w:r>
+      <w:r>
+        <w:rPr>
+          <w:b w:val="0"/>
+          <w:bCs w:val="0"/>
+          <w:highlight w:val="none"/>
+        </w:rPr>
+      </w:r>
+    </w:p>
+    <w:p>
+      <w:pPr>
+        <w:pBdr/>
+        <w:tabs>
+          <w:tab w:val="left" w:leader="none" w:pos="1080"/>
+          <w:tab w:val="left" w:leader="none" w:pos="1395"/>
+        </w:tabs>
+        <w:spacing/>
+        <w:ind/>
+        <w:jc w:val="both"/>
+        <w:rPr>
+          <w:b w:val="0"/>
+          <w:bCs w:val="0"/>
+          <w:highlight w:val="none"/>
+        </w:rPr>
+      </w:pPr>
+      <w:r>
+        <w:rPr>
+          <w:b/>
+          <w:bCs/>
+          <w:highlight w:val="none"/>
+        </w:rPr>
+      </w:r>
+      <w:r>
+        <w:rPr>
+          <w:b/>
+          <w:bCs/>
+        </w:rPr>
+        <w:t xml:space="preserve">Emergent behavior </w:t>
+      </w:r>
+      <w:r>
+        <w:rPr>
+          <w:b w:val="0"/>
+          <w:bCs w:val="0"/>
+        </w:rPr>
+        <w:t xml:space="preserve">– Ou comportamento emergente, é a característica de um modelo desenvolver uma capacidade qual não foi treinado para tal, por exemplo quando o modelo GPT inesperadamente desenvolveu a capacidade de traduzirum texto sem ter sido treinado para tal.</w:t>
+      </w:r>
+      <w:r>
+        <w:rPr>
+          <w:b w:val="0"/>
+          <w:bCs w:val="0"/>
+          <w:highlight w:val="none"/>
+        </w:rPr>
+      </w:r>
+    </w:p>
+    <w:p>
+      <w:pPr>
+        <w:pBdr/>
+        <w:tabs>
+          <w:tab w:val="left" w:leader="none" w:pos="1080"/>
+          <w:tab w:val="left" w:leader="none" w:pos="1395"/>
+        </w:tabs>
+        <w:spacing/>
+        <w:ind/>
+        <w:jc w:val="both"/>
+        <w:rPr>
+          <w:b w:val="0"/>
+          <w:bCs w:val="0"/>
+          <w:highlight w:val="none"/>
+        </w:rPr>
+      </w:pPr>
+      <w:r>
+        <w:rPr>
+          <w:b/>
+          <w:bCs/>
+          <w:highlight w:val="none"/>
+        </w:rPr>
+        <w:t xml:space="preserve">NLP systems ou sistemas PLN </w:t>
+      </w:r>
+      <w:r>
+        <w:rPr>
+          <w:b w:val="0"/>
+          <w:bCs w:val="0"/>
+          <w:highlight w:val="none"/>
+        </w:rPr>
+        <w:t xml:space="preserve">– </w:t>
+      </w:r>
+      <w:r>
+        <w:rPr>
+          <w:b w:val="0"/>
+          <w:bCs w:val="0"/>
+          <w:lang w:val="undefined"/>
+        </w:rPr>
+        <w:t xml:space="preserve">Sistemas </w:t>
+      </w:r>
+      <w:r>
+        <w:rPr>
+          <w:b w:val="0"/>
+          <w:bCs w:val="0"/>
+          <w:lang w:val="undefined"/>
+        </w:rPr>
+        <w:t xml:space="preserve">NLP</w:t>
+      </w:r>
+      <w:r>
+        <w:rPr>
+          <w:b w:val="0"/>
+          <w:bCs w:val="0"/>
+          <w:lang w:val="undefined"/>
+        </w:rPr>
+        <w:t xml:space="preserve"> (</w:t>
+      </w:r>
+      <w:r>
+        <w:rPr>
+          <w:b w:val="0"/>
+          <w:bCs w:val="0"/>
+          <w:lang w:val="undefined"/>
+        </w:rPr>
+        <w:t xml:space="preserve">Natural Language Processing</w:t>
+      </w:r>
+      <w:r>
+        <w:rPr>
+          <w:b w:val="0"/>
+          <w:bCs w:val="0"/>
+          <w:lang w:val="undefined"/>
+        </w:rPr>
+        <w:t xml:space="preserve">, ou </w:t>
+      </w:r>
+      <w:r>
+        <w:rPr>
+          <w:b w:val="0"/>
+          <w:bCs w:val="0"/>
+          <w:lang w:val="undefined"/>
+        </w:rPr>
+        <w:t xml:space="preserve">Processamento de Linguagem Natural</w:t>
+      </w:r>
+      <w:r>
+        <w:rPr>
+          <w:b w:val="0"/>
+          <w:bCs w:val="0"/>
+          <w:lang w:val="undefined"/>
+        </w:rPr>
+        <w:t xml:space="preserve">) são </w:t>
+      </w:r>
+      <w:r>
+        <w:rPr>
+          <w:b w:val="0"/>
+          <w:bCs w:val="0"/>
+          <w:lang w:val="undefined"/>
+        </w:rPr>
+        <w:t xml:space="preserve">ferramentas de inteligência artificial que ajudam os computadores a ler, ouvir, entender e criar a linguagem dos seres humanos</w:t>
+      </w:r>
+      <w:r>
+        <w:rPr>
+          <w:b w:val="0"/>
+          <w:bCs w:val="0"/>
           <w:lang w:val="undefined" w:bidi="undefined"/>
+        </w:rPr>
+      </w:r>
+      <w:r>
+        <w:rPr>
+          <w:b w:val="0"/>
+          <w:bCs w:val="0"/>
+          <w:highlight w:val="none"/>
+        </w:rPr>
+      </w:r>
+    </w:p>
+    <w:p>
+      <w:pPr>
+        <w:pBdr/>
+        <w:tabs>
+          <w:tab w:val="left" w:leader="none" w:pos="1080"/>
+          <w:tab w:val="left" w:leader="none" w:pos="1395"/>
+        </w:tabs>
+        <w:spacing/>
+        <w:ind/>
+        <w:jc w:val="both"/>
+        <w:rPr/>
+      </w:pPr>
+      <w:r>
+        <w:rPr>
+          <w:b w:val="0"/>
+          <w:bCs w:val="0"/>
+          <w:highlight w:val="none"/>
         </w:rPr>
       </w:r>
       <w:r>

</xml_diff>